<commit_message>
Update warehouse data files 1
</commit_message>
<xml_diff>
--- a/Assigment 1.docx
+++ b/Assigment 1.docx
@@ -435,8 +435,8 @@
           <w:rFonts w:ascii="Times New Roman" w:hAnsi="Times New Roman" w:cs="Times New Roman"/>
           <w:b/>
           <w:noProof/>
-          <w:sz w:val="30"/>
-          <w:szCs w:val="30"/>
+          <w:sz w:val="40"/>
+          <w:szCs w:val="40"/>
           <w:lang w:val="en-GB"/>
         </w:rPr>
       </w:pPr>
@@ -445,11 +445,64 @@
           <w:rFonts w:ascii="Times New Roman" w:hAnsi="Times New Roman" w:cs="Times New Roman"/>
           <w:b/>
           <w:noProof/>
-          <w:sz w:val="30"/>
-          <w:szCs w:val="30"/>
+          <w:sz w:val="40"/>
+          <w:szCs w:val="40"/>
           <w:lang w:val="en-GB"/>
         </w:rPr>
         <w:lastRenderedPageBreak/>
+        <w:t>Project available on</w:t>
+      </w:r>
+    </w:p>
+    <w:p>
+      <w:pPr>
+        <w:spacing w:line="360" w:lineRule="auto"/>
+        <w:jc w:val="both"/>
+        <w:rPr>
+          <w:rFonts w:ascii="Times New Roman" w:hAnsi="Times New Roman" w:cs="Times New Roman"/>
+          <w:b/>
+          <w:noProof/>
+          <w:sz w:val="30"/>
+          <w:szCs w:val="30"/>
+          <w:lang w:val="en-GB"/>
+        </w:rPr>
+      </w:pPr>
+      <w:hyperlink r:id="rId9" w:history="1">
+        <w:r>
+          <w:rPr>
+            <w:rStyle w:val="Hyperlink"/>
+            <w:rFonts w:ascii="Times New Roman" w:hAnsi="Times New Roman" w:cs="Times New Roman"/>
+            <w:b/>
+            <w:noProof/>
+            <w:sz w:val="30"/>
+            <w:szCs w:val="30"/>
+            <w:lang w:val="en-GB"/>
+          </w:rPr>
+          <w:t>https://github.com/chisoro/dataWareHouse</w:t>
+        </w:r>
+      </w:hyperlink>
+    </w:p>
+    <w:p>
+      <w:pPr>
+        <w:spacing w:line="360" w:lineRule="auto"/>
+        <w:jc w:val="both"/>
+        <w:rPr>
+          <w:rFonts w:ascii="Times New Roman" w:hAnsi="Times New Roman" w:cs="Times New Roman"/>
+          <w:b/>
+          <w:noProof/>
+          <w:sz w:val="30"/>
+          <w:szCs w:val="30"/>
+          <w:lang w:val="en-GB"/>
+        </w:rPr>
+      </w:pPr>
+      <w:r>
+        <w:rPr>
+          <w:rFonts w:ascii="Times New Roman" w:hAnsi="Times New Roman" w:cs="Times New Roman"/>
+          <w:b/>
+          <w:noProof/>
+          <w:sz w:val="30"/>
+          <w:szCs w:val="30"/>
+          <w:lang w:val="en-GB"/>
+        </w:rPr>
         <w:t>REQUIREMENTS ANALYSIS</w:t>
       </w:r>
     </w:p>
@@ -1198,6 +1251,7 @@
           <w:szCs w:val="28"/>
           <w:lang w:val="en-GB"/>
         </w:rPr>
+        <w:lastRenderedPageBreak/>
         <w:t xml:space="preserve">This is the design of how the data will flow and be consumed. In this project, we will design a Data Warehouse for reporting </w:t>
       </w:r>
       <w:r>
@@ -1216,17 +1270,7 @@
           <w:szCs w:val="28"/>
           <w:lang w:val="en-GB"/>
         </w:rPr>
-        <w:t xml:space="preserve">. The Medallion Architecture is made up of three layers, namely: Bronze, Silver, and </w:t>
-      </w:r>
-      <w:r>
-        <w:rPr>
-          <w:rFonts w:ascii="Times New Roman" w:hAnsi="Times New Roman" w:cs="Times New Roman"/>
-          <w:sz w:val="28"/>
-          <w:szCs w:val="28"/>
-          <w:lang w:val="en-GB"/>
-        </w:rPr>
-        <w:lastRenderedPageBreak/>
-        <w:t>Gold, and at each layer, there is a separation of concerns. At the Bronze, we keep the original data as it is from the sources. We transform and clean data at Silver Layer. We build different types of objects for business intelligence and machine learning at the Gold Layer.</w:t>
+        <w:t>. The Medallion Architecture is made up of three layers, namely: Bronze, Silver, and Gold, and at each layer, there is a separation of concerns. At the Bronze, we keep the original data as it is from the sources. We transform and clean data at Silver Layer. We build different types of objects for business intelligence and machine learning at the Gold Layer.</w:t>
       </w:r>
     </w:p>
     <w:p>
@@ -2161,6 +2205,7 @@
                 <w:szCs w:val="28"/>
                 <w:lang w:val="en-GB"/>
               </w:rPr>
+              <w:lastRenderedPageBreak/>
               <w:t>Consumers</w:t>
             </w:r>
           </w:p>
@@ -2294,7 +2339,11 @@
           <w:lang w:val="en-GB"/>
         </w:rPr>
       </w:pPr>
-      <w:r>
+    </w:p>
+    <w:p>
+      <w:pPr>
+        <w:spacing w:line="360" w:lineRule="auto"/>
+        <w:jc w:val="both"/>
         <w:rPr>
           <w:rFonts w:ascii="Times New Roman" w:hAnsi="Times New Roman" w:cs="Times New Roman"/>
           <w:b/>
@@ -2302,7 +2351,15 @@
           <w:szCs w:val="30"/>
           <w:lang w:val="en-GB"/>
         </w:rPr>
-        <w:lastRenderedPageBreak/>
+      </w:pPr>
+      <w:r>
+        <w:rPr>
+          <w:rFonts w:ascii="Times New Roman" w:hAnsi="Times New Roman" w:cs="Times New Roman"/>
+          <w:b/>
+          <w:sz w:val="30"/>
+          <w:szCs w:val="30"/>
+          <w:lang w:val="en-GB"/>
+        </w:rPr>
         <w:t>Medallion Architecture</w:t>
       </w:r>
     </w:p>
@@ -2343,7 +2400,7 @@
                     <pic:cNvPicPr/>
                   </pic:nvPicPr>
                   <pic:blipFill>
-                    <a:blip r:embed="rId9" cstate="print">
+                    <a:blip r:embed="rId10" cstate="print">
                       <a:extLst>
                         <a:ext uri="{28A0092B-C50C-407E-A947-70E740481C1C}">
                           <a14:useLocalDpi xmlns:a14="http://schemas.microsoft.com/office/drawing/2010/main" val="0"/>
@@ -2599,6 +2656,7 @@
           <w:szCs w:val="30"/>
           <w:lang w:val="en-GB"/>
         </w:rPr>
+        <w:lastRenderedPageBreak/>
         <w:t>Rule: Avoid using reserved words</w:t>
       </w:r>
     </w:p>
@@ -2681,7 +2739,6 @@
           <w:szCs w:val="30"/>
           <w:lang w:val="en-GB"/>
         </w:rPr>
-        <w:lastRenderedPageBreak/>
         <w:t xml:space="preserve">All table names must start with </w:t>
       </w:r>
       <w:r>
@@ -3185,6 +3242,7 @@
           <w:szCs w:val="30"/>
           <w:lang w:val="en-GB"/>
         </w:rPr>
+        <w:lastRenderedPageBreak/>
         <w:t xml:space="preserve">&lt;entity&gt;: </w:t>
       </w:r>
       <w:r>
@@ -3300,7 +3358,6 @@
           <w:szCs w:val="30"/>
           <w:lang w:val="en-GB"/>
         </w:rPr>
-        <w:lastRenderedPageBreak/>
         <w:t>Surrogate Keys</w:t>
       </w:r>
     </w:p>
@@ -3458,7 +3515,18 @@
           <w:szCs w:val="30"/>
           <w:lang w:val="en-GB"/>
         </w:rPr>
-        <w:t>Example: customerKey indicating the primary key from dimension table dimCustomers table</w:t>
+        <w:t xml:space="preserve">Example: customerKey indicating the primary key from </w:t>
+      </w:r>
+      <w:bookmarkStart w:id="0" w:name="_GoBack"/>
+      <w:bookmarkEnd w:id="0"/>
+      <w:r>
+        <w:rPr>
+          <w:rFonts w:ascii="Times New Roman" w:hAnsi="Times New Roman" w:cs="Times New Roman"/>
+          <w:sz w:val="30"/>
+          <w:szCs w:val="30"/>
+          <w:lang w:val="en-GB"/>
+        </w:rPr>
+        <w:t>dimension table dimCustomers table</w:t>
       </w:r>
       <w:r>
         <w:rPr>
@@ -3514,18 +3582,7 @@
           <w:szCs w:val="30"/>
           <w:lang w:val="en-GB"/>
         </w:rPr>
-        <w:t>All technical colum</w:t>
-      </w:r>
-      <w:bookmarkStart w:id="0" w:name="_GoBack"/>
-      <w:bookmarkEnd w:id="0"/>
-      <w:r>
-        <w:rPr>
-          <w:rFonts w:ascii="Times New Roman" w:hAnsi="Times New Roman" w:cs="Times New Roman"/>
-          <w:sz w:val="30"/>
-          <w:szCs w:val="30"/>
-          <w:lang w:val="en-GB"/>
-        </w:rPr>
-        <w:t>ns must be prefix by “dwh” followed by a descriptive name indicating the column’s purpose.</w:t>
+        <w:t>All technical columns must be prefix by “dwh” followed by a descriptive name indicating the column’s purpose.</w:t>
       </w:r>
     </w:p>
     <w:p>
@@ -9187,7 +9244,6 @@
     <w:name w:val="Hyperlink"/>
     <w:basedOn w:val="DefaultParagraphFont"/>
     <w:uiPriority w:val="99"/>
-    <w:semiHidden/>
     <w:unhideWhenUsed/>
     <w:rsid w:val="00CF14D1"/>
     <w:rPr>
@@ -9591,7 +9647,7 @@
 </file>
 
 <file path=customXml/itemProps1.xml><?xml version="1.0" encoding="utf-8"?>
-<ds:datastoreItem xmlns:ds="http://schemas.openxmlformats.org/officeDocument/2006/customXml" ds:itemID="{C9944F03-3F93-4E0F-BDCC-61F1E0B61FA1}">
+<ds:datastoreItem xmlns:ds="http://schemas.openxmlformats.org/officeDocument/2006/customXml" ds:itemID="{2C6A7D22-AAB2-4458-BFA0-BC7FC475A954}">
   <ds:schemaRefs>
     <ds:schemaRef ds:uri="http://schemas.openxmlformats.org/officeDocument/2006/bibliography"/>
   </ds:schemaRefs>

</xml_diff>

<commit_message>
Update warehouse data files 3
</commit_message>
<xml_diff>
--- a/Assigment 1.docx
+++ b/Assigment 1.docx
@@ -3515,18 +3515,7 @@
           <w:szCs w:val="30"/>
           <w:lang w:val="en-GB"/>
         </w:rPr>
-        <w:t xml:space="preserve">Example: customerKey indicating the primary key from </w:t>
-      </w:r>
-      <w:bookmarkStart w:id="0" w:name="_GoBack"/>
-      <w:bookmarkEnd w:id="0"/>
-      <w:r>
-        <w:rPr>
-          <w:rFonts w:ascii="Times New Roman" w:hAnsi="Times New Roman" w:cs="Times New Roman"/>
-          <w:sz w:val="30"/>
-          <w:szCs w:val="30"/>
-          <w:lang w:val="en-GB"/>
-        </w:rPr>
-        <w:t>dimension table dimCustomers table</w:t>
+        <w:t>Example: customerKey indicating the primary key from dimension table dimCustomers table</w:t>
       </w:r>
       <w:r>
         <w:rPr>
@@ -3769,15 +3758,4122 @@
     <w:p>
       <w:pPr>
         <w:spacing w:line="360" w:lineRule="auto"/>
-        <w:ind w:left="1080"/>
         <w:jc w:val="both"/>
         <w:rPr>
           <w:rFonts w:ascii="Times New Roman" w:hAnsi="Times New Roman" w:cs="Times New Roman"/>
-          <w:sz w:val="30"/>
-          <w:szCs w:val="30"/>
-          <w:lang w:val="en-GB"/>
-        </w:rPr>
-      </w:pPr>
+          <w:b/>
+          <w:sz w:val="30"/>
+          <w:szCs w:val="30"/>
+          <w:lang w:val="en-GB"/>
+        </w:rPr>
+      </w:pPr>
+      <w:r>
+        <w:rPr>
+          <w:rFonts w:ascii="Times New Roman" w:hAnsi="Times New Roman" w:cs="Times New Roman"/>
+          <w:b/>
+          <w:sz w:val="30"/>
+          <w:szCs w:val="30"/>
+          <w:lang w:val="en-GB"/>
+        </w:rPr>
+        <w:t>Task 1. Bronze Layer</w:t>
+      </w:r>
+    </w:p>
+    <w:p>
+      <w:pPr>
+        <w:spacing w:line="360" w:lineRule="auto"/>
+        <w:jc w:val="both"/>
+        <w:rPr>
+          <w:rFonts w:ascii="Times New Roman" w:hAnsi="Times New Roman" w:cs="Times New Roman"/>
+          <w:b/>
+          <w:sz w:val="30"/>
+          <w:szCs w:val="30"/>
+          <w:lang w:val="en-GB"/>
+        </w:rPr>
+      </w:pPr>
+      <w:r>
+        <w:rPr>
+          <w:rFonts w:ascii="Times New Roman" w:hAnsi="Times New Roman" w:cs="Times New Roman"/>
+          <w:b/>
+          <w:sz w:val="30"/>
+          <w:szCs w:val="30"/>
+          <w:lang w:val="en-GB"/>
+        </w:rPr>
+        <w:t>Data Flow Diagrams</w:t>
+      </w:r>
+    </w:p>
+    <w:p>
+      <w:pPr>
+        <w:spacing w:line="360" w:lineRule="auto"/>
+        <w:jc w:val="both"/>
+        <w:rPr>
+          <w:rFonts w:ascii="Times New Roman" w:hAnsi="Times New Roman" w:cs="Times New Roman"/>
+          <w:b/>
+          <w:sz w:val="30"/>
+          <w:szCs w:val="30"/>
+          <w:lang w:val="en-GB"/>
+        </w:rPr>
+      </w:pPr>
+      <w:r>
+        <w:rPr>
+          <w:rFonts w:ascii="Times New Roman" w:hAnsi="Times New Roman" w:cs="Times New Roman"/>
+          <w:b/>
+          <w:sz w:val="30"/>
+          <w:szCs w:val="30"/>
+          <w:lang w:val="en-GB"/>
+        </w:rPr>
+        <w:lastRenderedPageBreak/>
+        <w:t>Bronze Layer</w:t>
+      </w:r>
+    </w:p>
+    <w:p>
+      <w:pPr>
+        <w:spacing w:line="360" w:lineRule="auto"/>
+        <w:jc w:val="both"/>
+        <w:rPr>
+          <w:rFonts w:ascii="Times New Roman" w:hAnsi="Times New Roman" w:cs="Times New Roman"/>
+          <w:b/>
+          <w:sz w:val="30"/>
+          <w:szCs w:val="30"/>
+          <w:lang w:val="en-GB"/>
+        </w:rPr>
+      </w:pPr>
+      <w:r>
+        <w:rPr>
+          <w:rFonts w:ascii="Times New Roman" w:hAnsi="Times New Roman" w:cs="Times New Roman"/>
+          <w:b/>
+          <w:noProof/>
+          <w:sz w:val="30"/>
+          <w:szCs w:val="30"/>
+          <w:lang w:eastAsia="en-ZW"/>
+        </w:rPr>
+        <w:drawing>
+          <wp:inline distT="0" distB="0" distL="0" distR="0">
+            <wp:extent cx="4867275" cy="5724525"/>
+            <wp:effectExtent l="0" t="0" r="9525" b="9525"/>
+            <wp:docPr id="2" name="Picture 2"/>
+            <wp:cNvGraphicFramePr>
+              <a:graphicFrameLocks xmlns:a="http://schemas.openxmlformats.org/drawingml/2006/main" noChangeAspect="1"/>
+            </wp:cNvGraphicFramePr>
+            <a:graphic xmlns:a="http://schemas.openxmlformats.org/drawingml/2006/main">
+              <a:graphicData uri="http://schemas.openxmlformats.org/drawingml/2006/picture">
+                <pic:pic xmlns:pic="http://schemas.openxmlformats.org/drawingml/2006/picture">
+                  <pic:nvPicPr>
+                    <pic:cNvPr id="2" name="bronzeDataFlowDiagram.drawio.png"/>
+                    <pic:cNvPicPr/>
+                  </pic:nvPicPr>
+                  <pic:blipFill>
+                    <a:blip r:embed="rId11">
+                      <a:extLst>
+                        <a:ext uri="{28A0092B-C50C-407E-A947-70E740481C1C}">
+                          <a14:useLocalDpi xmlns:a14="http://schemas.microsoft.com/office/drawing/2010/main" val="0"/>
+                        </a:ext>
+                      </a:extLst>
+                    </a:blip>
+                    <a:stretch>
+                      <a:fillRect/>
+                    </a:stretch>
+                  </pic:blipFill>
+                  <pic:spPr>
+                    <a:xfrm>
+                      <a:off x="0" y="0"/>
+                      <a:ext cx="4867275" cy="5724525"/>
+                    </a:xfrm>
+                    <a:prstGeom prst="rect">
+                      <a:avLst/>
+                    </a:prstGeom>
+                  </pic:spPr>
+                </pic:pic>
+              </a:graphicData>
+            </a:graphic>
+          </wp:inline>
+        </w:drawing>
+      </w:r>
+    </w:p>
+    <w:p>
+      <w:pPr>
+        <w:spacing w:line="360" w:lineRule="auto"/>
+        <w:jc w:val="both"/>
+        <w:rPr>
+          <w:rFonts w:ascii="Times New Roman" w:hAnsi="Times New Roman" w:cs="Times New Roman"/>
+          <w:b/>
+          <w:sz w:val="30"/>
+          <w:szCs w:val="30"/>
+          <w:lang w:val="en-GB"/>
+        </w:rPr>
+      </w:pPr>
+      <w:r>
+        <w:rPr>
+          <w:rFonts w:ascii="Times New Roman" w:hAnsi="Times New Roman" w:cs="Times New Roman"/>
+          <w:b/>
+          <w:sz w:val="30"/>
+          <w:szCs w:val="30"/>
+          <w:lang w:val="en-GB"/>
+        </w:rPr>
+        <w:t>Data Analysis and Checks</w:t>
+      </w:r>
+    </w:p>
+    <w:p>
+      <w:pPr>
+        <w:pStyle w:val="ListParagraph"/>
+        <w:numPr>
+          <w:ilvl w:val="0"/>
+          <w:numId w:val="40"/>
+        </w:numPr>
+        <w:spacing w:line="360" w:lineRule="auto"/>
+        <w:jc w:val="both"/>
+        <w:rPr>
+          <w:rFonts w:ascii="Times New Roman" w:hAnsi="Times New Roman" w:cs="Times New Roman"/>
+          <w:sz w:val="30"/>
+          <w:szCs w:val="30"/>
+          <w:lang w:val="en-GB"/>
+        </w:rPr>
+      </w:pPr>
+      <w:r>
+        <w:rPr>
+          <w:rFonts w:ascii="Times New Roman" w:hAnsi="Times New Roman" w:cs="Times New Roman"/>
+          <w:sz w:val="30"/>
+          <w:szCs w:val="30"/>
+          <w:lang w:val="en-GB"/>
+        </w:rPr>
+        <w:t xml:space="preserve">Scripts found under the tests folder </w:t>
+      </w:r>
+      <w:r>
+        <w:rPr>
+          <w:rFonts w:ascii="Times New Roman" w:hAnsi="Times New Roman" w:cs="Times New Roman"/>
+          <w:sz w:val="30"/>
+          <w:szCs w:val="30"/>
+          <w:lang w:val="en-GB"/>
+        </w:rPr>
+        <w:t>“checksBronze.sql”</w:t>
+      </w:r>
+    </w:p>
+    <w:p>
+      <w:pPr>
+        <w:autoSpaceDE w:val="0"/>
+        <w:autoSpaceDN w:val="0"/>
+        <w:adjustRightInd w:val="0"/>
+        <w:spacing w:after="0" w:line="240" w:lineRule="auto"/>
+        <w:rPr>
+          <w:rFonts w:ascii="Cascadia Mono" w:hAnsi="Cascadia Mono" w:cs="Cascadia Mono"/>
+          <w:color w:val="000000"/>
+          <w:kern w:val="0"/>
+          <w:sz w:val="19"/>
+          <w:szCs w:val="19"/>
+          <w:highlight w:val="white"/>
+        </w:rPr>
+      </w:pPr>
+      <w:r>
+        <w:rPr>
+          <w:rFonts w:ascii="Cascadia Mono" w:hAnsi="Cascadia Mono" w:cs="Cascadia Mono"/>
+          <w:color w:val="000000"/>
+          <w:kern w:val="0"/>
+          <w:sz w:val="19"/>
+          <w:szCs w:val="19"/>
+          <w:highlight w:val="white"/>
+        </w:rPr>
+        <w:t>====================================================================</w:t>
+      </w:r>
+    </w:p>
+    <w:p>
+      <w:pPr>
+        <w:autoSpaceDE w:val="0"/>
+        <w:autoSpaceDN w:val="0"/>
+        <w:adjustRightInd w:val="0"/>
+        <w:spacing w:after="0" w:line="240" w:lineRule="auto"/>
+        <w:rPr>
+          <w:rFonts w:ascii="Cascadia Mono" w:hAnsi="Cascadia Mono" w:cs="Cascadia Mono"/>
+          <w:color w:val="000000"/>
+          <w:kern w:val="0"/>
+          <w:sz w:val="19"/>
+          <w:szCs w:val="19"/>
+          <w:highlight w:val="white"/>
+        </w:rPr>
+      </w:pPr>
+      <w:r>
+        <w:rPr>
+          <w:rFonts w:ascii="Cascadia Mono" w:hAnsi="Cascadia Mono" w:cs="Cascadia Mono"/>
+          <w:color w:val="000000"/>
+          <w:kern w:val="0"/>
+          <w:sz w:val="19"/>
+          <w:szCs w:val="19"/>
+          <w:highlight w:val="white"/>
+        </w:rPr>
+        <w:t>Checking bronze.crmCustInfo</w:t>
+      </w:r>
+    </w:p>
+    <w:p>
+      <w:pPr>
+        <w:autoSpaceDE w:val="0"/>
+        <w:autoSpaceDN w:val="0"/>
+        <w:adjustRightInd w:val="0"/>
+        <w:spacing w:after="0" w:line="240" w:lineRule="auto"/>
+        <w:rPr>
+          <w:rFonts w:ascii="Cascadia Mono" w:hAnsi="Cascadia Mono" w:cs="Cascadia Mono"/>
+          <w:color w:val="000000"/>
+          <w:kern w:val="0"/>
+          <w:sz w:val="19"/>
+          <w:szCs w:val="19"/>
+          <w:highlight w:val="white"/>
+        </w:rPr>
+      </w:pPr>
+      <w:r>
+        <w:rPr>
+          <w:rFonts w:ascii="Cascadia Mono" w:hAnsi="Cascadia Mono" w:cs="Cascadia Mono"/>
+          <w:color w:val="000000"/>
+          <w:kern w:val="0"/>
+          <w:sz w:val="19"/>
+          <w:szCs w:val="19"/>
+          <w:highlight w:val="white"/>
+        </w:rPr>
+        <w:t>====================================================================</w:t>
+      </w:r>
+    </w:p>
+    <w:p>
+      <w:pPr>
+        <w:autoSpaceDE w:val="0"/>
+        <w:autoSpaceDN w:val="0"/>
+        <w:adjustRightInd w:val="0"/>
+        <w:spacing w:after="0" w:line="240" w:lineRule="auto"/>
+        <w:rPr>
+          <w:rFonts w:ascii="Cascadia Mono" w:hAnsi="Cascadia Mono" w:cs="Cascadia Mono"/>
+          <w:color w:val="000000"/>
+          <w:kern w:val="0"/>
+          <w:sz w:val="19"/>
+          <w:szCs w:val="19"/>
+          <w:highlight w:val="white"/>
+        </w:rPr>
+      </w:pPr>
+      <w:r>
+        <w:rPr>
+          <w:rFonts w:ascii="Cascadia Mono" w:hAnsi="Cascadia Mono" w:cs="Cascadia Mono"/>
+          <w:color w:val="000000"/>
+          <w:kern w:val="0"/>
+          <w:sz w:val="19"/>
+          <w:szCs w:val="19"/>
+          <w:highlight w:val="white"/>
+        </w:rPr>
+        <w:t>Check for NULLs or Duplicates in Primary Key</w:t>
+      </w:r>
+    </w:p>
+    <w:p>
+      <w:pPr>
+        <w:autoSpaceDE w:val="0"/>
+        <w:autoSpaceDN w:val="0"/>
+        <w:adjustRightInd w:val="0"/>
+        <w:spacing w:after="0" w:line="240" w:lineRule="auto"/>
+        <w:rPr>
+          <w:rFonts w:ascii="Cascadia Mono" w:hAnsi="Cascadia Mono" w:cs="Cascadia Mono"/>
+          <w:color w:val="000000"/>
+          <w:kern w:val="0"/>
+          <w:sz w:val="19"/>
+          <w:szCs w:val="19"/>
+          <w:highlight w:val="white"/>
+        </w:rPr>
+      </w:pPr>
+    </w:p>
+    <w:p>
+      <w:pPr>
+        <w:autoSpaceDE w:val="0"/>
+        <w:autoSpaceDN w:val="0"/>
+        <w:adjustRightInd w:val="0"/>
+        <w:spacing w:after="0" w:line="240" w:lineRule="auto"/>
+        <w:rPr>
+          <w:rFonts w:ascii="Cascadia Mono" w:hAnsi="Cascadia Mono" w:cs="Cascadia Mono"/>
+          <w:color w:val="000000"/>
+          <w:kern w:val="0"/>
+          <w:sz w:val="19"/>
+          <w:szCs w:val="19"/>
+          <w:highlight w:val="white"/>
+        </w:rPr>
+      </w:pPr>
+      <w:r>
+        <w:rPr>
+          <w:rFonts w:ascii="Cascadia Mono" w:hAnsi="Cascadia Mono" w:cs="Cascadia Mono"/>
+          <w:color w:val="000000"/>
+          <w:kern w:val="0"/>
+          <w:sz w:val="19"/>
+          <w:szCs w:val="19"/>
+          <w:highlight w:val="white"/>
+        </w:rPr>
+        <w:t>(6 rows affected)</w:t>
+      </w:r>
+    </w:p>
+    <w:p>
+      <w:pPr>
+        <w:autoSpaceDE w:val="0"/>
+        <w:autoSpaceDN w:val="0"/>
+        <w:adjustRightInd w:val="0"/>
+        <w:spacing w:after="0" w:line="240" w:lineRule="auto"/>
+        <w:rPr>
+          <w:rFonts w:ascii="Cascadia Mono" w:hAnsi="Cascadia Mono" w:cs="Cascadia Mono"/>
+          <w:color w:val="000000"/>
+          <w:kern w:val="0"/>
+          <w:sz w:val="19"/>
+          <w:szCs w:val="19"/>
+          <w:highlight w:val="white"/>
+        </w:rPr>
+      </w:pPr>
+      <w:r>
+        <w:rPr>
+          <w:rFonts w:ascii="Cascadia Mono" w:hAnsi="Cascadia Mono" w:cs="Cascadia Mono"/>
+          <w:color w:val="000000"/>
+          <w:kern w:val="0"/>
+          <w:sz w:val="19"/>
+          <w:szCs w:val="19"/>
+          <w:highlight w:val="white"/>
+        </w:rPr>
+        <w:t>Check for Unwanted Spaces</w:t>
+      </w:r>
+    </w:p>
+    <w:p>
+      <w:pPr>
+        <w:autoSpaceDE w:val="0"/>
+        <w:autoSpaceDN w:val="0"/>
+        <w:adjustRightInd w:val="0"/>
+        <w:spacing w:after="0" w:line="240" w:lineRule="auto"/>
+        <w:rPr>
+          <w:rFonts w:ascii="Cascadia Mono" w:hAnsi="Cascadia Mono" w:cs="Cascadia Mono"/>
+          <w:color w:val="000000"/>
+          <w:kern w:val="0"/>
+          <w:sz w:val="19"/>
+          <w:szCs w:val="19"/>
+          <w:highlight w:val="white"/>
+        </w:rPr>
+      </w:pPr>
+    </w:p>
+    <w:p>
+      <w:pPr>
+        <w:autoSpaceDE w:val="0"/>
+        <w:autoSpaceDN w:val="0"/>
+        <w:adjustRightInd w:val="0"/>
+        <w:spacing w:after="0" w:line="240" w:lineRule="auto"/>
+        <w:rPr>
+          <w:rFonts w:ascii="Cascadia Mono" w:hAnsi="Cascadia Mono" w:cs="Cascadia Mono"/>
+          <w:color w:val="000000"/>
+          <w:kern w:val="0"/>
+          <w:sz w:val="19"/>
+          <w:szCs w:val="19"/>
+          <w:highlight w:val="white"/>
+        </w:rPr>
+      </w:pPr>
+      <w:r>
+        <w:rPr>
+          <w:rFonts w:ascii="Cascadia Mono" w:hAnsi="Cascadia Mono" w:cs="Cascadia Mono"/>
+          <w:color w:val="000000"/>
+          <w:kern w:val="0"/>
+          <w:sz w:val="19"/>
+          <w:szCs w:val="19"/>
+          <w:highlight w:val="white"/>
+        </w:rPr>
+        <w:t>(0 rows affected)</w:t>
+      </w:r>
+    </w:p>
+    <w:p>
+      <w:pPr>
+        <w:autoSpaceDE w:val="0"/>
+        <w:autoSpaceDN w:val="0"/>
+        <w:adjustRightInd w:val="0"/>
+        <w:spacing w:after="0" w:line="240" w:lineRule="auto"/>
+        <w:rPr>
+          <w:rFonts w:ascii="Cascadia Mono" w:hAnsi="Cascadia Mono" w:cs="Cascadia Mono"/>
+          <w:color w:val="000000"/>
+          <w:kern w:val="0"/>
+          <w:sz w:val="19"/>
+          <w:szCs w:val="19"/>
+          <w:highlight w:val="white"/>
+        </w:rPr>
+      </w:pPr>
+      <w:r>
+        <w:rPr>
+          <w:rFonts w:ascii="Cascadia Mono" w:hAnsi="Cascadia Mono" w:cs="Cascadia Mono"/>
+          <w:color w:val="000000"/>
+          <w:kern w:val="0"/>
+          <w:sz w:val="19"/>
+          <w:szCs w:val="19"/>
+          <w:highlight w:val="white"/>
+        </w:rPr>
+        <w:t>Data Standardization &amp; Consistency</w:t>
+      </w:r>
+    </w:p>
+    <w:p>
+      <w:pPr>
+        <w:autoSpaceDE w:val="0"/>
+        <w:autoSpaceDN w:val="0"/>
+        <w:adjustRightInd w:val="0"/>
+        <w:spacing w:after="0" w:line="240" w:lineRule="auto"/>
+        <w:rPr>
+          <w:rFonts w:ascii="Cascadia Mono" w:hAnsi="Cascadia Mono" w:cs="Cascadia Mono"/>
+          <w:color w:val="000000"/>
+          <w:kern w:val="0"/>
+          <w:sz w:val="19"/>
+          <w:szCs w:val="19"/>
+          <w:highlight w:val="white"/>
+        </w:rPr>
+      </w:pPr>
+    </w:p>
+    <w:p>
+      <w:pPr>
+        <w:autoSpaceDE w:val="0"/>
+        <w:autoSpaceDN w:val="0"/>
+        <w:adjustRightInd w:val="0"/>
+        <w:spacing w:after="0" w:line="240" w:lineRule="auto"/>
+        <w:rPr>
+          <w:rFonts w:ascii="Cascadia Mono" w:hAnsi="Cascadia Mono" w:cs="Cascadia Mono"/>
+          <w:color w:val="000000"/>
+          <w:kern w:val="0"/>
+          <w:sz w:val="19"/>
+          <w:szCs w:val="19"/>
+          <w:highlight w:val="white"/>
+        </w:rPr>
+      </w:pPr>
+      <w:r>
+        <w:rPr>
+          <w:rFonts w:ascii="Cascadia Mono" w:hAnsi="Cascadia Mono" w:cs="Cascadia Mono"/>
+          <w:color w:val="000000"/>
+          <w:kern w:val="0"/>
+          <w:sz w:val="19"/>
+          <w:szCs w:val="19"/>
+          <w:highlight w:val="white"/>
+        </w:rPr>
+        <w:lastRenderedPageBreak/>
+        <w:t>(3 rows affected)</w:t>
+      </w:r>
+    </w:p>
+    <w:p>
+      <w:pPr>
+        <w:autoSpaceDE w:val="0"/>
+        <w:autoSpaceDN w:val="0"/>
+        <w:adjustRightInd w:val="0"/>
+        <w:spacing w:after="0" w:line="240" w:lineRule="auto"/>
+        <w:rPr>
+          <w:rFonts w:ascii="Cascadia Mono" w:hAnsi="Cascadia Mono" w:cs="Cascadia Mono"/>
+          <w:color w:val="000000"/>
+          <w:kern w:val="0"/>
+          <w:sz w:val="19"/>
+          <w:szCs w:val="19"/>
+          <w:highlight w:val="white"/>
+        </w:rPr>
+      </w:pPr>
+      <w:r>
+        <w:rPr>
+          <w:rFonts w:ascii="Cascadia Mono" w:hAnsi="Cascadia Mono" w:cs="Cascadia Mono"/>
+          <w:color w:val="000000"/>
+          <w:kern w:val="0"/>
+          <w:sz w:val="19"/>
+          <w:szCs w:val="19"/>
+          <w:highlight w:val="white"/>
+        </w:rPr>
+        <w:t>====================================================================</w:t>
+      </w:r>
+    </w:p>
+    <w:p>
+      <w:pPr>
+        <w:autoSpaceDE w:val="0"/>
+        <w:autoSpaceDN w:val="0"/>
+        <w:adjustRightInd w:val="0"/>
+        <w:spacing w:after="0" w:line="240" w:lineRule="auto"/>
+        <w:rPr>
+          <w:rFonts w:ascii="Cascadia Mono" w:hAnsi="Cascadia Mono" w:cs="Cascadia Mono"/>
+          <w:color w:val="000000"/>
+          <w:kern w:val="0"/>
+          <w:sz w:val="19"/>
+          <w:szCs w:val="19"/>
+          <w:highlight w:val="white"/>
+        </w:rPr>
+      </w:pPr>
+      <w:r>
+        <w:rPr>
+          <w:rFonts w:ascii="Cascadia Mono" w:hAnsi="Cascadia Mono" w:cs="Cascadia Mono"/>
+          <w:color w:val="000000"/>
+          <w:kern w:val="0"/>
+          <w:sz w:val="19"/>
+          <w:szCs w:val="19"/>
+          <w:highlight w:val="white"/>
+        </w:rPr>
+        <w:t>Checking bronze.crmPrdInfo</w:t>
+      </w:r>
+    </w:p>
+    <w:p>
+      <w:pPr>
+        <w:autoSpaceDE w:val="0"/>
+        <w:autoSpaceDN w:val="0"/>
+        <w:adjustRightInd w:val="0"/>
+        <w:spacing w:after="0" w:line="240" w:lineRule="auto"/>
+        <w:rPr>
+          <w:rFonts w:ascii="Cascadia Mono" w:hAnsi="Cascadia Mono" w:cs="Cascadia Mono"/>
+          <w:color w:val="000000"/>
+          <w:kern w:val="0"/>
+          <w:sz w:val="19"/>
+          <w:szCs w:val="19"/>
+          <w:highlight w:val="white"/>
+        </w:rPr>
+      </w:pPr>
+      <w:r>
+        <w:rPr>
+          <w:rFonts w:ascii="Cascadia Mono" w:hAnsi="Cascadia Mono" w:cs="Cascadia Mono"/>
+          <w:color w:val="000000"/>
+          <w:kern w:val="0"/>
+          <w:sz w:val="19"/>
+          <w:szCs w:val="19"/>
+          <w:highlight w:val="white"/>
+        </w:rPr>
+        <w:t>====================================================================</w:t>
+      </w:r>
+    </w:p>
+    <w:p>
+      <w:pPr>
+        <w:autoSpaceDE w:val="0"/>
+        <w:autoSpaceDN w:val="0"/>
+        <w:adjustRightInd w:val="0"/>
+        <w:spacing w:after="0" w:line="240" w:lineRule="auto"/>
+        <w:rPr>
+          <w:rFonts w:ascii="Cascadia Mono" w:hAnsi="Cascadia Mono" w:cs="Cascadia Mono"/>
+          <w:color w:val="000000"/>
+          <w:kern w:val="0"/>
+          <w:sz w:val="19"/>
+          <w:szCs w:val="19"/>
+          <w:highlight w:val="white"/>
+        </w:rPr>
+      </w:pPr>
+      <w:r>
+        <w:rPr>
+          <w:rFonts w:ascii="Cascadia Mono" w:hAnsi="Cascadia Mono" w:cs="Cascadia Mono"/>
+          <w:color w:val="000000"/>
+          <w:kern w:val="0"/>
+          <w:sz w:val="19"/>
+          <w:szCs w:val="19"/>
+          <w:highlight w:val="white"/>
+        </w:rPr>
+        <w:t>Check for NULLs or Duplicates in Primary Key</w:t>
+      </w:r>
+    </w:p>
+    <w:p>
+      <w:pPr>
+        <w:autoSpaceDE w:val="0"/>
+        <w:autoSpaceDN w:val="0"/>
+        <w:adjustRightInd w:val="0"/>
+        <w:spacing w:after="0" w:line="240" w:lineRule="auto"/>
+        <w:rPr>
+          <w:rFonts w:ascii="Cascadia Mono" w:hAnsi="Cascadia Mono" w:cs="Cascadia Mono"/>
+          <w:color w:val="000000"/>
+          <w:kern w:val="0"/>
+          <w:sz w:val="19"/>
+          <w:szCs w:val="19"/>
+          <w:highlight w:val="white"/>
+        </w:rPr>
+      </w:pPr>
+    </w:p>
+    <w:p>
+      <w:pPr>
+        <w:autoSpaceDE w:val="0"/>
+        <w:autoSpaceDN w:val="0"/>
+        <w:adjustRightInd w:val="0"/>
+        <w:spacing w:after="0" w:line="240" w:lineRule="auto"/>
+        <w:rPr>
+          <w:rFonts w:ascii="Cascadia Mono" w:hAnsi="Cascadia Mono" w:cs="Cascadia Mono"/>
+          <w:color w:val="000000"/>
+          <w:kern w:val="0"/>
+          <w:sz w:val="19"/>
+          <w:szCs w:val="19"/>
+          <w:highlight w:val="white"/>
+        </w:rPr>
+      </w:pPr>
+      <w:r>
+        <w:rPr>
+          <w:rFonts w:ascii="Cascadia Mono" w:hAnsi="Cascadia Mono" w:cs="Cascadia Mono"/>
+          <w:color w:val="000000"/>
+          <w:kern w:val="0"/>
+          <w:sz w:val="19"/>
+          <w:szCs w:val="19"/>
+          <w:highlight w:val="white"/>
+        </w:rPr>
+        <w:t>(0 rows affected)</w:t>
+      </w:r>
+    </w:p>
+    <w:p>
+      <w:pPr>
+        <w:autoSpaceDE w:val="0"/>
+        <w:autoSpaceDN w:val="0"/>
+        <w:adjustRightInd w:val="0"/>
+        <w:spacing w:after="0" w:line="240" w:lineRule="auto"/>
+        <w:rPr>
+          <w:rFonts w:ascii="Cascadia Mono" w:hAnsi="Cascadia Mono" w:cs="Cascadia Mono"/>
+          <w:color w:val="000000"/>
+          <w:kern w:val="0"/>
+          <w:sz w:val="19"/>
+          <w:szCs w:val="19"/>
+          <w:highlight w:val="white"/>
+        </w:rPr>
+      </w:pPr>
+      <w:r>
+        <w:rPr>
+          <w:rFonts w:ascii="Cascadia Mono" w:hAnsi="Cascadia Mono" w:cs="Cascadia Mono"/>
+          <w:color w:val="000000"/>
+          <w:kern w:val="0"/>
+          <w:sz w:val="19"/>
+          <w:szCs w:val="19"/>
+          <w:highlight w:val="white"/>
+        </w:rPr>
+        <w:t>Check for Unwanted Spaces</w:t>
+      </w:r>
+    </w:p>
+    <w:p>
+      <w:pPr>
+        <w:autoSpaceDE w:val="0"/>
+        <w:autoSpaceDN w:val="0"/>
+        <w:adjustRightInd w:val="0"/>
+        <w:spacing w:after="0" w:line="240" w:lineRule="auto"/>
+        <w:rPr>
+          <w:rFonts w:ascii="Cascadia Mono" w:hAnsi="Cascadia Mono" w:cs="Cascadia Mono"/>
+          <w:color w:val="000000"/>
+          <w:kern w:val="0"/>
+          <w:sz w:val="19"/>
+          <w:szCs w:val="19"/>
+          <w:highlight w:val="white"/>
+        </w:rPr>
+      </w:pPr>
+    </w:p>
+    <w:p>
+      <w:pPr>
+        <w:autoSpaceDE w:val="0"/>
+        <w:autoSpaceDN w:val="0"/>
+        <w:adjustRightInd w:val="0"/>
+        <w:spacing w:after="0" w:line="240" w:lineRule="auto"/>
+        <w:rPr>
+          <w:rFonts w:ascii="Cascadia Mono" w:hAnsi="Cascadia Mono" w:cs="Cascadia Mono"/>
+          <w:color w:val="000000"/>
+          <w:kern w:val="0"/>
+          <w:sz w:val="19"/>
+          <w:szCs w:val="19"/>
+          <w:highlight w:val="white"/>
+        </w:rPr>
+      </w:pPr>
+      <w:r>
+        <w:rPr>
+          <w:rFonts w:ascii="Cascadia Mono" w:hAnsi="Cascadia Mono" w:cs="Cascadia Mono"/>
+          <w:color w:val="000000"/>
+          <w:kern w:val="0"/>
+          <w:sz w:val="19"/>
+          <w:szCs w:val="19"/>
+          <w:highlight w:val="white"/>
+        </w:rPr>
+        <w:t>(0 rows affected)</w:t>
+      </w:r>
+    </w:p>
+    <w:p>
+      <w:pPr>
+        <w:autoSpaceDE w:val="0"/>
+        <w:autoSpaceDN w:val="0"/>
+        <w:adjustRightInd w:val="0"/>
+        <w:spacing w:after="0" w:line="240" w:lineRule="auto"/>
+        <w:rPr>
+          <w:rFonts w:ascii="Cascadia Mono" w:hAnsi="Cascadia Mono" w:cs="Cascadia Mono"/>
+          <w:color w:val="000000"/>
+          <w:kern w:val="0"/>
+          <w:sz w:val="19"/>
+          <w:szCs w:val="19"/>
+          <w:highlight w:val="white"/>
+        </w:rPr>
+      </w:pPr>
+      <w:r>
+        <w:rPr>
+          <w:rFonts w:ascii="Cascadia Mono" w:hAnsi="Cascadia Mono" w:cs="Cascadia Mono"/>
+          <w:color w:val="000000"/>
+          <w:kern w:val="0"/>
+          <w:sz w:val="19"/>
+          <w:szCs w:val="19"/>
+          <w:highlight w:val="white"/>
+        </w:rPr>
+        <w:t>Check for NULLs or Negative Values in Cost</w:t>
+      </w:r>
+    </w:p>
+    <w:p>
+      <w:pPr>
+        <w:autoSpaceDE w:val="0"/>
+        <w:autoSpaceDN w:val="0"/>
+        <w:adjustRightInd w:val="0"/>
+        <w:spacing w:after="0" w:line="240" w:lineRule="auto"/>
+        <w:rPr>
+          <w:rFonts w:ascii="Cascadia Mono" w:hAnsi="Cascadia Mono" w:cs="Cascadia Mono"/>
+          <w:color w:val="000000"/>
+          <w:kern w:val="0"/>
+          <w:sz w:val="19"/>
+          <w:szCs w:val="19"/>
+          <w:highlight w:val="white"/>
+        </w:rPr>
+      </w:pPr>
+    </w:p>
+    <w:p>
+      <w:pPr>
+        <w:autoSpaceDE w:val="0"/>
+        <w:autoSpaceDN w:val="0"/>
+        <w:adjustRightInd w:val="0"/>
+        <w:spacing w:after="0" w:line="240" w:lineRule="auto"/>
+        <w:rPr>
+          <w:rFonts w:ascii="Cascadia Mono" w:hAnsi="Cascadia Mono" w:cs="Cascadia Mono"/>
+          <w:color w:val="000000"/>
+          <w:kern w:val="0"/>
+          <w:sz w:val="19"/>
+          <w:szCs w:val="19"/>
+          <w:highlight w:val="white"/>
+        </w:rPr>
+      </w:pPr>
+      <w:r>
+        <w:rPr>
+          <w:rFonts w:ascii="Cascadia Mono" w:hAnsi="Cascadia Mono" w:cs="Cascadia Mono"/>
+          <w:color w:val="000000"/>
+          <w:kern w:val="0"/>
+          <w:sz w:val="19"/>
+          <w:szCs w:val="19"/>
+          <w:highlight w:val="white"/>
+        </w:rPr>
+        <w:t>(2 rows affected)</w:t>
+      </w:r>
+    </w:p>
+    <w:p>
+      <w:pPr>
+        <w:autoSpaceDE w:val="0"/>
+        <w:autoSpaceDN w:val="0"/>
+        <w:adjustRightInd w:val="0"/>
+        <w:spacing w:after="0" w:line="240" w:lineRule="auto"/>
+        <w:rPr>
+          <w:rFonts w:ascii="Cascadia Mono" w:hAnsi="Cascadia Mono" w:cs="Cascadia Mono"/>
+          <w:color w:val="000000"/>
+          <w:kern w:val="0"/>
+          <w:sz w:val="19"/>
+          <w:szCs w:val="19"/>
+          <w:highlight w:val="white"/>
+        </w:rPr>
+      </w:pPr>
+      <w:r>
+        <w:rPr>
+          <w:rFonts w:ascii="Cascadia Mono" w:hAnsi="Cascadia Mono" w:cs="Cascadia Mono"/>
+          <w:color w:val="000000"/>
+          <w:kern w:val="0"/>
+          <w:sz w:val="19"/>
+          <w:szCs w:val="19"/>
+          <w:highlight w:val="white"/>
+        </w:rPr>
+        <w:t>Data Standardization &amp; Consistency</w:t>
+      </w:r>
+    </w:p>
+    <w:p>
+      <w:pPr>
+        <w:autoSpaceDE w:val="0"/>
+        <w:autoSpaceDN w:val="0"/>
+        <w:adjustRightInd w:val="0"/>
+        <w:spacing w:after="0" w:line="240" w:lineRule="auto"/>
+        <w:rPr>
+          <w:rFonts w:ascii="Cascadia Mono" w:hAnsi="Cascadia Mono" w:cs="Cascadia Mono"/>
+          <w:color w:val="000000"/>
+          <w:kern w:val="0"/>
+          <w:sz w:val="19"/>
+          <w:szCs w:val="19"/>
+          <w:highlight w:val="white"/>
+        </w:rPr>
+      </w:pPr>
+    </w:p>
+    <w:p>
+      <w:pPr>
+        <w:autoSpaceDE w:val="0"/>
+        <w:autoSpaceDN w:val="0"/>
+        <w:adjustRightInd w:val="0"/>
+        <w:spacing w:after="0" w:line="240" w:lineRule="auto"/>
+        <w:rPr>
+          <w:rFonts w:ascii="Cascadia Mono" w:hAnsi="Cascadia Mono" w:cs="Cascadia Mono"/>
+          <w:color w:val="000000"/>
+          <w:kern w:val="0"/>
+          <w:sz w:val="19"/>
+          <w:szCs w:val="19"/>
+          <w:highlight w:val="white"/>
+        </w:rPr>
+      </w:pPr>
+      <w:r>
+        <w:rPr>
+          <w:rFonts w:ascii="Cascadia Mono" w:hAnsi="Cascadia Mono" w:cs="Cascadia Mono"/>
+          <w:color w:val="000000"/>
+          <w:kern w:val="0"/>
+          <w:sz w:val="19"/>
+          <w:szCs w:val="19"/>
+          <w:highlight w:val="white"/>
+        </w:rPr>
+        <w:t>(5 rows affected)</w:t>
+      </w:r>
+    </w:p>
+    <w:p>
+      <w:pPr>
+        <w:autoSpaceDE w:val="0"/>
+        <w:autoSpaceDN w:val="0"/>
+        <w:adjustRightInd w:val="0"/>
+        <w:spacing w:after="0" w:line="240" w:lineRule="auto"/>
+        <w:rPr>
+          <w:rFonts w:ascii="Cascadia Mono" w:hAnsi="Cascadia Mono" w:cs="Cascadia Mono"/>
+          <w:color w:val="000000"/>
+          <w:kern w:val="0"/>
+          <w:sz w:val="19"/>
+          <w:szCs w:val="19"/>
+          <w:highlight w:val="white"/>
+        </w:rPr>
+      </w:pPr>
+      <w:r>
+        <w:rPr>
+          <w:rFonts w:ascii="Cascadia Mono" w:hAnsi="Cascadia Mono" w:cs="Cascadia Mono"/>
+          <w:color w:val="000000"/>
+          <w:kern w:val="0"/>
+          <w:sz w:val="19"/>
+          <w:szCs w:val="19"/>
+          <w:highlight w:val="white"/>
+        </w:rPr>
+        <w:t>Check for Invalid Date Orders (Start Date &gt; End Date)</w:t>
+      </w:r>
+    </w:p>
+    <w:p>
+      <w:pPr>
+        <w:autoSpaceDE w:val="0"/>
+        <w:autoSpaceDN w:val="0"/>
+        <w:adjustRightInd w:val="0"/>
+        <w:spacing w:after="0" w:line="240" w:lineRule="auto"/>
+        <w:rPr>
+          <w:rFonts w:ascii="Cascadia Mono" w:hAnsi="Cascadia Mono" w:cs="Cascadia Mono"/>
+          <w:color w:val="000000"/>
+          <w:kern w:val="0"/>
+          <w:sz w:val="19"/>
+          <w:szCs w:val="19"/>
+          <w:highlight w:val="white"/>
+        </w:rPr>
+      </w:pPr>
+    </w:p>
+    <w:p>
+      <w:pPr>
+        <w:autoSpaceDE w:val="0"/>
+        <w:autoSpaceDN w:val="0"/>
+        <w:adjustRightInd w:val="0"/>
+        <w:spacing w:after="0" w:line="240" w:lineRule="auto"/>
+        <w:rPr>
+          <w:rFonts w:ascii="Cascadia Mono" w:hAnsi="Cascadia Mono" w:cs="Cascadia Mono"/>
+          <w:color w:val="000000"/>
+          <w:kern w:val="0"/>
+          <w:sz w:val="19"/>
+          <w:szCs w:val="19"/>
+          <w:highlight w:val="white"/>
+        </w:rPr>
+      </w:pPr>
+      <w:r>
+        <w:rPr>
+          <w:rFonts w:ascii="Cascadia Mono" w:hAnsi="Cascadia Mono" w:cs="Cascadia Mono"/>
+          <w:color w:val="000000"/>
+          <w:kern w:val="0"/>
+          <w:sz w:val="19"/>
+          <w:szCs w:val="19"/>
+          <w:highlight w:val="white"/>
+        </w:rPr>
+        <w:t>(200 rows affected)</w:t>
+      </w:r>
+    </w:p>
+    <w:p>
+      <w:pPr>
+        <w:autoSpaceDE w:val="0"/>
+        <w:autoSpaceDN w:val="0"/>
+        <w:adjustRightInd w:val="0"/>
+        <w:spacing w:after="0" w:line="240" w:lineRule="auto"/>
+        <w:rPr>
+          <w:rFonts w:ascii="Cascadia Mono" w:hAnsi="Cascadia Mono" w:cs="Cascadia Mono"/>
+          <w:color w:val="000000"/>
+          <w:kern w:val="0"/>
+          <w:sz w:val="19"/>
+          <w:szCs w:val="19"/>
+          <w:highlight w:val="white"/>
+        </w:rPr>
+      </w:pPr>
+      <w:r>
+        <w:rPr>
+          <w:rFonts w:ascii="Cascadia Mono" w:hAnsi="Cascadia Mono" w:cs="Cascadia Mono"/>
+          <w:color w:val="000000"/>
+          <w:kern w:val="0"/>
+          <w:sz w:val="19"/>
+          <w:szCs w:val="19"/>
+          <w:highlight w:val="white"/>
+        </w:rPr>
+        <w:t>====================================================================</w:t>
+      </w:r>
+    </w:p>
+    <w:p>
+      <w:pPr>
+        <w:autoSpaceDE w:val="0"/>
+        <w:autoSpaceDN w:val="0"/>
+        <w:adjustRightInd w:val="0"/>
+        <w:spacing w:after="0" w:line="240" w:lineRule="auto"/>
+        <w:rPr>
+          <w:rFonts w:ascii="Cascadia Mono" w:hAnsi="Cascadia Mono" w:cs="Cascadia Mono"/>
+          <w:color w:val="000000"/>
+          <w:kern w:val="0"/>
+          <w:sz w:val="19"/>
+          <w:szCs w:val="19"/>
+          <w:highlight w:val="white"/>
+        </w:rPr>
+      </w:pPr>
+      <w:r>
+        <w:rPr>
+          <w:rFonts w:ascii="Cascadia Mono" w:hAnsi="Cascadia Mono" w:cs="Cascadia Mono"/>
+          <w:color w:val="000000"/>
+          <w:kern w:val="0"/>
+          <w:sz w:val="19"/>
+          <w:szCs w:val="19"/>
+          <w:highlight w:val="white"/>
+        </w:rPr>
+        <w:t>Checking bronze.crmSalesDetails</w:t>
+      </w:r>
+    </w:p>
+    <w:p>
+      <w:pPr>
+        <w:autoSpaceDE w:val="0"/>
+        <w:autoSpaceDN w:val="0"/>
+        <w:adjustRightInd w:val="0"/>
+        <w:spacing w:after="0" w:line="240" w:lineRule="auto"/>
+        <w:rPr>
+          <w:rFonts w:ascii="Cascadia Mono" w:hAnsi="Cascadia Mono" w:cs="Cascadia Mono"/>
+          <w:color w:val="000000"/>
+          <w:kern w:val="0"/>
+          <w:sz w:val="19"/>
+          <w:szCs w:val="19"/>
+          <w:highlight w:val="white"/>
+        </w:rPr>
+      </w:pPr>
+      <w:r>
+        <w:rPr>
+          <w:rFonts w:ascii="Cascadia Mono" w:hAnsi="Cascadia Mono" w:cs="Cascadia Mono"/>
+          <w:color w:val="000000"/>
+          <w:kern w:val="0"/>
+          <w:sz w:val="19"/>
+          <w:szCs w:val="19"/>
+          <w:highlight w:val="white"/>
+        </w:rPr>
+        <w:t>====================================================================</w:t>
+      </w:r>
+    </w:p>
+    <w:p>
+      <w:pPr>
+        <w:autoSpaceDE w:val="0"/>
+        <w:autoSpaceDN w:val="0"/>
+        <w:adjustRightInd w:val="0"/>
+        <w:spacing w:after="0" w:line="240" w:lineRule="auto"/>
+        <w:rPr>
+          <w:rFonts w:ascii="Cascadia Mono" w:hAnsi="Cascadia Mono" w:cs="Cascadia Mono"/>
+          <w:color w:val="000000"/>
+          <w:kern w:val="0"/>
+          <w:sz w:val="19"/>
+          <w:szCs w:val="19"/>
+          <w:highlight w:val="white"/>
+        </w:rPr>
+      </w:pPr>
+      <w:r>
+        <w:rPr>
+          <w:rFonts w:ascii="Cascadia Mono" w:hAnsi="Cascadia Mono" w:cs="Cascadia Mono"/>
+          <w:color w:val="000000"/>
+          <w:kern w:val="0"/>
+          <w:sz w:val="19"/>
+          <w:szCs w:val="19"/>
+          <w:highlight w:val="white"/>
+        </w:rPr>
+        <w:t>Check for Invalid Dates</w:t>
+      </w:r>
+    </w:p>
+    <w:p>
+      <w:pPr>
+        <w:autoSpaceDE w:val="0"/>
+        <w:autoSpaceDN w:val="0"/>
+        <w:adjustRightInd w:val="0"/>
+        <w:spacing w:after="0" w:line="240" w:lineRule="auto"/>
+        <w:rPr>
+          <w:rFonts w:ascii="Cascadia Mono" w:hAnsi="Cascadia Mono" w:cs="Cascadia Mono"/>
+          <w:color w:val="000000"/>
+          <w:kern w:val="0"/>
+          <w:sz w:val="19"/>
+          <w:szCs w:val="19"/>
+          <w:highlight w:val="white"/>
+        </w:rPr>
+      </w:pPr>
+    </w:p>
+    <w:p>
+      <w:pPr>
+        <w:autoSpaceDE w:val="0"/>
+        <w:autoSpaceDN w:val="0"/>
+        <w:adjustRightInd w:val="0"/>
+        <w:spacing w:after="0" w:line="240" w:lineRule="auto"/>
+        <w:rPr>
+          <w:rFonts w:ascii="Cascadia Mono" w:hAnsi="Cascadia Mono" w:cs="Cascadia Mono"/>
+          <w:color w:val="000000"/>
+          <w:kern w:val="0"/>
+          <w:sz w:val="19"/>
+          <w:szCs w:val="19"/>
+          <w:highlight w:val="white"/>
+        </w:rPr>
+      </w:pPr>
+      <w:r>
+        <w:rPr>
+          <w:rFonts w:ascii="Cascadia Mono" w:hAnsi="Cascadia Mono" w:cs="Cascadia Mono"/>
+          <w:color w:val="000000"/>
+          <w:kern w:val="0"/>
+          <w:sz w:val="19"/>
+          <w:szCs w:val="19"/>
+          <w:highlight w:val="white"/>
+        </w:rPr>
+        <w:t>(0 rows affected)</w:t>
+      </w:r>
+    </w:p>
+    <w:p>
+      <w:pPr>
+        <w:autoSpaceDE w:val="0"/>
+        <w:autoSpaceDN w:val="0"/>
+        <w:adjustRightInd w:val="0"/>
+        <w:spacing w:after="0" w:line="240" w:lineRule="auto"/>
+        <w:rPr>
+          <w:rFonts w:ascii="Cascadia Mono" w:hAnsi="Cascadia Mono" w:cs="Cascadia Mono"/>
+          <w:color w:val="000000"/>
+          <w:kern w:val="0"/>
+          <w:sz w:val="19"/>
+          <w:szCs w:val="19"/>
+          <w:highlight w:val="white"/>
+        </w:rPr>
+      </w:pPr>
+      <w:r>
+        <w:rPr>
+          <w:rFonts w:ascii="Cascadia Mono" w:hAnsi="Cascadia Mono" w:cs="Cascadia Mono"/>
+          <w:color w:val="000000"/>
+          <w:kern w:val="0"/>
+          <w:sz w:val="19"/>
+          <w:szCs w:val="19"/>
+          <w:highlight w:val="white"/>
+        </w:rPr>
+        <w:t>Check for Invalid Date Orders (Order Date &gt; Shipping/Due Dates)</w:t>
+      </w:r>
+    </w:p>
+    <w:p>
+      <w:pPr>
+        <w:autoSpaceDE w:val="0"/>
+        <w:autoSpaceDN w:val="0"/>
+        <w:adjustRightInd w:val="0"/>
+        <w:spacing w:after="0" w:line="240" w:lineRule="auto"/>
+        <w:rPr>
+          <w:rFonts w:ascii="Cascadia Mono" w:hAnsi="Cascadia Mono" w:cs="Cascadia Mono"/>
+          <w:color w:val="000000"/>
+          <w:kern w:val="0"/>
+          <w:sz w:val="19"/>
+          <w:szCs w:val="19"/>
+          <w:highlight w:val="white"/>
+        </w:rPr>
+      </w:pPr>
+    </w:p>
+    <w:p>
+      <w:pPr>
+        <w:autoSpaceDE w:val="0"/>
+        <w:autoSpaceDN w:val="0"/>
+        <w:adjustRightInd w:val="0"/>
+        <w:spacing w:after="0" w:line="240" w:lineRule="auto"/>
+        <w:rPr>
+          <w:rFonts w:ascii="Cascadia Mono" w:hAnsi="Cascadia Mono" w:cs="Cascadia Mono"/>
+          <w:color w:val="000000"/>
+          <w:kern w:val="0"/>
+          <w:sz w:val="19"/>
+          <w:szCs w:val="19"/>
+          <w:highlight w:val="white"/>
+        </w:rPr>
+      </w:pPr>
+      <w:r>
+        <w:rPr>
+          <w:rFonts w:ascii="Cascadia Mono" w:hAnsi="Cascadia Mono" w:cs="Cascadia Mono"/>
+          <w:color w:val="000000"/>
+          <w:kern w:val="0"/>
+          <w:sz w:val="19"/>
+          <w:szCs w:val="19"/>
+          <w:highlight w:val="white"/>
+        </w:rPr>
+        <w:t>(0 rows affected)</w:t>
+      </w:r>
+    </w:p>
+    <w:p>
+      <w:pPr>
+        <w:autoSpaceDE w:val="0"/>
+        <w:autoSpaceDN w:val="0"/>
+        <w:adjustRightInd w:val="0"/>
+        <w:spacing w:after="0" w:line="240" w:lineRule="auto"/>
+        <w:rPr>
+          <w:rFonts w:ascii="Cascadia Mono" w:hAnsi="Cascadia Mono" w:cs="Cascadia Mono"/>
+          <w:color w:val="000000"/>
+          <w:kern w:val="0"/>
+          <w:sz w:val="19"/>
+          <w:szCs w:val="19"/>
+          <w:highlight w:val="white"/>
+        </w:rPr>
+      </w:pPr>
+      <w:r>
+        <w:rPr>
+          <w:rFonts w:ascii="Cascadia Mono" w:hAnsi="Cascadia Mono" w:cs="Cascadia Mono"/>
+          <w:color w:val="000000"/>
+          <w:kern w:val="0"/>
+          <w:sz w:val="19"/>
+          <w:szCs w:val="19"/>
+          <w:highlight w:val="white"/>
+        </w:rPr>
+        <w:t>Check Data Consistency: Sales = Quantity * Price</w:t>
+      </w:r>
+    </w:p>
+    <w:p>
+      <w:pPr>
+        <w:autoSpaceDE w:val="0"/>
+        <w:autoSpaceDN w:val="0"/>
+        <w:adjustRightInd w:val="0"/>
+        <w:spacing w:after="0" w:line="240" w:lineRule="auto"/>
+        <w:rPr>
+          <w:rFonts w:ascii="Cascadia Mono" w:hAnsi="Cascadia Mono" w:cs="Cascadia Mono"/>
+          <w:color w:val="000000"/>
+          <w:kern w:val="0"/>
+          <w:sz w:val="19"/>
+          <w:szCs w:val="19"/>
+          <w:highlight w:val="white"/>
+        </w:rPr>
+      </w:pPr>
+    </w:p>
+    <w:p>
+      <w:pPr>
+        <w:autoSpaceDE w:val="0"/>
+        <w:autoSpaceDN w:val="0"/>
+        <w:adjustRightInd w:val="0"/>
+        <w:spacing w:after="0" w:line="240" w:lineRule="auto"/>
+        <w:rPr>
+          <w:rFonts w:ascii="Cascadia Mono" w:hAnsi="Cascadia Mono" w:cs="Cascadia Mono"/>
+          <w:color w:val="000000"/>
+          <w:kern w:val="0"/>
+          <w:sz w:val="19"/>
+          <w:szCs w:val="19"/>
+          <w:highlight w:val="white"/>
+        </w:rPr>
+      </w:pPr>
+      <w:r>
+        <w:rPr>
+          <w:rFonts w:ascii="Cascadia Mono" w:hAnsi="Cascadia Mono" w:cs="Cascadia Mono"/>
+          <w:color w:val="000000"/>
+          <w:kern w:val="0"/>
+          <w:sz w:val="19"/>
+          <w:szCs w:val="19"/>
+          <w:highlight w:val="white"/>
+        </w:rPr>
+        <w:t>(33 rows affected)</w:t>
+      </w:r>
+    </w:p>
+    <w:p>
+      <w:pPr>
+        <w:autoSpaceDE w:val="0"/>
+        <w:autoSpaceDN w:val="0"/>
+        <w:adjustRightInd w:val="0"/>
+        <w:spacing w:after="0" w:line="240" w:lineRule="auto"/>
+        <w:rPr>
+          <w:rFonts w:ascii="Cascadia Mono" w:hAnsi="Cascadia Mono" w:cs="Cascadia Mono"/>
+          <w:color w:val="000000"/>
+          <w:kern w:val="0"/>
+          <w:sz w:val="19"/>
+          <w:szCs w:val="19"/>
+          <w:highlight w:val="white"/>
+        </w:rPr>
+      </w:pPr>
+      <w:r>
+        <w:rPr>
+          <w:rFonts w:ascii="Cascadia Mono" w:hAnsi="Cascadia Mono" w:cs="Cascadia Mono"/>
+          <w:color w:val="000000"/>
+          <w:kern w:val="0"/>
+          <w:sz w:val="19"/>
+          <w:szCs w:val="19"/>
+          <w:highlight w:val="white"/>
+        </w:rPr>
+        <w:t>====================================================================</w:t>
+      </w:r>
+    </w:p>
+    <w:p>
+      <w:pPr>
+        <w:autoSpaceDE w:val="0"/>
+        <w:autoSpaceDN w:val="0"/>
+        <w:adjustRightInd w:val="0"/>
+        <w:spacing w:after="0" w:line="240" w:lineRule="auto"/>
+        <w:rPr>
+          <w:rFonts w:ascii="Cascadia Mono" w:hAnsi="Cascadia Mono" w:cs="Cascadia Mono"/>
+          <w:color w:val="000000"/>
+          <w:kern w:val="0"/>
+          <w:sz w:val="19"/>
+          <w:szCs w:val="19"/>
+          <w:highlight w:val="white"/>
+        </w:rPr>
+      </w:pPr>
+      <w:r>
+        <w:rPr>
+          <w:rFonts w:ascii="Cascadia Mono" w:hAnsi="Cascadia Mono" w:cs="Cascadia Mono"/>
+          <w:color w:val="000000"/>
+          <w:kern w:val="0"/>
+          <w:sz w:val="19"/>
+          <w:szCs w:val="19"/>
+          <w:highlight w:val="white"/>
+        </w:rPr>
+        <w:t>Checking bronze.erpCustAz12</w:t>
+      </w:r>
+    </w:p>
+    <w:p>
+      <w:pPr>
+        <w:autoSpaceDE w:val="0"/>
+        <w:autoSpaceDN w:val="0"/>
+        <w:adjustRightInd w:val="0"/>
+        <w:spacing w:after="0" w:line="240" w:lineRule="auto"/>
+        <w:rPr>
+          <w:rFonts w:ascii="Cascadia Mono" w:hAnsi="Cascadia Mono" w:cs="Cascadia Mono"/>
+          <w:color w:val="000000"/>
+          <w:kern w:val="0"/>
+          <w:sz w:val="19"/>
+          <w:szCs w:val="19"/>
+          <w:highlight w:val="white"/>
+        </w:rPr>
+      </w:pPr>
+      <w:r>
+        <w:rPr>
+          <w:rFonts w:ascii="Cascadia Mono" w:hAnsi="Cascadia Mono" w:cs="Cascadia Mono"/>
+          <w:color w:val="000000"/>
+          <w:kern w:val="0"/>
+          <w:sz w:val="19"/>
+          <w:szCs w:val="19"/>
+          <w:highlight w:val="white"/>
+        </w:rPr>
+        <w:t>====================================================================</w:t>
+      </w:r>
+    </w:p>
+    <w:p>
+      <w:pPr>
+        <w:autoSpaceDE w:val="0"/>
+        <w:autoSpaceDN w:val="0"/>
+        <w:adjustRightInd w:val="0"/>
+        <w:spacing w:after="0" w:line="240" w:lineRule="auto"/>
+        <w:rPr>
+          <w:rFonts w:ascii="Cascadia Mono" w:hAnsi="Cascadia Mono" w:cs="Cascadia Mono"/>
+          <w:color w:val="000000"/>
+          <w:kern w:val="0"/>
+          <w:sz w:val="19"/>
+          <w:szCs w:val="19"/>
+          <w:highlight w:val="white"/>
+        </w:rPr>
+      </w:pPr>
+      <w:r>
+        <w:rPr>
+          <w:rFonts w:ascii="Cascadia Mono" w:hAnsi="Cascadia Mono" w:cs="Cascadia Mono"/>
+          <w:color w:val="000000"/>
+          <w:kern w:val="0"/>
+          <w:sz w:val="19"/>
+          <w:szCs w:val="19"/>
+          <w:highlight w:val="white"/>
+        </w:rPr>
+        <w:t>Identify Out-of-Range Dates</w:t>
+      </w:r>
+    </w:p>
+    <w:p>
+      <w:pPr>
+        <w:autoSpaceDE w:val="0"/>
+        <w:autoSpaceDN w:val="0"/>
+        <w:adjustRightInd w:val="0"/>
+        <w:spacing w:after="0" w:line="240" w:lineRule="auto"/>
+        <w:rPr>
+          <w:rFonts w:ascii="Cascadia Mono" w:hAnsi="Cascadia Mono" w:cs="Cascadia Mono"/>
+          <w:color w:val="000000"/>
+          <w:kern w:val="0"/>
+          <w:sz w:val="19"/>
+          <w:szCs w:val="19"/>
+          <w:highlight w:val="white"/>
+        </w:rPr>
+      </w:pPr>
+      <w:r>
+        <w:rPr>
+          <w:rFonts w:ascii="Cascadia Mono" w:hAnsi="Cascadia Mono" w:cs="Cascadia Mono"/>
+          <w:color w:val="000000"/>
+          <w:kern w:val="0"/>
+          <w:sz w:val="19"/>
+          <w:szCs w:val="19"/>
+          <w:highlight w:val="white"/>
+        </w:rPr>
+        <w:t>Expectation: Birthdates between 1924-01-01 and Today. We cannot expect to have a customer of over 103 years old</w:t>
+      </w:r>
+    </w:p>
+    <w:p>
+      <w:pPr>
+        <w:autoSpaceDE w:val="0"/>
+        <w:autoSpaceDN w:val="0"/>
+        <w:adjustRightInd w:val="0"/>
+        <w:spacing w:after="0" w:line="240" w:lineRule="auto"/>
+        <w:rPr>
+          <w:rFonts w:ascii="Cascadia Mono" w:hAnsi="Cascadia Mono" w:cs="Cascadia Mono"/>
+          <w:color w:val="000000"/>
+          <w:kern w:val="0"/>
+          <w:sz w:val="19"/>
+          <w:szCs w:val="19"/>
+          <w:highlight w:val="white"/>
+        </w:rPr>
+      </w:pPr>
+    </w:p>
+    <w:p>
+      <w:pPr>
+        <w:autoSpaceDE w:val="0"/>
+        <w:autoSpaceDN w:val="0"/>
+        <w:adjustRightInd w:val="0"/>
+        <w:spacing w:after="0" w:line="240" w:lineRule="auto"/>
+        <w:rPr>
+          <w:rFonts w:ascii="Cascadia Mono" w:hAnsi="Cascadia Mono" w:cs="Cascadia Mono"/>
+          <w:color w:val="000000"/>
+          <w:kern w:val="0"/>
+          <w:sz w:val="19"/>
+          <w:szCs w:val="19"/>
+          <w:highlight w:val="white"/>
+        </w:rPr>
+      </w:pPr>
+      <w:r>
+        <w:rPr>
+          <w:rFonts w:ascii="Cascadia Mono" w:hAnsi="Cascadia Mono" w:cs="Cascadia Mono"/>
+          <w:color w:val="000000"/>
+          <w:kern w:val="0"/>
+          <w:sz w:val="19"/>
+          <w:szCs w:val="19"/>
+          <w:highlight w:val="white"/>
+        </w:rPr>
+        <w:t>(31 rows affected)</w:t>
+      </w:r>
+    </w:p>
+    <w:p>
+      <w:pPr>
+        <w:autoSpaceDE w:val="0"/>
+        <w:autoSpaceDN w:val="0"/>
+        <w:adjustRightInd w:val="0"/>
+        <w:spacing w:after="0" w:line="240" w:lineRule="auto"/>
+        <w:rPr>
+          <w:rFonts w:ascii="Cascadia Mono" w:hAnsi="Cascadia Mono" w:cs="Cascadia Mono"/>
+          <w:color w:val="000000"/>
+          <w:kern w:val="0"/>
+          <w:sz w:val="19"/>
+          <w:szCs w:val="19"/>
+          <w:highlight w:val="white"/>
+        </w:rPr>
+      </w:pPr>
+      <w:r>
+        <w:rPr>
+          <w:rFonts w:ascii="Cascadia Mono" w:hAnsi="Cascadia Mono" w:cs="Cascadia Mono"/>
+          <w:color w:val="000000"/>
+          <w:kern w:val="0"/>
+          <w:sz w:val="19"/>
+          <w:szCs w:val="19"/>
+          <w:highlight w:val="white"/>
+        </w:rPr>
+        <w:t>Data Standardization &amp; Consistency</w:t>
+      </w:r>
+    </w:p>
+    <w:p>
+      <w:pPr>
+        <w:autoSpaceDE w:val="0"/>
+        <w:autoSpaceDN w:val="0"/>
+        <w:adjustRightInd w:val="0"/>
+        <w:spacing w:after="0" w:line="240" w:lineRule="auto"/>
+        <w:rPr>
+          <w:rFonts w:ascii="Cascadia Mono" w:hAnsi="Cascadia Mono" w:cs="Cascadia Mono"/>
+          <w:color w:val="000000"/>
+          <w:kern w:val="0"/>
+          <w:sz w:val="19"/>
+          <w:szCs w:val="19"/>
+          <w:highlight w:val="white"/>
+        </w:rPr>
+      </w:pPr>
+    </w:p>
+    <w:p>
+      <w:pPr>
+        <w:autoSpaceDE w:val="0"/>
+        <w:autoSpaceDN w:val="0"/>
+        <w:adjustRightInd w:val="0"/>
+        <w:spacing w:after="0" w:line="240" w:lineRule="auto"/>
+        <w:rPr>
+          <w:rFonts w:ascii="Cascadia Mono" w:hAnsi="Cascadia Mono" w:cs="Cascadia Mono"/>
+          <w:color w:val="000000"/>
+          <w:kern w:val="0"/>
+          <w:sz w:val="19"/>
+          <w:szCs w:val="19"/>
+          <w:highlight w:val="white"/>
+        </w:rPr>
+      </w:pPr>
+      <w:r>
+        <w:rPr>
+          <w:rFonts w:ascii="Cascadia Mono" w:hAnsi="Cascadia Mono" w:cs="Cascadia Mono"/>
+          <w:color w:val="000000"/>
+          <w:kern w:val="0"/>
+          <w:sz w:val="19"/>
+          <w:szCs w:val="19"/>
+          <w:highlight w:val="white"/>
+        </w:rPr>
+        <w:t>(6 rows affected)</w:t>
+      </w:r>
+    </w:p>
+    <w:p>
+      <w:pPr>
+        <w:autoSpaceDE w:val="0"/>
+        <w:autoSpaceDN w:val="0"/>
+        <w:adjustRightInd w:val="0"/>
+        <w:spacing w:after="0" w:line="240" w:lineRule="auto"/>
+        <w:rPr>
+          <w:rFonts w:ascii="Cascadia Mono" w:hAnsi="Cascadia Mono" w:cs="Cascadia Mono"/>
+          <w:color w:val="000000"/>
+          <w:kern w:val="0"/>
+          <w:sz w:val="19"/>
+          <w:szCs w:val="19"/>
+          <w:highlight w:val="white"/>
+        </w:rPr>
+      </w:pPr>
+      <w:r>
+        <w:rPr>
+          <w:rFonts w:ascii="Cascadia Mono" w:hAnsi="Cascadia Mono" w:cs="Cascadia Mono"/>
+          <w:color w:val="000000"/>
+          <w:kern w:val="0"/>
+          <w:sz w:val="19"/>
+          <w:szCs w:val="19"/>
+          <w:highlight w:val="white"/>
+        </w:rPr>
+        <w:t>====================================================================</w:t>
+      </w:r>
+    </w:p>
+    <w:p>
+      <w:pPr>
+        <w:autoSpaceDE w:val="0"/>
+        <w:autoSpaceDN w:val="0"/>
+        <w:adjustRightInd w:val="0"/>
+        <w:spacing w:after="0" w:line="240" w:lineRule="auto"/>
+        <w:rPr>
+          <w:rFonts w:ascii="Cascadia Mono" w:hAnsi="Cascadia Mono" w:cs="Cascadia Mono"/>
+          <w:color w:val="000000"/>
+          <w:kern w:val="0"/>
+          <w:sz w:val="19"/>
+          <w:szCs w:val="19"/>
+          <w:highlight w:val="white"/>
+        </w:rPr>
+      </w:pPr>
+      <w:r>
+        <w:rPr>
+          <w:rFonts w:ascii="Cascadia Mono" w:hAnsi="Cascadia Mono" w:cs="Cascadia Mono"/>
+          <w:color w:val="000000"/>
+          <w:kern w:val="0"/>
+          <w:sz w:val="19"/>
+          <w:szCs w:val="19"/>
+          <w:highlight w:val="white"/>
+        </w:rPr>
+        <w:t>Checking bronze.erpLocA101</w:t>
+      </w:r>
+    </w:p>
+    <w:p>
+      <w:pPr>
+        <w:autoSpaceDE w:val="0"/>
+        <w:autoSpaceDN w:val="0"/>
+        <w:adjustRightInd w:val="0"/>
+        <w:spacing w:after="0" w:line="240" w:lineRule="auto"/>
+        <w:rPr>
+          <w:rFonts w:ascii="Cascadia Mono" w:hAnsi="Cascadia Mono" w:cs="Cascadia Mono"/>
+          <w:color w:val="000000"/>
+          <w:kern w:val="0"/>
+          <w:sz w:val="19"/>
+          <w:szCs w:val="19"/>
+          <w:highlight w:val="white"/>
+        </w:rPr>
+      </w:pPr>
+      <w:r>
+        <w:rPr>
+          <w:rFonts w:ascii="Cascadia Mono" w:hAnsi="Cascadia Mono" w:cs="Cascadia Mono"/>
+          <w:color w:val="000000"/>
+          <w:kern w:val="0"/>
+          <w:sz w:val="19"/>
+          <w:szCs w:val="19"/>
+          <w:highlight w:val="white"/>
+        </w:rPr>
+        <w:t>====================================================================</w:t>
+      </w:r>
+    </w:p>
+    <w:p>
+      <w:pPr>
+        <w:autoSpaceDE w:val="0"/>
+        <w:autoSpaceDN w:val="0"/>
+        <w:adjustRightInd w:val="0"/>
+        <w:spacing w:after="0" w:line="240" w:lineRule="auto"/>
+        <w:rPr>
+          <w:rFonts w:ascii="Cascadia Mono" w:hAnsi="Cascadia Mono" w:cs="Cascadia Mono"/>
+          <w:color w:val="000000"/>
+          <w:kern w:val="0"/>
+          <w:sz w:val="19"/>
+          <w:szCs w:val="19"/>
+          <w:highlight w:val="white"/>
+        </w:rPr>
+      </w:pPr>
+      <w:r>
+        <w:rPr>
+          <w:rFonts w:ascii="Cascadia Mono" w:hAnsi="Cascadia Mono" w:cs="Cascadia Mono"/>
+          <w:color w:val="000000"/>
+          <w:kern w:val="0"/>
+          <w:sz w:val="19"/>
+          <w:szCs w:val="19"/>
+          <w:highlight w:val="white"/>
+        </w:rPr>
+        <w:t>Data Standardization &amp; Consistency</w:t>
+      </w:r>
+    </w:p>
+    <w:p>
+      <w:pPr>
+        <w:autoSpaceDE w:val="0"/>
+        <w:autoSpaceDN w:val="0"/>
+        <w:adjustRightInd w:val="0"/>
+        <w:spacing w:after="0" w:line="240" w:lineRule="auto"/>
+        <w:rPr>
+          <w:rFonts w:ascii="Cascadia Mono" w:hAnsi="Cascadia Mono" w:cs="Cascadia Mono"/>
+          <w:color w:val="000000"/>
+          <w:kern w:val="0"/>
+          <w:sz w:val="19"/>
+          <w:szCs w:val="19"/>
+          <w:highlight w:val="white"/>
+        </w:rPr>
+      </w:pPr>
+    </w:p>
+    <w:p>
+      <w:pPr>
+        <w:autoSpaceDE w:val="0"/>
+        <w:autoSpaceDN w:val="0"/>
+        <w:adjustRightInd w:val="0"/>
+        <w:spacing w:after="0" w:line="240" w:lineRule="auto"/>
+        <w:rPr>
+          <w:rFonts w:ascii="Cascadia Mono" w:hAnsi="Cascadia Mono" w:cs="Cascadia Mono"/>
+          <w:color w:val="000000"/>
+          <w:kern w:val="0"/>
+          <w:sz w:val="19"/>
+          <w:szCs w:val="19"/>
+          <w:highlight w:val="white"/>
+        </w:rPr>
+      </w:pPr>
+      <w:r>
+        <w:rPr>
+          <w:rFonts w:ascii="Cascadia Mono" w:hAnsi="Cascadia Mono" w:cs="Cascadia Mono"/>
+          <w:color w:val="000000"/>
+          <w:kern w:val="0"/>
+          <w:sz w:val="19"/>
+          <w:szCs w:val="19"/>
+          <w:highlight w:val="white"/>
+        </w:rPr>
+        <w:t>(11 rows affected)</w:t>
+      </w:r>
+    </w:p>
+    <w:p>
+      <w:pPr>
+        <w:autoSpaceDE w:val="0"/>
+        <w:autoSpaceDN w:val="0"/>
+        <w:adjustRightInd w:val="0"/>
+        <w:spacing w:after="0" w:line="240" w:lineRule="auto"/>
+        <w:rPr>
+          <w:rFonts w:ascii="Cascadia Mono" w:hAnsi="Cascadia Mono" w:cs="Cascadia Mono"/>
+          <w:color w:val="000000"/>
+          <w:kern w:val="0"/>
+          <w:sz w:val="19"/>
+          <w:szCs w:val="19"/>
+          <w:highlight w:val="white"/>
+        </w:rPr>
+      </w:pPr>
+      <w:r>
+        <w:rPr>
+          <w:rFonts w:ascii="Cascadia Mono" w:hAnsi="Cascadia Mono" w:cs="Cascadia Mono"/>
+          <w:color w:val="000000"/>
+          <w:kern w:val="0"/>
+          <w:sz w:val="19"/>
+          <w:szCs w:val="19"/>
+          <w:highlight w:val="white"/>
+        </w:rPr>
+        <w:t>====================================================================</w:t>
+      </w:r>
+    </w:p>
+    <w:p>
+      <w:pPr>
+        <w:autoSpaceDE w:val="0"/>
+        <w:autoSpaceDN w:val="0"/>
+        <w:adjustRightInd w:val="0"/>
+        <w:spacing w:after="0" w:line="240" w:lineRule="auto"/>
+        <w:rPr>
+          <w:rFonts w:ascii="Cascadia Mono" w:hAnsi="Cascadia Mono" w:cs="Cascadia Mono"/>
+          <w:color w:val="000000"/>
+          <w:kern w:val="0"/>
+          <w:sz w:val="19"/>
+          <w:szCs w:val="19"/>
+          <w:highlight w:val="white"/>
+        </w:rPr>
+      </w:pPr>
+      <w:r>
+        <w:rPr>
+          <w:rFonts w:ascii="Cascadia Mono" w:hAnsi="Cascadia Mono" w:cs="Cascadia Mono"/>
+          <w:color w:val="000000"/>
+          <w:kern w:val="0"/>
+          <w:sz w:val="19"/>
+          <w:szCs w:val="19"/>
+          <w:highlight w:val="white"/>
+        </w:rPr>
+        <w:t>Checking bronze.erpPxCatG1v2</w:t>
+      </w:r>
+    </w:p>
+    <w:p>
+      <w:pPr>
+        <w:autoSpaceDE w:val="0"/>
+        <w:autoSpaceDN w:val="0"/>
+        <w:adjustRightInd w:val="0"/>
+        <w:spacing w:after="0" w:line="240" w:lineRule="auto"/>
+        <w:rPr>
+          <w:rFonts w:ascii="Cascadia Mono" w:hAnsi="Cascadia Mono" w:cs="Cascadia Mono"/>
+          <w:color w:val="000000"/>
+          <w:kern w:val="0"/>
+          <w:sz w:val="19"/>
+          <w:szCs w:val="19"/>
+          <w:highlight w:val="white"/>
+        </w:rPr>
+      </w:pPr>
+      <w:r>
+        <w:rPr>
+          <w:rFonts w:ascii="Cascadia Mono" w:hAnsi="Cascadia Mono" w:cs="Cascadia Mono"/>
+          <w:color w:val="000000"/>
+          <w:kern w:val="0"/>
+          <w:sz w:val="19"/>
+          <w:szCs w:val="19"/>
+          <w:highlight w:val="white"/>
+        </w:rPr>
+        <w:t>====================================================================</w:t>
+      </w:r>
+    </w:p>
+    <w:p>
+      <w:pPr>
+        <w:autoSpaceDE w:val="0"/>
+        <w:autoSpaceDN w:val="0"/>
+        <w:adjustRightInd w:val="0"/>
+        <w:spacing w:after="0" w:line="240" w:lineRule="auto"/>
+        <w:rPr>
+          <w:rFonts w:ascii="Cascadia Mono" w:hAnsi="Cascadia Mono" w:cs="Cascadia Mono"/>
+          <w:color w:val="000000"/>
+          <w:kern w:val="0"/>
+          <w:sz w:val="19"/>
+          <w:szCs w:val="19"/>
+          <w:highlight w:val="white"/>
+        </w:rPr>
+      </w:pPr>
+      <w:r>
+        <w:rPr>
+          <w:rFonts w:ascii="Cascadia Mono" w:hAnsi="Cascadia Mono" w:cs="Cascadia Mono"/>
+          <w:color w:val="000000"/>
+          <w:kern w:val="0"/>
+          <w:sz w:val="19"/>
+          <w:szCs w:val="19"/>
+          <w:highlight w:val="white"/>
+        </w:rPr>
+        <w:t>Check for Unwanted Spaces</w:t>
+      </w:r>
+    </w:p>
+    <w:p>
+      <w:pPr>
+        <w:autoSpaceDE w:val="0"/>
+        <w:autoSpaceDN w:val="0"/>
+        <w:adjustRightInd w:val="0"/>
+        <w:spacing w:after="0" w:line="240" w:lineRule="auto"/>
+        <w:rPr>
+          <w:rFonts w:ascii="Cascadia Mono" w:hAnsi="Cascadia Mono" w:cs="Cascadia Mono"/>
+          <w:color w:val="000000"/>
+          <w:kern w:val="0"/>
+          <w:sz w:val="19"/>
+          <w:szCs w:val="19"/>
+          <w:highlight w:val="white"/>
+        </w:rPr>
+      </w:pPr>
+    </w:p>
+    <w:p>
+      <w:pPr>
+        <w:autoSpaceDE w:val="0"/>
+        <w:autoSpaceDN w:val="0"/>
+        <w:adjustRightInd w:val="0"/>
+        <w:spacing w:after="0" w:line="240" w:lineRule="auto"/>
+        <w:rPr>
+          <w:rFonts w:ascii="Cascadia Mono" w:hAnsi="Cascadia Mono" w:cs="Cascadia Mono"/>
+          <w:color w:val="000000"/>
+          <w:kern w:val="0"/>
+          <w:sz w:val="19"/>
+          <w:szCs w:val="19"/>
+          <w:highlight w:val="white"/>
+        </w:rPr>
+      </w:pPr>
+      <w:r>
+        <w:rPr>
+          <w:rFonts w:ascii="Cascadia Mono" w:hAnsi="Cascadia Mono" w:cs="Cascadia Mono"/>
+          <w:color w:val="000000"/>
+          <w:kern w:val="0"/>
+          <w:sz w:val="19"/>
+          <w:szCs w:val="19"/>
+          <w:highlight w:val="white"/>
+        </w:rPr>
+        <w:t>(0 rows affected)</w:t>
+      </w:r>
+    </w:p>
+    <w:p>
+      <w:pPr>
+        <w:autoSpaceDE w:val="0"/>
+        <w:autoSpaceDN w:val="0"/>
+        <w:adjustRightInd w:val="0"/>
+        <w:spacing w:after="0" w:line="240" w:lineRule="auto"/>
+        <w:rPr>
+          <w:rFonts w:ascii="Cascadia Mono" w:hAnsi="Cascadia Mono" w:cs="Cascadia Mono"/>
+          <w:color w:val="000000"/>
+          <w:kern w:val="0"/>
+          <w:sz w:val="19"/>
+          <w:szCs w:val="19"/>
+          <w:highlight w:val="white"/>
+        </w:rPr>
+      </w:pPr>
+      <w:r>
+        <w:rPr>
+          <w:rFonts w:ascii="Cascadia Mono" w:hAnsi="Cascadia Mono" w:cs="Cascadia Mono"/>
+          <w:color w:val="000000"/>
+          <w:kern w:val="0"/>
+          <w:sz w:val="19"/>
+          <w:szCs w:val="19"/>
+          <w:highlight w:val="white"/>
+        </w:rPr>
+        <w:t>Data Standardization &amp; Consistency</w:t>
+      </w:r>
+    </w:p>
+    <w:p>
+      <w:pPr>
+        <w:autoSpaceDE w:val="0"/>
+        <w:autoSpaceDN w:val="0"/>
+        <w:adjustRightInd w:val="0"/>
+        <w:spacing w:after="0" w:line="240" w:lineRule="auto"/>
+        <w:rPr>
+          <w:rFonts w:ascii="Cascadia Mono" w:hAnsi="Cascadia Mono" w:cs="Cascadia Mono"/>
+          <w:color w:val="000000"/>
+          <w:kern w:val="0"/>
+          <w:sz w:val="19"/>
+          <w:szCs w:val="19"/>
+          <w:highlight w:val="white"/>
+        </w:rPr>
+      </w:pPr>
+    </w:p>
+    <w:p>
+      <w:pPr>
+        <w:autoSpaceDE w:val="0"/>
+        <w:autoSpaceDN w:val="0"/>
+        <w:adjustRightInd w:val="0"/>
+        <w:spacing w:after="0" w:line="240" w:lineRule="auto"/>
+        <w:rPr>
+          <w:rFonts w:ascii="Cascadia Mono" w:hAnsi="Cascadia Mono" w:cs="Cascadia Mono"/>
+          <w:color w:val="000000"/>
+          <w:kern w:val="0"/>
+          <w:sz w:val="19"/>
+          <w:szCs w:val="19"/>
+          <w:highlight w:val="white"/>
+        </w:rPr>
+      </w:pPr>
+      <w:r>
+        <w:rPr>
+          <w:rFonts w:ascii="Cascadia Mono" w:hAnsi="Cascadia Mono" w:cs="Cascadia Mono"/>
+          <w:color w:val="000000"/>
+          <w:kern w:val="0"/>
+          <w:sz w:val="19"/>
+          <w:szCs w:val="19"/>
+          <w:highlight w:val="white"/>
+        </w:rPr>
+        <w:t>(2 rows affected)</w:t>
+      </w:r>
+    </w:p>
+    <w:p>
+      <w:pPr>
+        <w:autoSpaceDE w:val="0"/>
+        <w:autoSpaceDN w:val="0"/>
+        <w:adjustRightInd w:val="0"/>
+        <w:spacing w:after="0" w:line="240" w:lineRule="auto"/>
+        <w:rPr>
+          <w:rFonts w:ascii="Cascadia Mono" w:hAnsi="Cascadia Mono" w:cs="Cascadia Mono"/>
+          <w:color w:val="000000"/>
+          <w:kern w:val="0"/>
+          <w:sz w:val="19"/>
+          <w:szCs w:val="19"/>
+          <w:highlight w:val="white"/>
+        </w:rPr>
+      </w:pPr>
+    </w:p>
+    <w:p>
+      <w:pPr>
+        <w:spacing w:line="360" w:lineRule="auto"/>
+        <w:jc w:val="both"/>
+        <w:rPr>
+          <w:rFonts w:ascii="Cascadia Mono" w:hAnsi="Cascadia Mono" w:cs="Cascadia Mono"/>
+          <w:color w:val="000000"/>
+          <w:kern w:val="0"/>
+          <w:sz w:val="19"/>
+          <w:szCs w:val="19"/>
+        </w:rPr>
+      </w:pPr>
+      <w:r>
+        <w:rPr>
+          <w:rFonts w:ascii="Cascadia Mono" w:hAnsi="Cascadia Mono" w:cs="Cascadia Mono"/>
+          <w:color w:val="000000"/>
+          <w:kern w:val="0"/>
+          <w:sz w:val="19"/>
+          <w:szCs w:val="19"/>
+          <w:highlight w:val="white"/>
+        </w:rPr>
+        <w:t>Completion time: 2026-05-08T15:32:08.1387127+02:00</w:t>
+      </w:r>
+    </w:p>
+    <w:p>
+      <w:pPr>
+        <w:spacing w:line="360" w:lineRule="auto"/>
+        <w:jc w:val="both"/>
+        <w:rPr>
+          <w:rFonts w:ascii="Times New Roman" w:hAnsi="Times New Roman" w:cs="Times New Roman"/>
+          <w:sz w:val="30"/>
+          <w:szCs w:val="30"/>
+          <w:lang w:val="en-GB"/>
+        </w:rPr>
+      </w:pPr>
+      <w:r>
+        <w:rPr>
+          <w:rFonts w:ascii="Times New Roman" w:hAnsi="Times New Roman" w:cs="Times New Roman"/>
+          <w:sz w:val="30"/>
+          <w:szCs w:val="30"/>
+          <w:lang w:val="en-GB"/>
+        </w:rPr>
+        <w:lastRenderedPageBreak/>
+        <w:t>The report forms the bases of our transformations, normalisations and data cleaning</w:t>
+      </w:r>
+      <w:r>
+        <w:rPr>
+          <w:rFonts w:ascii="Times New Roman" w:hAnsi="Times New Roman" w:cs="Times New Roman"/>
+          <w:sz w:val="30"/>
+          <w:szCs w:val="30"/>
+          <w:lang w:val="en-GB"/>
+        </w:rPr>
+        <w:t xml:space="preserve"> to transfer data to Silver Layer.</w:t>
+      </w:r>
+    </w:p>
+    <w:p>
+      <w:pPr>
+        <w:spacing w:line="360" w:lineRule="auto"/>
+        <w:jc w:val="both"/>
+        <w:rPr>
+          <w:rFonts w:ascii="Times New Roman" w:hAnsi="Times New Roman" w:cs="Times New Roman"/>
+          <w:b/>
+          <w:sz w:val="30"/>
+          <w:szCs w:val="30"/>
+          <w:lang w:val="en-GB"/>
+        </w:rPr>
+      </w:pPr>
+      <w:r>
+        <w:rPr>
+          <w:rFonts w:ascii="Times New Roman" w:hAnsi="Times New Roman" w:cs="Times New Roman"/>
+          <w:b/>
+          <w:sz w:val="30"/>
+          <w:szCs w:val="30"/>
+          <w:lang w:val="en-GB"/>
+        </w:rPr>
+        <w:t>Task 2. Silver Layer</w:t>
+      </w:r>
+    </w:p>
+    <w:p>
+      <w:pPr>
+        <w:spacing w:line="360" w:lineRule="auto"/>
+        <w:jc w:val="both"/>
+        <w:rPr>
+          <w:rFonts w:ascii="Times New Roman" w:hAnsi="Times New Roman" w:cs="Times New Roman"/>
+          <w:b/>
+          <w:sz w:val="30"/>
+          <w:szCs w:val="30"/>
+          <w:lang w:val="en-GB"/>
+        </w:rPr>
+      </w:pPr>
+      <w:r>
+        <w:rPr>
+          <w:rFonts w:ascii="Times New Roman" w:hAnsi="Times New Roman" w:cs="Times New Roman"/>
+          <w:b/>
+          <w:sz w:val="30"/>
+          <w:szCs w:val="30"/>
+          <w:lang w:val="en-GB"/>
+        </w:rPr>
+        <w:t>Integration Model</w:t>
+      </w:r>
+    </w:p>
+    <w:p>
+      <w:pPr>
+        <w:spacing w:line="360" w:lineRule="auto"/>
+        <w:jc w:val="both"/>
+        <w:rPr>
+          <w:rFonts w:ascii="Times New Roman" w:hAnsi="Times New Roman" w:cs="Times New Roman"/>
+          <w:b/>
+          <w:sz w:val="30"/>
+          <w:szCs w:val="30"/>
+          <w:lang w:val="en-GB"/>
+        </w:rPr>
+      </w:pPr>
+      <w:r>
+        <w:rPr>
+          <w:rFonts w:ascii="Times New Roman" w:hAnsi="Times New Roman" w:cs="Times New Roman"/>
+          <w:b/>
+          <w:noProof/>
+          <w:sz w:val="30"/>
+          <w:szCs w:val="30"/>
+          <w:lang w:eastAsia="en-ZW"/>
+        </w:rPr>
+        <w:drawing>
+          <wp:inline distT="0" distB="0" distL="0" distR="0">
+            <wp:extent cx="5731510" cy="3804285"/>
+            <wp:effectExtent l="0" t="0" r="2540" b="5715"/>
+            <wp:docPr id="4" name="Picture 4"/>
+            <wp:cNvGraphicFramePr>
+              <a:graphicFrameLocks xmlns:a="http://schemas.openxmlformats.org/drawingml/2006/main" noChangeAspect="1"/>
+            </wp:cNvGraphicFramePr>
+            <a:graphic xmlns:a="http://schemas.openxmlformats.org/drawingml/2006/main">
+              <a:graphicData uri="http://schemas.openxmlformats.org/drawingml/2006/picture">
+                <pic:pic xmlns:pic="http://schemas.openxmlformats.org/drawingml/2006/picture">
+                  <pic:nvPicPr>
+                    <pic:cNvPr id="4" name="intergrationModel.drawio.png"/>
+                    <pic:cNvPicPr/>
+                  </pic:nvPicPr>
+                  <pic:blipFill>
+                    <a:blip r:embed="rId12">
+                      <a:extLst>
+                        <a:ext uri="{28A0092B-C50C-407E-A947-70E740481C1C}">
+                          <a14:useLocalDpi xmlns:a14="http://schemas.microsoft.com/office/drawing/2010/main" val="0"/>
+                        </a:ext>
+                      </a:extLst>
+                    </a:blip>
+                    <a:stretch>
+                      <a:fillRect/>
+                    </a:stretch>
+                  </pic:blipFill>
+                  <pic:spPr>
+                    <a:xfrm>
+                      <a:off x="0" y="0"/>
+                      <a:ext cx="5731510" cy="3804285"/>
+                    </a:xfrm>
+                    <a:prstGeom prst="rect">
+                      <a:avLst/>
+                    </a:prstGeom>
+                  </pic:spPr>
+                </pic:pic>
+              </a:graphicData>
+            </a:graphic>
+          </wp:inline>
+        </w:drawing>
+      </w:r>
+    </w:p>
+    <w:p>
+      <w:pPr>
+        <w:spacing w:line="360" w:lineRule="auto"/>
+        <w:jc w:val="both"/>
+        <w:rPr>
+          <w:rFonts w:ascii="Times New Roman" w:hAnsi="Times New Roman" w:cs="Times New Roman"/>
+          <w:b/>
+          <w:sz w:val="30"/>
+          <w:szCs w:val="30"/>
+          <w:lang w:val="en-GB"/>
+        </w:rPr>
+      </w:pPr>
+      <w:r>
+        <w:rPr>
+          <w:rFonts w:ascii="Times New Roman" w:hAnsi="Times New Roman" w:cs="Times New Roman"/>
+          <w:b/>
+          <w:sz w:val="30"/>
+          <w:szCs w:val="30"/>
+          <w:lang w:val="en-GB"/>
+        </w:rPr>
+        <w:t>Silver Layer Data Flow Diagram</w:t>
+      </w:r>
+    </w:p>
+    <w:p>
+      <w:pPr>
+        <w:spacing w:line="360" w:lineRule="auto"/>
+        <w:jc w:val="both"/>
+        <w:rPr>
+          <w:rFonts w:ascii="Times New Roman" w:hAnsi="Times New Roman" w:cs="Times New Roman"/>
+          <w:b/>
+          <w:sz w:val="30"/>
+          <w:szCs w:val="30"/>
+          <w:lang w:val="en-GB"/>
+        </w:rPr>
+      </w:pPr>
+      <w:r>
+        <w:rPr>
+          <w:rFonts w:ascii="Times New Roman" w:hAnsi="Times New Roman" w:cs="Times New Roman"/>
+          <w:b/>
+          <w:noProof/>
+          <w:sz w:val="30"/>
+          <w:szCs w:val="30"/>
+          <w:lang w:eastAsia="en-ZW"/>
+        </w:rPr>
+        <w:lastRenderedPageBreak/>
+        <w:drawing>
+          <wp:inline distT="0" distB="0" distL="0" distR="0">
+            <wp:extent cx="5731510" cy="4410710"/>
+            <wp:effectExtent l="0" t="0" r="2540" b="8890"/>
+            <wp:docPr id="7" name="Picture 7"/>
+            <wp:cNvGraphicFramePr>
+              <a:graphicFrameLocks xmlns:a="http://schemas.openxmlformats.org/drawingml/2006/main" noChangeAspect="1"/>
+            </wp:cNvGraphicFramePr>
+            <a:graphic xmlns:a="http://schemas.openxmlformats.org/drawingml/2006/main">
+              <a:graphicData uri="http://schemas.openxmlformats.org/drawingml/2006/picture">
+                <pic:pic xmlns:pic="http://schemas.openxmlformats.org/drawingml/2006/picture">
+                  <pic:nvPicPr>
+                    <pic:cNvPr id="7" name="silverDataFlowDiagram.drawio.png"/>
+                    <pic:cNvPicPr/>
+                  </pic:nvPicPr>
+                  <pic:blipFill>
+                    <a:blip r:embed="rId13">
+                      <a:extLst>
+                        <a:ext uri="{28A0092B-C50C-407E-A947-70E740481C1C}">
+                          <a14:useLocalDpi xmlns:a14="http://schemas.microsoft.com/office/drawing/2010/main" val="0"/>
+                        </a:ext>
+                      </a:extLst>
+                    </a:blip>
+                    <a:stretch>
+                      <a:fillRect/>
+                    </a:stretch>
+                  </pic:blipFill>
+                  <pic:spPr>
+                    <a:xfrm>
+                      <a:off x="0" y="0"/>
+                      <a:ext cx="5731510" cy="4410710"/>
+                    </a:xfrm>
+                    <a:prstGeom prst="rect">
+                      <a:avLst/>
+                    </a:prstGeom>
+                  </pic:spPr>
+                </pic:pic>
+              </a:graphicData>
+            </a:graphic>
+          </wp:inline>
+        </w:drawing>
+      </w:r>
+    </w:p>
+    <w:p>
+      <w:pPr>
+        <w:spacing w:line="360" w:lineRule="auto"/>
+        <w:jc w:val="both"/>
+        <w:rPr>
+          <w:rFonts w:ascii="Times New Roman" w:hAnsi="Times New Roman" w:cs="Times New Roman"/>
+          <w:b/>
+          <w:sz w:val="30"/>
+          <w:szCs w:val="30"/>
+          <w:lang w:val="en-GB"/>
+        </w:rPr>
+      </w:pPr>
+      <w:r>
+        <w:rPr>
+          <w:rFonts w:ascii="Times New Roman" w:hAnsi="Times New Roman" w:cs="Times New Roman"/>
+          <w:b/>
+          <w:sz w:val="30"/>
+          <w:szCs w:val="30"/>
+          <w:lang w:val="en-GB"/>
+        </w:rPr>
+        <w:t>Data Quality Checks</w:t>
+      </w:r>
+    </w:p>
+    <w:p>
+      <w:pPr>
+        <w:pStyle w:val="ListParagraph"/>
+        <w:numPr>
+          <w:ilvl w:val="0"/>
+          <w:numId w:val="40"/>
+        </w:numPr>
+        <w:spacing w:line="360" w:lineRule="auto"/>
+        <w:jc w:val="both"/>
+        <w:rPr>
+          <w:rFonts w:ascii="Times New Roman" w:hAnsi="Times New Roman" w:cs="Times New Roman"/>
+          <w:sz w:val="30"/>
+          <w:szCs w:val="30"/>
+          <w:lang w:val="en-GB"/>
+        </w:rPr>
+      </w:pPr>
+      <w:r>
+        <w:rPr>
+          <w:rFonts w:ascii="Times New Roman" w:hAnsi="Times New Roman" w:cs="Times New Roman"/>
+          <w:sz w:val="30"/>
+          <w:szCs w:val="30"/>
+          <w:lang w:val="en-GB"/>
+        </w:rPr>
+        <w:t>Scrip</w:t>
+      </w:r>
+      <w:r>
+        <w:rPr>
+          <w:rFonts w:ascii="Times New Roman" w:hAnsi="Times New Roman" w:cs="Times New Roman"/>
+          <w:sz w:val="30"/>
+          <w:szCs w:val="30"/>
+          <w:lang w:val="en-GB"/>
+        </w:rPr>
+        <w:t>t</w:t>
+      </w:r>
+      <w:r>
+        <w:rPr>
+          <w:rFonts w:ascii="Times New Roman" w:hAnsi="Times New Roman" w:cs="Times New Roman"/>
+          <w:sz w:val="30"/>
+          <w:szCs w:val="30"/>
+          <w:lang w:val="en-GB"/>
+        </w:rPr>
+        <w:t xml:space="preserve">s found under the tests folder </w:t>
+      </w:r>
+      <w:r>
+        <w:rPr>
+          <w:rFonts w:ascii="Times New Roman" w:hAnsi="Times New Roman" w:cs="Times New Roman"/>
+          <w:sz w:val="30"/>
+          <w:szCs w:val="30"/>
+          <w:lang w:val="en-GB"/>
+        </w:rPr>
+        <w:t>“checksBronze.sql”</w:t>
+      </w:r>
+    </w:p>
+    <w:p>
+      <w:pPr>
+        <w:autoSpaceDE w:val="0"/>
+        <w:autoSpaceDN w:val="0"/>
+        <w:adjustRightInd w:val="0"/>
+        <w:spacing w:after="0" w:line="240" w:lineRule="auto"/>
+        <w:rPr>
+          <w:rFonts w:ascii="Cascadia Mono" w:hAnsi="Cascadia Mono" w:cs="Cascadia Mono"/>
+          <w:color w:val="000000"/>
+          <w:kern w:val="0"/>
+          <w:sz w:val="19"/>
+          <w:szCs w:val="19"/>
+          <w:highlight w:val="white"/>
+        </w:rPr>
+      </w:pPr>
+    </w:p>
+    <w:p>
+      <w:pPr>
+        <w:autoSpaceDE w:val="0"/>
+        <w:autoSpaceDN w:val="0"/>
+        <w:adjustRightInd w:val="0"/>
+        <w:spacing w:after="0" w:line="240" w:lineRule="auto"/>
+        <w:rPr>
+          <w:rFonts w:ascii="Cascadia Mono" w:hAnsi="Cascadia Mono" w:cs="Cascadia Mono"/>
+          <w:color w:val="000000"/>
+          <w:kern w:val="0"/>
+          <w:sz w:val="19"/>
+          <w:szCs w:val="19"/>
+          <w:highlight w:val="white"/>
+        </w:rPr>
+      </w:pPr>
+      <w:r>
+        <w:rPr>
+          <w:rFonts w:ascii="Cascadia Mono" w:hAnsi="Cascadia Mono" w:cs="Cascadia Mono"/>
+          <w:color w:val="000000"/>
+          <w:kern w:val="0"/>
+          <w:sz w:val="19"/>
+          <w:szCs w:val="19"/>
+          <w:highlight w:val="white"/>
+        </w:rPr>
+        <w:t>====================================================================</w:t>
+      </w:r>
+    </w:p>
+    <w:p>
+      <w:pPr>
+        <w:autoSpaceDE w:val="0"/>
+        <w:autoSpaceDN w:val="0"/>
+        <w:adjustRightInd w:val="0"/>
+        <w:spacing w:after="0" w:line="240" w:lineRule="auto"/>
+        <w:rPr>
+          <w:rFonts w:ascii="Cascadia Mono" w:hAnsi="Cascadia Mono" w:cs="Cascadia Mono"/>
+          <w:color w:val="000000"/>
+          <w:kern w:val="0"/>
+          <w:sz w:val="19"/>
+          <w:szCs w:val="19"/>
+          <w:highlight w:val="white"/>
+        </w:rPr>
+      </w:pPr>
+      <w:r>
+        <w:rPr>
+          <w:rFonts w:ascii="Cascadia Mono" w:hAnsi="Cascadia Mono" w:cs="Cascadia Mono"/>
+          <w:color w:val="000000"/>
+          <w:kern w:val="0"/>
+          <w:sz w:val="19"/>
+          <w:szCs w:val="19"/>
+          <w:highlight w:val="white"/>
+        </w:rPr>
+        <w:t>Checking silver.crmCustInfo</w:t>
+      </w:r>
+    </w:p>
+    <w:p>
+      <w:pPr>
+        <w:autoSpaceDE w:val="0"/>
+        <w:autoSpaceDN w:val="0"/>
+        <w:adjustRightInd w:val="0"/>
+        <w:spacing w:after="0" w:line="240" w:lineRule="auto"/>
+        <w:rPr>
+          <w:rFonts w:ascii="Cascadia Mono" w:hAnsi="Cascadia Mono" w:cs="Cascadia Mono"/>
+          <w:color w:val="000000"/>
+          <w:kern w:val="0"/>
+          <w:sz w:val="19"/>
+          <w:szCs w:val="19"/>
+          <w:highlight w:val="white"/>
+        </w:rPr>
+      </w:pPr>
+      <w:r>
+        <w:rPr>
+          <w:rFonts w:ascii="Cascadia Mono" w:hAnsi="Cascadia Mono" w:cs="Cascadia Mono"/>
+          <w:color w:val="000000"/>
+          <w:kern w:val="0"/>
+          <w:sz w:val="19"/>
+          <w:szCs w:val="19"/>
+          <w:highlight w:val="white"/>
+        </w:rPr>
+        <w:t>====================================================================</w:t>
+      </w:r>
+    </w:p>
+    <w:p>
+      <w:pPr>
+        <w:autoSpaceDE w:val="0"/>
+        <w:autoSpaceDN w:val="0"/>
+        <w:adjustRightInd w:val="0"/>
+        <w:spacing w:after="0" w:line="240" w:lineRule="auto"/>
+        <w:rPr>
+          <w:rFonts w:ascii="Cascadia Mono" w:hAnsi="Cascadia Mono" w:cs="Cascadia Mono"/>
+          <w:color w:val="000000"/>
+          <w:kern w:val="0"/>
+          <w:sz w:val="19"/>
+          <w:szCs w:val="19"/>
+          <w:highlight w:val="white"/>
+        </w:rPr>
+      </w:pPr>
+      <w:r>
+        <w:rPr>
+          <w:rFonts w:ascii="Cascadia Mono" w:hAnsi="Cascadia Mono" w:cs="Cascadia Mono"/>
+          <w:color w:val="000000"/>
+          <w:kern w:val="0"/>
+          <w:sz w:val="19"/>
+          <w:szCs w:val="19"/>
+          <w:highlight w:val="white"/>
+        </w:rPr>
+        <w:t>Check for NULLs or Duplicates in Primary Key</w:t>
+      </w:r>
+    </w:p>
+    <w:p>
+      <w:pPr>
+        <w:autoSpaceDE w:val="0"/>
+        <w:autoSpaceDN w:val="0"/>
+        <w:adjustRightInd w:val="0"/>
+        <w:spacing w:after="0" w:line="240" w:lineRule="auto"/>
+        <w:rPr>
+          <w:rFonts w:ascii="Cascadia Mono" w:hAnsi="Cascadia Mono" w:cs="Cascadia Mono"/>
+          <w:color w:val="000000"/>
+          <w:kern w:val="0"/>
+          <w:sz w:val="19"/>
+          <w:szCs w:val="19"/>
+          <w:highlight w:val="white"/>
+        </w:rPr>
+      </w:pPr>
+    </w:p>
+    <w:p>
+      <w:pPr>
+        <w:autoSpaceDE w:val="0"/>
+        <w:autoSpaceDN w:val="0"/>
+        <w:adjustRightInd w:val="0"/>
+        <w:spacing w:after="0" w:line="240" w:lineRule="auto"/>
+        <w:rPr>
+          <w:rFonts w:ascii="Cascadia Mono" w:hAnsi="Cascadia Mono" w:cs="Cascadia Mono"/>
+          <w:color w:val="000000"/>
+          <w:kern w:val="0"/>
+          <w:sz w:val="19"/>
+          <w:szCs w:val="19"/>
+          <w:highlight w:val="white"/>
+        </w:rPr>
+      </w:pPr>
+      <w:r>
+        <w:rPr>
+          <w:rFonts w:ascii="Cascadia Mono" w:hAnsi="Cascadia Mono" w:cs="Cascadia Mono"/>
+          <w:color w:val="000000"/>
+          <w:kern w:val="0"/>
+          <w:sz w:val="19"/>
+          <w:szCs w:val="19"/>
+          <w:highlight w:val="white"/>
+        </w:rPr>
+        <w:t>(0 rows affected)</w:t>
+      </w:r>
+    </w:p>
+    <w:p>
+      <w:pPr>
+        <w:autoSpaceDE w:val="0"/>
+        <w:autoSpaceDN w:val="0"/>
+        <w:adjustRightInd w:val="0"/>
+        <w:spacing w:after="0" w:line="240" w:lineRule="auto"/>
+        <w:rPr>
+          <w:rFonts w:ascii="Cascadia Mono" w:hAnsi="Cascadia Mono" w:cs="Cascadia Mono"/>
+          <w:color w:val="000000"/>
+          <w:kern w:val="0"/>
+          <w:sz w:val="19"/>
+          <w:szCs w:val="19"/>
+          <w:highlight w:val="white"/>
+        </w:rPr>
+      </w:pPr>
+      <w:r>
+        <w:rPr>
+          <w:rFonts w:ascii="Cascadia Mono" w:hAnsi="Cascadia Mono" w:cs="Cascadia Mono"/>
+          <w:color w:val="000000"/>
+          <w:kern w:val="0"/>
+          <w:sz w:val="19"/>
+          <w:szCs w:val="19"/>
+          <w:highlight w:val="white"/>
+        </w:rPr>
+        <w:t>Check for Unwanted Spaces</w:t>
+      </w:r>
+    </w:p>
+    <w:p>
+      <w:pPr>
+        <w:autoSpaceDE w:val="0"/>
+        <w:autoSpaceDN w:val="0"/>
+        <w:adjustRightInd w:val="0"/>
+        <w:spacing w:after="0" w:line="240" w:lineRule="auto"/>
+        <w:rPr>
+          <w:rFonts w:ascii="Cascadia Mono" w:hAnsi="Cascadia Mono" w:cs="Cascadia Mono"/>
+          <w:color w:val="000000"/>
+          <w:kern w:val="0"/>
+          <w:sz w:val="19"/>
+          <w:szCs w:val="19"/>
+          <w:highlight w:val="white"/>
+        </w:rPr>
+      </w:pPr>
+    </w:p>
+    <w:p>
+      <w:pPr>
+        <w:autoSpaceDE w:val="0"/>
+        <w:autoSpaceDN w:val="0"/>
+        <w:adjustRightInd w:val="0"/>
+        <w:spacing w:after="0" w:line="240" w:lineRule="auto"/>
+        <w:rPr>
+          <w:rFonts w:ascii="Cascadia Mono" w:hAnsi="Cascadia Mono" w:cs="Cascadia Mono"/>
+          <w:color w:val="000000"/>
+          <w:kern w:val="0"/>
+          <w:sz w:val="19"/>
+          <w:szCs w:val="19"/>
+          <w:highlight w:val="white"/>
+        </w:rPr>
+      </w:pPr>
+      <w:r>
+        <w:rPr>
+          <w:rFonts w:ascii="Cascadia Mono" w:hAnsi="Cascadia Mono" w:cs="Cascadia Mono"/>
+          <w:color w:val="000000"/>
+          <w:kern w:val="0"/>
+          <w:sz w:val="19"/>
+          <w:szCs w:val="19"/>
+          <w:highlight w:val="white"/>
+        </w:rPr>
+        <w:t>(0 rows affected)</w:t>
+      </w:r>
+    </w:p>
+    <w:p>
+      <w:pPr>
+        <w:autoSpaceDE w:val="0"/>
+        <w:autoSpaceDN w:val="0"/>
+        <w:adjustRightInd w:val="0"/>
+        <w:spacing w:after="0" w:line="240" w:lineRule="auto"/>
+        <w:rPr>
+          <w:rFonts w:ascii="Cascadia Mono" w:hAnsi="Cascadia Mono" w:cs="Cascadia Mono"/>
+          <w:color w:val="000000"/>
+          <w:kern w:val="0"/>
+          <w:sz w:val="19"/>
+          <w:szCs w:val="19"/>
+          <w:highlight w:val="white"/>
+        </w:rPr>
+      </w:pPr>
+      <w:r>
+        <w:rPr>
+          <w:rFonts w:ascii="Cascadia Mono" w:hAnsi="Cascadia Mono" w:cs="Cascadia Mono"/>
+          <w:color w:val="000000"/>
+          <w:kern w:val="0"/>
+          <w:sz w:val="19"/>
+          <w:szCs w:val="19"/>
+          <w:highlight w:val="white"/>
+        </w:rPr>
+        <w:t>Data Standardization &amp; Consistency</w:t>
+      </w:r>
+    </w:p>
+    <w:p>
+      <w:pPr>
+        <w:autoSpaceDE w:val="0"/>
+        <w:autoSpaceDN w:val="0"/>
+        <w:adjustRightInd w:val="0"/>
+        <w:spacing w:after="0" w:line="240" w:lineRule="auto"/>
+        <w:rPr>
+          <w:rFonts w:ascii="Cascadia Mono" w:hAnsi="Cascadia Mono" w:cs="Cascadia Mono"/>
+          <w:color w:val="000000"/>
+          <w:kern w:val="0"/>
+          <w:sz w:val="19"/>
+          <w:szCs w:val="19"/>
+          <w:highlight w:val="white"/>
+        </w:rPr>
+      </w:pPr>
+    </w:p>
+    <w:p>
+      <w:pPr>
+        <w:autoSpaceDE w:val="0"/>
+        <w:autoSpaceDN w:val="0"/>
+        <w:adjustRightInd w:val="0"/>
+        <w:spacing w:after="0" w:line="240" w:lineRule="auto"/>
+        <w:rPr>
+          <w:rFonts w:ascii="Cascadia Mono" w:hAnsi="Cascadia Mono" w:cs="Cascadia Mono"/>
+          <w:color w:val="000000"/>
+          <w:kern w:val="0"/>
+          <w:sz w:val="19"/>
+          <w:szCs w:val="19"/>
+          <w:highlight w:val="white"/>
+        </w:rPr>
+      </w:pPr>
+      <w:r>
+        <w:rPr>
+          <w:rFonts w:ascii="Cascadia Mono" w:hAnsi="Cascadia Mono" w:cs="Cascadia Mono"/>
+          <w:color w:val="000000"/>
+          <w:kern w:val="0"/>
+          <w:sz w:val="19"/>
+          <w:szCs w:val="19"/>
+          <w:highlight w:val="white"/>
+        </w:rPr>
+        <w:t>(2 rows affected)</w:t>
+      </w:r>
+    </w:p>
+    <w:p>
+      <w:pPr>
+        <w:autoSpaceDE w:val="0"/>
+        <w:autoSpaceDN w:val="0"/>
+        <w:adjustRightInd w:val="0"/>
+        <w:spacing w:after="0" w:line="240" w:lineRule="auto"/>
+        <w:rPr>
+          <w:rFonts w:ascii="Cascadia Mono" w:hAnsi="Cascadia Mono" w:cs="Cascadia Mono"/>
+          <w:color w:val="000000"/>
+          <w:kern w:val="0"/>
+          <w:sz w:val="19"/>
+          <w:szCs w:val="19"/>
+          <w:highlight w:val="white"/>
+        </w:rPr>
+      </w:pPr>
+      <w:r>
+        <w:rPr>
+          <w:rFonts w:ascii="Cascadia Mono" w:hAnsi="Cascadia Mono" w:cs="Cascadia Mono"/>
+          <w:color w:val="000000"/>
+          <w:kern w:val="0"/>
+          <w:sz w:val="19"/>
+          <w:szCs w:val="19"/>
+          <w:highlight w:val="white"/>
+        </w:rPr>
+        <w:t>====================================================================</w:t>
+      </w:r>
+    </w:p>
+    <w:p>
+      <w:pPr>
+        <w:autoSpaceDE w:val="0"/>
+        <w:autoSpaceDN w:val="0"/>
+        <w:adjustRightInd w:val="0"/>
+        <w:spacing w:after="0" w:line="240" w:lineRule="auto"/>
+        <w:rPr>
+          <w:rFonts w:ascii="Cascadia Mono" w:hAnsi="Cascadia Mono" w:cs="Cascadia Mono"/>
+          <w:color w:val="000000"/>
+          <w:kern w:val="0"/>
+          <w:sz w:val="19"/>
+          <w:szCs w:val="19"/>
+          <w:highlight w:val="white"/>
+        </w:rPr>
+      </w:pPr>
+      <w:r>
+        <w:rPr>
+          <w:rFonts w:ascii="Cascadia Mono" w:hAnsi="Cascadia Mono" w:cs="Cascadia Mono"/>
+          <w:color w:val="000000"/>
+          <w:kern w:val="0"/>
+          <w:sz w:val="19"/>
+          <w:szCs w:val="19"/>
+          <w:highlight w:val="white"/>
+        </w:rPr>
+        <w:t>Checking silver.crmPrdInfo</w:t>
+      </w:r>
+    </w:p>
+    <w:p>
+      <w:pPr>
+        <w:autoSpaceDE w:val="0"/>
+        <w:autoSpaceDN w:val="0"/>
+        <w:adjustRightInd w:val="0"/>
+        <w:spacing w:after="0" w:line="240" w:lineRule="auto"/>
+        <w:rPr>
+          <w:rFonts w:ascii="Cascadia Mono" w:hAnsi="Cascadia Mono" w:cs="Cascadia Mono"/>
+          <w:color w:val="000000"/>
+          <w:kern w:val="0"/>
+          <w:sz w:val="19"/>
+          <w:szCs w:val="19"/>
+          <w:highlight w:val="white"/>
+        </w:rPr>
+      </w:pPr>
+      <w:r>
+        <w:rPr>
+          <w:rFonts w:ascii="Cascadia Mono" w:hAnsi="Cascadia Mono" w:cs="Cascadia Mono"/>
+          <w:color w:val="000000"/>
+          <w:kern w:val="0"/>
+          <w:sz w:val="19"/>
+          <w:szCs w:val="19"/>
+          <w:highlight w:val="white"/>
+        </w:rPr>
+        <w:t>====================================================================</w:t>
+      </w:r>
+    </w:p>
+    <w:p>
+      <w:pPr>
+        <w:autoSpaceDE w:val="0"/>
+        <w:autoSpaceDN w:val="0"/>
+        <w:adjustRightInd w:val="0"/>
+        <w:spacing w:after="0" w:line="240" w:lineRule="auto"/>
+        <w:rPr>
+          <w:rFonts w:ascii="Cascadia Mono" w:hAnsi="Cascadia Mono" w:cs="Cascadia Mono"/>
+          <w:color w:val="000000"/>
+          <w:kern w:val="0"/>
+          <w:sz w:val="19"/>
+          <w:szCs w:val="19"/>
+          <w:highlight w:val="white"/>
+        </w:rPr>
+      </w:pPr>
+      <w:r>
+        <w:rPr>
+          <w:rFonts w:ascii="Cascadia Mono" w:hAnsi="Cascadia Mono" w:cs="Cascadia Mono"/>
+          <w:color w:val="000000"/>
+          <w:kern w:val="0"/>
+          <w:sz w:val="19"/>
+          <w:szCs w:val="19"/>
+          <w:highlight w:val="white"/>
+        </w:rPr>
+        <w:t>Check for NULLs or Duplicates in Primary Key</w:t>
+      </w:r>
+    </w:p>
+    <w:p>
+      <w:pPr>
+        <w:autoSpaceDE w:val="0"/>
+        <w:autoSpaceDN w:val="0"/>
+        <w:adjustRightInd w:val="0"/>
+        <w:spacing w:after="0" w:line="240" w:lineRule="auto"/>
+        <w:rPr>
+          <w:rFonts w:ascii="Cascadia Mono" w:hAnsi="Cascadia Mono" w:cs="Cascadia Mono"/>
+          <w:color w:val="000000"/>
+          <w:kern w:val="0"/>
+          <w:sz w:val="19"/>
+          <w:szCs w:val="19"/>
+          <w:highlight w:val="white"/>
+        </w:rPr>
+      </w:pPr>
+    </w:p>
+    <w:p>
+      <w:pPr>
+        <w:autoSpaceDE w:val="0"/>
+        <w:autoSpaceDN w:val="0"/>
+        <w:adjustRightInd w:val="0"/>
+        <w:spacing w:after="0" w:line="240" w:lineRule="auto"/>
+        <w:rPr>
+          <w:rFonts w:ascii="Cascadia Mono" w:hAnsi="Cascadia Mono" w:cs="Cascadia Mono"/>
+          <w:color w:val="000000"/>
+          <w:kern w:val="0"/>
+          <w:sz w:val="19"/>
+          <w:szCs w:val="19"/>
+          <w:highlight w:val="white"/>
+        </w:rPr>
+      </w:pPr>
+      <w:r>
+        <w:rPr>
+          <w:rFonts w:ascii="Cascadia Mono" w:hAnsi="Cascadia Mono" w:cs="Cascadia Mono"/>
+          <w:color w:val="000000"/>
+          <w:kern w:val="0"/>
+          <w:sz w:val="19"/>
+          <w:szCs w:val="19"/>
+          <w:highlight w:val="white"/>
+        </w:rPr>
+        <w:t>(0 rows affected)</w:t>
+      </w:r>
+    </w:p>
+    <w:p>
+      <w:pPr>
+        <w:autoSpaceDE w:val="0"/>
+        <w:autoSpaceDN w:val="0"/>
+        <w:adjustRightInd w:val="0"/>
+        <w:spacing w:after="0" w:line="240" w:lineRule="auto"/>
+        <w:rPr>
+          <w:rFonts w:ascii="Cascadia Mono" w:hAnsi="Cascadia Mono" w:cs="Cascadia Mono"/>
+          <w:color w:val="000000"/>
+          <w:kern w:val="0"/>
+          <w:sz w:val="19"/>
+          <w:szCs w:val="19"/>
+          <w:highlight w:val="white"/>
+        </w:rPr>
+      </w:pPr>
+      <w:r>
+        <w:rPr>
+          <w:rFonts w:ascii="Cascadia Mono" w:hAnsi="Cascadia Mono" w:cs="Cascadia Mono"/>
+          <w:color w:val="000000"/>
+          <w:kern w:val="0"/>
+          <w:sz w:val="19"/>
+          <w:szCs w:val="19"/>
+          <w:highlight w:val="white"/>
+        </w:rPr>
+        <w:t>Check for Unwanted Spaces</w:t>
+      </w:r>
+    </w:p>
+    <w:p>
+      <w:pPr>
+        <w:autoSpaceDE w:val="0"/>
+        <w:autoSpaceDN w:val="0"/>
+        <w:adjustRightInd w:val="0"/>
+        <w:spacing w:after="0" w:line="240" w:lineRule="auto"/>
+        <w:rPr>
+          <w:rFonts w:ascii="Cascadia Mono" w:hAnsi="Cascadia Mono" w:cs="Cascadia Mono"/>
+          <w:color w:val="000000"/>
+          <w:kern w:val="0"/>
+          <w:sz w:val="19"/>
+          <w:szCs w:val="19"/>
+          <w:highlight w:val="white"/>
+        </w:rPr>
+      </w:pPr>
+    </w:p>
+    <w:p>
+      <w:pPr>
+        <w:autoSpaceDE w:val="0"/>
+        <w:autoSpaceDN w:val="0"/>
+        <w:adjustRightInd w:val="0"/>
+        <w:spacing w:after="0" w:line="240" w:lineRule="auto"/>
+        <w:rPr>
+          <w:rFonts w:ascii="Cascadia Mono" w:hAnsi="Cascadia Mono" w:cs="Cascadia Mono"/>
+          <w:color w:val="000000"/>
+          <w:kern w:val="0"/>
+          <w:sz w:val="19"/>
+          <w:szCs w:val="19"/>
+          <w:highlight w:val="white"/>
+        </w:rPr>
+      </w:pPr>
+      <w:r>
+        <w:rPr>
+          <w:rFonts w:ascii="Cascadia Mono" w:hAnsi="Cascadia Mono" w:cs="Cascadia Mono"/>
+          <w:color w:val="000000"/>
+          <w:kern w:val="0"/>
+          <w:sz w:val="19"/>
+          <w:szCs w:val="19"/>
+          <w:highlight w:val="white"/>
+        </w:rPr>
+        <w:t>(0 rows affected)</w:t>
+      </w:r>
+    </w:p>
+    <w:p>
+      <w:pPr>
+        <w:autoSpaceDE w:val="0"/>
+        <w:autoSpaceDN w:val="0"/>
+        <w:adjustRightInd w:val="0"/>
+        <w:spacing w:after="0" w:line="240" w:lineRule="auto"/>
+        <w:rPr>
+          <w:rFonts w:ascii="Cascadia Mono" w:hAnsi="Cascadia Mono" w:cs="Cascadia Mono"/>
+          <w:color w:val="000000"/>
+          <w:kern w:val="0"/>
+          <w:sz w:val="19"/>
+          <w:szCs w:val="19"/>
+          <w:highlight w:val="white"/>
+        </w:rPr>
+      </w:pPr>
+      <w:r>
+        <w:rPr>
+          <w:rFonts w:ascii="Cascadia Mono" w:hAnsi="Cascadia Mono" w:cs="Cascadia Mono"/>
+          <w:color w:val="000000"/>
+          <w:kern w:val="0"/>
+          <w:sz w:val="19"/>
+          <w:szCs w:val="19"/>
+          <w:highlight w:val="white"/>
+        </w:rPr>
+        <w:t>Check for NULLs or Negative Values in Cost</w:t>
+      </w:r>
+    </w:p>
+    <w:p>
+      <w:pPr>
+        <w:autoSpaceDE w:val="0"/>
+        <w:autoSpaceDN w:val="0"/>
+        <w:adjustRightInd w:val="0"/>
+        <w:spacing w:after="0" w:line="240" w:lineRule="auto"/>
+        <w:rPr>
+          <w:rFonts w:ascii="Cascadia Mono" w:hAnsi="Cascadia Mono" w:cs="Cascadia Mono"/>
+          <w:color w:val="000000"/>
+          <w:kern w:val="0"/>
+          <w:sz w:val="19"/>
+          <w:szCs w:val="19"/>
+          <w:highlight w:val="white"/>
+        </w:rPr>
+      </w:pPr>
+    </w:p>
+    <w:p>
+      <w:pPr>
+        <w:autoSpaceDE w:val="0"/>
+        <w:autoSpaceDN w:val="0"/>
+        <w:adjustRightInd w:val="0"/>
+        <w:spacing w:after="0" w:line="240" w:lineRule="auto"/>
+        <w:rPr>
+          <w:rFonts w:ascii="Cascadia Mono" w:hAnsi="Cascadia Mono" w:cs="Cascadia Mono"/>
+          <w:color w:val="000000"/>
+          <w:kern w:val="0"/>
+          <w:sz w:val="19"/>
+          <w:szCs w:val="19"/>
+          <w:highlight w:val="white"/>
+        </w:rPr>
+      </w:pPr>
+      <w:r>
+        <w:rPr>
+          <w:rFonts w:ascii="Cascadia Mono" w:hAnsi="Cascadia Mono" w:cs="Cascadia Mono"/>
+          <w:color w:val="000000"/>
+          <w:kern w:val="0"/>
+          <w:sz w:val="19"/>
+          <w:szCs w:val="19"/>
+          <w:highlight w:val="white"/>
+        </w:rPr>
+        <w:t>(0 rows affected)</w:t>
+      </w:r>
+    </w:p>
+    <w:p>
+      <w:pPr>
+        <w:autoSpaceDE w:val="0"/>
+        <w:autoSpaceDN w:val="0"/>
+        <w:adjustRightInd w:val="0"/>
+        <w:spacing w:after="0" w:line="240" w:lineRule="auto"/>
+        <w:rPr>
+          <w:rFonts w:ascii="Cascadia Mono" w:hAnsi="Cascadia Mono" w:cs="Cascadia Mono"/>
+          <w:color w:val="000000"/>
+          <w:kern w:val="0"/>
+          <w:sz w:val="19"/>
+          <w:szCs w:val="19"/>
+          <w:highlight w:val="white"/>
+        </w:rPr>
+      </w:pPr>
+      <w:r>
+        <w:rPr>
+          <w:rFonts w:ascii="Cascadia Mono" w:hAnsi="Cascadia Mono" w:cs="Cascadia Mono"/>
+          <w:color w:val="000000"/>
+          <w:kern w:val="0"/>
+          <w:sz w:val="19"/>
+          <w:szCs w:val="19"/>
+          <w:highlight w:val="white"/>
+        </w:rPr>
+        <w:t>Data Standardization &amp; Consistency</w:t>
+      </w:r>
+    </w:p>
+    <w:p>
+      <w:pPr>
+        <w:autoSpaceDE w:val="0"/>
+        <w:autoSpaceDN w:val="0"/>
+        <w:adjustRightInd w:val="0"/>
+        <w:spacing w:after="0" w:line="240" w:lineRule="auto"/>
+        <w:rPr>
+          <w:rFonts w:ascii="Cascadia Mono" w:hAnsi="Cascadia Mono" w:cs="Cascadia Mono"/>
+          <w:color w:val="000000"/>
+          <w:kern w:val="0"/>
+          <w:sz w:val="19"/>
+          <w:szCs w:val="19"/>
+          <w:highlight w:val="white"/>
+        </w:rPr>
+      </w:pPr>
+    </w:p>
+    <w:p>
+      <w:pPr>
+        <w:autoSpaceDE w:val="0"/>
+        <w:autoSpaceDN w:val="0"/>
+        <w:adjustRightInd w:val="0"/>
+        <w:spacing w:after="0" w:line="240" w:lineRule="auto"/>
+        <w:rPr>
+          <w:rFonts w:ascii="Cascadia Mono" w:hAnsi="Cascadia Mono" w:cs="Cascadia Mono"/>
+          <w:color w:val="000000"/>
+          <w:kern w:val="0"/>
+          <w:sz w:val="19"/>
+          <w:szCs w:val="19"/>
+          <w:highlight w:val="white"/>
+        </w:rPr>
+      </w:pPr>
+      <w:r>
+        <w:rPr>
+          <w:rFonts w:ascii="Cascadia Mono" w:hAnsi="Cascadia Mono" w:cs="Cascadia Mono"/>
+          <w:color w:val="000000"/>
+          <w:kern w:val="0"/>
+          <w:sz w:val="19"/>
+          <w:szCs w:val="19"/>
+          <w:highlight w:val="white"/>
+        </w:rPr>
+        <w:t>(5 rows affected)</w:t>
+      </w:r>
+    </w:p>
+    <w:p>
+      <w:pPr>
+        <w:autoSpaceDE w:val="0"/>
+        <w:autoSpaceDN w:val="0"/>
+        <w:adjustRightInd w:val="0"/>
+        <w:spacing w:after="0" w:line="240" w:lineRule="auto"/>
+        <w:rPr>
+          <w:rFonts w:ascii="Cascadia Mono" w:hAnsi="Cascadia Mono" w:cs="Cascadia Mono"/>
+          <w:color w:val="000000"/>
+          <w:kern w:val="0"/>
+          <w:sz w:val="19"/>
+          <w:szCs w:val="19"/>
+          <w:highlight w:val="white"/>
+        </w:rPr>
+      </w:pPr>
+      <w:r>
+        <w:rPr>
+          <w:rFonts w:ascii="Cascadia Mono" w:hAnsi="Cascadia Mono" w:cs="Cascadia Mono"/>
+          <w:color w:val="000000"/>
+          <w:kern w:val="0"/>
+          <w:sz w:val="19"/>
+          <w:szCs w:val="19"/>
+          <w:highlight w:val="white"/>
+        </w:rPr>
+        <w:t>Check for Invalid Date Orders (Start Date &gt; End Date)</w:t>
+      </w:r>
+    </w:p>
+    <w:p>
+      <w:pPr>
+        <w:autoSpaceDE w:val="0"/>
+        <w:autoSpaceDN w:val="0"/>
+        <w:adjustRightInd w:val="0"/>
+        <w:spacing w:after="0" w:line="240" w:lineRule="auto"/>
+        <w:rPr>
+          <w:rFonts w:ascii="Cascadia Mono" w:hAnsi="Cascadia Mono" w:cs="Cascadia Mono"/>
+          <w:color w:val="000000"/>
+          <w:kern w:val="0"/>
+          <w:sz w:val="19"/>
+          <w:szCs w:val="19"/>
+          <w:highlight w:val="white"/>
+        </w:rPr>
+      </w:pPr>
+    </w:p>
+    <w:p>
+      <w:pPr>
+        <w:autoSpaceDE w:val="0"/>
+        <w:autoSpaceDN w:val="0"/>
+        <w:adjustRightInd w:val="0"/>
+        <w:spacing w:after="0" w:line="240" w:lineRule="auto"/>
+        <w:rPr>
+          <w:rFonts w:ascii="Cascadia Mono" w:hAnsi="Cascadia Mono" w:cs="Cascadia Mono"/>
+          <w:color w:val="000000"/>
+          <w:kern w:val="0"/>
+          <w:sz w:val="19"/>
+          <w:szCs w:val="19"/>
+          <w:highlight w:val="white"/>
+        </w:rPr>
+      </w:pPr>
+      <w:r>
+        <w:rPr>
+          <w:rFonts w:ascii="Cascadia Mono" w:hAnsi="Cascadia Mono" w:cs="Cascadia Mono"/>
+          <w:color w:val="000000"/>
+          <w:kern w:val="0"/>
+          <w:sz w:val="19"/>
+          <w:szCs w:val="19"/>
+          <w:highlight w:val="white"/>
+        </w:rPr>
+        <w:t>(0 rows affected)</w:t>
+      </w:r>
+    </w:p>
+    <w:p>
+      <w:pPr>
+        <w:autoSpaceDE w:val="0"/>
+        <w:autoSpaceDN w:val="0"/>
+        <w:adjustRightInd w:val="0"/>
+        <w:spacing w:after="0" w:line="240" w:lineRule="auto"/>
+        <w:rPr>
+          <w:rFonts w:ascii="Cascadia Mono" w:hAnsi="Cascadia Mono" w:cs="Cascadia Mono"/>
+          <w:color w:val="000000"/>
+          <w:kern w:val="0"/>
+          <w:sz w:val="19"/>
+          <w:szCs w:val="19"/>
+          <w:highlight w:val="white"/>
+        </w:rPr>
+      </w:pPr>
+      <w:r>
+        <w:rPr>
+          <w:rFonts w:ascii="Cascadia Mono" w:hAnsi="Cascadia Mono" w:cs="Cascadia Mono"/>
+          <w:color w:val="000000"/>
+          <w:kern w:val="0"/>
+          <w:sz w:val="19"/>
+          <w:szCs w:val="19"/>
+          <w:highlight w:val="white"/>
+        </w:rPr>
+        <w:t>====================================================================</w:t>
+      </w:r>
+    </w:p>
+    <w:p>
+      <w:pPr>
+        <w:autoSpaceDE w:val="0"/>
+        <w:autoSpaceDN w:val="0"/>
+        <w:adjustRightInd w:val="0"/>
+        <w:spacing w:after="0" w:line="240" w:lineRule="auto"/>
+        <w:rPr>
+          <w:rFonts w:ascii="Cascadia Mono" w:hAnsi="Cascadia Mono" w:cs="Cascadia Mono"/>
+          <w:color w:val="000000"/>
+          <w:kern w:val="0"/>
+          <w:sz w:val="19"/>
+          <w:szCs w:val="19"/>
+          <w:highlight w:val="white"/>
+        </w:rPr>
+      </w:pPr>
+      <w:r>
+        <w:rPr>
+          <w:rFonts w:ascii="Cascadia Mono" w:hAnsi="Cascadia Mono" w:cs="Cascadia Mono"/>
+          <w:color w:val="000000"/>
+          <w:kern w:val="0"/>
+          <w:sz w:val="19"/>
+          <w:szCs w:val="19"/>
+          <w:highlight w:val="white"/>
+        </w:rPr>
+        <w:t>Checking silver.crmSalesDetails</w:t>
+      </w:r>
+    </w:p>
+    <w:p>
+      <w:pPr>
+        <w:autoSpaceDE w:val="0"/>
+        <w:autoSpaceDN w:val="0"/>
+        <w:adjustRightInd w:val="0"/>
+        <w:spacing w:after="0" w:line="240" w:lineRule="auto"/>
+        <w:rPr>
+          <w:rFonts w:ascii="Cascadia Mono" w:hAnsi="Cascadia Mono" w:cs="Cascadia Mono"/>
+          <w:color w:val="000000"/>
+          <w:kern w:val="0"/>
+          <w:sz w:val="19"/>
+          <w:szCs w:val="19"/>
+          <w:highlight w:val="white"/>
+        </w:rPr>
+      </w:pPr>
+      <w:r>
+        <w:rPr>
+          <w:rFonts w:ascii="Cascadia Mono" w:hAnsi="Cascadia Mono" w:cs="Cascadia Mono"/>
+          <w:color w:val="000000"/>
+          <w:kern w:val="0"/>
+          <w:sz w:val="19"/>
+          <w:szCs w:val="19"/>
+          <w:highlight w:val="white"/>
+        </w:rPr>
+        <w:t>====================================================================</w:t>
+      </w:r>
+    </w:p>
+    <w:p>
+      <w:pPr>
+        <w:autoSpaceDE w:val="0"/>
+        <w:autoSpaceDN w:val="0"/>
+        <w:adjustRightInd w:val="0"/>
+        <w:spacing w:after="0" w:line="240" w:lineRule="auto"/>
+        <w:rPr>
+          <w:rFonts w:ascii="Cascadia Mono" w:hAnsi="Cascadia Mono" w:cs="Cascadia Mono"/>
+          <w:color w:val="000000"/>
+          <w:kern w:val="0"/>
+          <w:sz w:val="19"/>
+          <w:szCs w:val="19"/>
+          <w:highlight w:val="white"/>
+        </w:rPr>
+      </w:pPr>
+      <w:r>
+        <w:rPr>
+          <w:rFonts w:ascii="Cascadia Mono" w:hAnsi="Cascadia Mono" w:cs="Cascadia Mono"/>
+          <w:color w:val="000000"/>
+          <w:kern w:val="0"/>
+          <w:sz w:val="19"/>
+          <w:szCs w:val="19"/>
+          <w:highlight w:val="white"/>
+        </w:rPr>
+        <w:t>Check for Invalid Dates</w:t>
+      </w:r>
+    </w:p>
+    <w:p>
+      <w:pPr>
+        <w:autoSpaceDE w:val="0"/>
+        <w:autoSpaceDN w:val="0"/>
+        <w:adjustRightInd w:val="0"/>
+        <w:spacing w:after="0" w:line="240" w:lineRule="auto"/>
+        <w:rPr>
+          <w:rFonts w:ascii="Cascadia Mono" w:hAnsi="Cascadia Mono" w:cs="Cascadia Mono"/>
+          <w:color w:val="000000"/>
+          <w:kern w:val="0"/>
+          <w:sz w:val="19"/>
+          <w:szCs w:val="19"/>
+          <w:highlight w:val="white"/>
+        </w:rPr>
+      </w:pPr>
+    </w:p>
+    <w:p>
+      <w:pPr>
+        <w:autoSpaceDE w:val="0"/>
+        <w:autoSpaceDN w:val="0"/>
+        <w:adjustRightInd w:val="0"/>
+        <w:spacing w:after="0" w:line="240" w:lineRule="auto"/>
+        <w:rPr>
+          <w:rFonts w:ascii="Cascadia Mono" w:hAnsi="Cascadia Mono" w:cs="Cascadia Mono"/>
+          <w:color w:val="000000"/>
+          <w:kern w:val="0"/>
+          <w:sz w:val="19"/>
+          <w:szCs w:val="19"/>
+          <w:highlight w:val="white"/>
+        </w:rPr>
+      </w:pPr>
+      <w:r>
+        <w:rPr>
+          <w:rFonts w:ascii="Cascadia Mono" w:hAnsi="Cascadia Mono" w:cs="Cascadia Mono"/>
+          <w:color w:val="000000"/>
+          <w:kern w:val="0"/>
+          <w:sz w:val="19"/>
+          <w:szCs w:val="19"/>
+          <w:highlight w:val="white"/>
+        </w:rPr>
+        <w:t>(0 rows affected)</w:t>
+      </w:r>
+    </w:p>
+    <w:p>
+      <w:pPr>
+        <w:autoSpaceDE w:val="0"/>
+        <w:autoSpaceDN w:val="0"/>
+        <w:adjustRightInd w:val="0"/>
+        <w:spacing w:after="0" w:line="240" w:lineRule="auto"/>
+        <w:rPr>
+          <w:rFonts w:ascii="Cascadia Mono" w:hAnsi="Cascadia Mono" w:cs="Cascadia Mono"/>
+          <w:color w:val="000000"/>
+          <w:kern w:val="0"/>
+          <w:sz w:val="19"/>
+          <w:szCs w:val="19"/>
+          <w:highlight w:val="white"/>
+        </w:rPr>
+      </w:pPr>
+      <w:r>
+        <w:rPr>
+          <w:rFonts w:ascii="Cascadia Mono" w:hAnsi="Cascadia Mono" w:cs="Cascadia Mono"/>
+          <w:color w:val="000000"/>
+          <w:kern w:val="0"/>
+          <w:sz w:val="19"/>
+          <w:szCs w:val="19"/>
+          <w:highlight w:val="white"/>
+        </w:rPr>
+        <w:t>Check for Invalid Date Orders (Order Date &gt; Shipping/Due Dates)</w:t>
+      </w:r>
+    </w:p>
+    <w:p>
+      <w:pPr>
+        <w:autoSpaceDE w:val="0"/>
+        <w:autoSpaceDN w:val="0"/>
+        <w:adjustRightInd w:val="0"/>
+        <w:spacing w:after="0" w:line="240" w:lineRule="auto"/>
+        <w:rPr>
+          <w:rFonts w:ascii="Cascadia Mono" w:hAnsi="Cascadia Mono" w:cs="Cascadia Mono"/>
+          <w:color w:val="000000"/>
+          <w:kern w:val="0"/>
+          <w:sz w:val="19"/>
+          <w:szCs w:val="19"/>
+          <w:highlight w:val="white"/>
+        </w:rPr>
+      </w:pPr>
+    </w:p>
+    <w:p>
+      <w:pPr>
+        <w:autoSpaceDE w:val="0"/>
+        <w:autoSpaceDN w:val="0"/>
+        <w:adjustRightInd w:val="0"/>
+        <w:spacing w:after="0" w:line="240" w:lineRule="auto"/>
+        <w:rPr>
+          <w:rFonts w:ascii="Cascadia Mono" w:hAnsi="Cascadia Mono" w:cs="Cascadia Mono"/>
+          <w:color w:val="000000"/>
+          <w:kern w:val="0"/>
+          <w:sz w:val="19"/>
+          <w:szCs w:val="19"/>
+          <w:highlight w:val="white"/>
+        </w:rPr>
+      </w:pPr>
+      <w:r>
+        <w:rPr>
+          <w:rFonts w:ascii="Cascadia Mono" w:hAnsi="Cascadia Mono" w:cs="Cascadia Mono"/>
+          <w:color w:val="000000"/>
+          <w:kern w:val="0"/>
+          <w:sz w:val="19"/>
+          <w:szCs w:val="19"/>
+          <w:highlight w:val="white"/>
+        </w:rPr>
+        <w:t>(0 rows affected)</w:t>
+      </w:r>
+    </w:p>
+    <w:p>
+      <w:pPr>
+        <w:autoSpaceDE w:val="0"/>
+        <w:autoSpaceDN w:val="0"/>
+        <w:adjustRightInd w:val="0"/>
+        <w:spacing w:after="0" w:line="240" w:lineRule="auto"/>
+        <w:rPr>
+          <w:rFonts w:ascii="Cascadia Mono" w:hAnsi="Cascadia Mono" w:cs="Cascadia Mono"/>
+          <w:color w:val="000000"/>
+          <w:kern w:val="0"/>
+          <w:sz w:val="19"/>
+          <w:szCs w:val="19"/>
+          <w:highlight w:val="white"/>
+        </w:rPr>
+      </w:pPr>
+      <w:r>
+        <w:rPr>
+          <w:rFonts w:ascii="Cascadia Mono" w:hAnsi="Cascadia Mono" w:cs="Cascadia Mono"/>
+          <w:color w:val="000000"/>
+          <w:kern w:val="0"/>
+          <w:sz w:val="19"/>
+          <w:szCs w:val="19"/>
+          <w:highlight w:val="white"/>
+        </w:rPr>
+        <w:t>Check Data Consistency: Sales = Quantity * Price</w:t>
+      </w:r>
+    </w:p>
+    <w:p>
+      <w:pPr>
+        <w:autoSpaceDE w:val="0"/>
+        <w:autoSpaceDN w:val="0"/>
+        <w:adjustRightInd w:val="0"/>
+        <w:spacing w:after="0" w:line="240" w:lineRule="auto"/>
+        <w:rPr>
+          <w:rFonts w:ascii="Cascadia Mono" w:hAnsi="Cascadia Mono" w:cs="Cascadia Mono"/>
+          <w:color w:val="000000"/>
+          <w:kern w:val="0"/>
+          <w:sz w:val="19"/>
+          <w:szCs w:val="19"/>
+          <w:highlight w:val="white"/>
+        </w:rPr>
+      </w:pPr>
+    </w:p>
+    <w:p>
+      <w:pPr>
+        <w:autoSpaceDE w:val="0"/>
+        <w:autoSpaceDN w:val="0"/>
+        <w:adjustRightInd w:val="0"/>
+        <w:spacing w:after="0" w:line="240" w:lineRule="auto"/>
+        <w:rPr>
+          <w:rFonts w:ascii="Cascadia Mono" w:hAnsi="Cascadia Mono" w:cs="Cascadia Mono"/>
+          <w:color w:val="000000"/>
+          <w:kern w:val="0"/>
+          <w:sz w:val="19"/>
+          <w:szCs w:val="19"/>
+          <w:highlight w:val="white"/>
+        </w:rPr>
+      </w:pPr>
+      <w:r>
+        <w:rPr>
+          <w:rFonts w:ascii="Cascadia Mono" w:hAnsi="Cascadia Mono" w:cs="Cascadia Mono"/>
+          <w:color w:val="000000"/>
+          <w:kern w:val="0"/>
+          <w:sz w:val="19"/>
+          <w:szCs w:val="19"/>
+          <w:highlight w:val="white"/>
+        </w:rPr>
+        <w:t>(0 rows affected)</w:t>
+      </w:r>
+    </w:p>
+    <w:p>
+      <w:pPr>
+        <w:autoSpaceDE w:val="0"/>
+        <w:autoSpaceDN w:val="0"/>
+        <w:adjustRightInd w:val="0"/>
+        <w:spacing w:after="0" w:line="240" w:lineRule="auto"/>
+        <w:rPr>
+          <w:rFonts w:ascii="Cascadia Mono" w:hAnsi="Cascadia Mono" w:cs="Cascadia Mono"/>
+          <w:color w:val="000000"/>
+          <w:kern w:val="0"/>
+          <w:sz w:val="19"/>
+          <w:szCs w:val="19"/>
+          <w:highlight w:val="white"/>
+        </w:rPr>
+      </w:pPr>
+      <w:r>
+        <w:rPr>
+          <w:rFonts w:ascii="Cascadia Mono" w:hAnsi="Cascadia Mono" w:cs="Cascadia Mono"/>
+          <w:color w:val="000000"/>
+          <w:kern w:val="0"/>
+          <w:sz w:val="19"/>
+          <w:szCs w:val="19"/>
+          <w:highlight w:val="white"/>
+        </w:rPr>
+        <w:t>====================================================================</w:t>
+      </w:r>
+    </w:p>
+    <w:p>
+      <w:pPr>
+        <w:autoSpaceDE w:val="0"/>
+        <w:autoSpaceDN w:val="0"/>
+        <w:adjustRightInd w:val="0"/>
+        <w:spacing w:after="0" w:line="240" w:lineRule="auto"/>
+        <w:rPr>
+          <w:rFonts w:ascii="Cascadia Mono" w:hAnsi="Cascadia Mono" w:cs="Cascadia Mono"/>
+          <w:color w:val="000000"/>
+          <w:kern w:val="0"/>
+          <w:sz w:val="19"/>
+          <w:szCs w:val="19"/>
+          <w:highlight w:val="white"/>
+        </w:rPr>
+      </w:pPr>
+      <w:r>
+        <w:rPr>
+          <w:rFonts w:ascii="Cascadia Mono" w:hAnsi="Cascadia Mono" w:cs="Cascadia Mono"/>
+          <w:color w:val="000000"/>
+          <w:kern w:val="0"/>
+          <w:sz w:val="19"/>
+          <w:szCs w:val="19"/>
+          <w:highlight w:val="white"/>
+        </w:rPr>
+        <w:t>Checking silver.erpCustAz12</w:t>
+      </w:r>
+    </w:p>
+    <w:p>
+      <w:pPr>
+        <w:autoSpaceDE w:val="0"/>
+        <w:autoSpaceDN w:val="0"/>
+        <w:adjustRightInd w:val="0"/>
+        <w:spacing w:after="0" w:line="240" w:lineRule="auto"/>
+        <w:rPr>
+          <w:rFonts w:ascii="Cascadia Mono" w:hAnsi="Cascadia Mono" w:cs="Cascadia Mono"/>
+          <w:color w:val="000000"/>
+          <w:kern w:val="0"/>
+          <w:sz w:val="19"/>
+          <w:szCs w:val="19"/>
+          <w:highlight w:val="white"/>
+        </w:rPr>
+      </w:pPr>
+      <w:r>
+        <w:rPr>
+          <w:rFonts w:ascii="Cascadia Mono" w:hAnsi="Cascadia Mono" w:cs="Cascadia Mono"/>
+          <w:color w:val="000000"/>
+          <w:kern w:val="0"/>
+          <w:sz w:val="19"/>
+          <w:szCs w:val="19"/>
+          <w:highlight w:val="white"/>
+        </w:rPr>
+        <w:t>====================================================================</w:t>
+      </w:r>
+    </w:p>
+    <w:p>
+      <w:pPr>
+        <w:autoSpaceDE w:val="0"/>
+        <w:autoSpaceDN w:val="0"/>
+        <w:adjustRightInd w:val="0"/>
+        <w:spacing w:after="0" w:line="240" w:lineRule="auto"/>
+        <w:rPr>
+          <w:rFonts w:ascii="Cascadia Mono" w:hAnsi="Cascadia Mono" w:cs="Cascadia Mono"/>
+          <w:color w:val="000000"/>
+          <w:kern w:val="0"/>
+          <w:sz w:val="19"/>
+          <w:szCs w:val="19"/>
+          <w:highlight w:val="white"/>
+        </w:rPr>
+      </w:pPr>
+      <w:r>
+        <w:rPr>
+          <w:rFonts w:ascii="Cascadia Mono" w:hAnsi="Cascadia Mono" w:cs="Cascadia Mono"/>
+          <w:color w:val="000000"/>
+          <w:kern w:val="0"/>
+          <w:sz w:val="19"/>
+          <w:szCs w:val="19"/>
+          <w:highlight w:val="white"/>
+        </w:rPr>
+        <w:t>Identify Out-of-Range Dates</w:t>
+      </w:r>
+    </w:p>
+    <w:p>
+      <w:pPr>
+        <w:autoSpaceDE w:val="0"/>
+        <w:autoSpaceDN w:val="0"/>
+        <w:adjustRightInd w:val="0"/>
+        <w:spacing w:after="0" w:line="240" w:lineRule="auto"/>
+        <w:rPr>
+          <w:rFonts w:ascii="Cascadia Mono" w:hAnsi="Cascadia Mono" w:cs="Cascadia Mono"/>
+          <w:color w:val="000000"/>
+          <w:kern w:val="0"/>
+          <w:sz w:val="19"/>
+          <w:szCs w:val="19"/>
+          <w:highlight w:val="white"/>
+        </w:rPr>
+      </w:pPr>
+      <w:r>
+        <w:rPr>
+          <w:rFonts w:ascii="Cascadia Mono" w:hAnsi="Cascadia Mono" w:cs="Cascadia Mono"/>
+          <w:color w:val="000000"/>
+          <w:kern w:val="0"/>
+          <w:sz w:val="19"/>
+          <w:szCs w:val="19"/>
+          <w:highlight w:val="white"/>
+        </w:rPr>
+        <w:t>Expectation: Birthdates between 1900-01-01 and Today. We cannot expect to have a customer of over 103 years old</w:t>
+      </w:r>
+    </w:p>
+    <w:p>
+      <w:pPr>
+        <w:autoSpaceDE w:val="0"/>
+        <w:autoSpaceDN w:val="0"/>
+        <w:adjustRightInd w:val="0"/>
+        <w:spacing w:after="0" w:line="240" w:lineRule="auto"/>
+        <w:rPr>
+          <w:rFonts w:ascii="Cascadia Mono" w:hAnsi="Cascadia Mono" w:cs="Cascadia Mono"/>
+          <w:color w:val="000000"/>
+          <w:kern w:val="0"/>
+          <w:sz w:val="19"/>
+          <w:szCs w:val="19"/>
+          <w:highlight w:val="white"/>
+        </w:rPr>
+      </w:pPr>
+    </w:p>
+    <w:p>
+      <w:pPr>
+        <w:autoSpaceDE w:val="0"/>
+        <w:autoSpaceDN w:val="0"/>
+        <w:adjustRightInd w:val="0"/>
+        <w:spacing w:after="0" w:line="240" w:lineRule="auto"/>
+        <w:rPr>
+          <w:rFonts w:ascii="Cascadia Mono" w:hAnsi="Cascadia Mono" w:cs="Cascadia Mono"/>
+          <w:color w:val="000000"/>
+          <w:kern w:val="0"/>
+          <w:sz w:val="19"/>
+          <w:szCs w:val="19"/>
+          <w:highlight w:val="white"/>
+        </w:rPr>
+      </w:pPr>
+      <w:r>
+        <w:rPr>
+          <w:rFonts w:ascii="Cascadia Mono" w:hAnsi="Cascadia Mono" w:cs="Cascadia Mono"/>
+          <w:color w:val="000000"/>
+          <w:kern w:val="0"/>
+          <w:sz w:val="19"/>
+          <w:szCs w:val="19"/>
+          <w:highlight w:val="white"/>
+        </w:rPr>
+        <w:t>(0 rows affected)</w:t>
+      </w:r>
+    </w:p>
+    <w:p>
+      <w:pPr>
+        <w:autoSpaceDE w:val="0"/>
+        <w:autoSpaceDN w:val="0"/>
+        <w:adjustRightInd w:val="0"/>
+        <w:spacing w:after="0" w:line="240" w:lineRule="auto"/>
+        <w:rPr>
+          <w:rFonts w:ascii="Cascadia Mono" w:hAnsi="Cascadia Mono" w:cs="Cascadia Mono"/>
+          <w:color w:val="000000"/>
+          <w:kern w:val="0"/>
+          <w:sz w:val="19"/>
+          <w:szCs w:val="19"/>
+          <w:highlight w:val="white"/>
+        </w:rPr>
+      </w:pPr>
+      <w:r>
+        <w:rPr>
+          <w:rFonts w:ascii="Cascadia Mono" w:hAnsi="Cascadia Mono" w:cs="Cascadia Mono"/>
+          <w:color w:val="000000"/>
+          <w:kern w:val="0"/>
+          <w:sz w:val="19"/>
+          <w:szCs w:val="19"/>
+          <w:highlight w:val="white"/>
+        </w:rPr>
+        <w:t>Data Standardization &amp; Consistency</w:t>
+      </w:r>
+    </w:p>
+    <w:p>
+      <w:pPr>
+        <w:autoSpaceDE w:val="0"/>
+        <w:autoSpaceDN w:val="0"/>
+        <w:adjustRightInd w:val="0"/>
+        <w:spacing w:after="0" w:line="240" w:lineRule="auto"/>
+        <w:rPr>
+          <w:rFonts w:ascii="Cascadia Mono" w:hAnsi="Cascadia Mono" w:cs="Cascadia Mono"/>
+          <w:color w:val="000000"/>
+          <w:kern w:val="0"/>
+          <w:sz w:val="19"/>
+          <w:szCs w:val="19"/>
+          <w:highlight w:val="white"/>
+        </w:rPr>
+      </w:pPr>
+    </w:p>
+    <w:p>
+      <w:pPr>
+        <w:autoSpaceDE w:val="0"/>
+        <w:autoSpaceDN w:val="0"/>
+        <w:adjustRightInd w:val="0"/>
+        <w:spacing w:after="0" w:line="240" w:lineRule="auto"/>
+        <w:rPr>
+          <w:rFonts w:ascii="Cascadia Mono" w:hAnsi="Cascadia Mono" w:cs="Cascadia Mono"/>
+          <w:color w:val="000000"/>
+          <w:kern w:val="0"/>
+          <w:sz w:val="19"/>
+          <w:szCs w:val="19"/>
+          <w:highlight w:val="white"/>
+        </w:rPr>
+      </w:pPr>
+      <w:r>
+        <w:rPr>
+          <w:rFonts w:ascii="Cascadia Mono" w:hAnsi="Cascadia Mono" w:cs="Cascadia Mono"/>
+          <w:color w:val="000000"/>
+          <w:kern w:val="0"/>
+          <w:sz w:val="19"/>
+          <w:szCs w:val="19"/>
+          <w:highlight w:val="white"/>
+        </w:rPr>
+        <w:t>(3 rows affected)</w:t>
+      </w:r>
+    </w:p>
+    <w:p>
+      <w:pPr>
+        <w:autoSpaceDE w:val="0"/>
+        <w:autoSpaceDN w:val="0"/>
+        <w:adjustRightInd w:val="0"/>
+        <w:spacing w:after="0" w:line="240" w:lineRule="auto"/>
+        <w:rPr>
+          <w:rFonts w:ascii="Cascadia Mono" w:hAnsi="Cascadia Mono" w:cs="Cascadia Mono"/>
+          <w:color w:val="000000"/>
+          <w:kern w:val="0"/>
+          <w:sz w:val="19"/>
+          <w:szCs w:val="19"/>
+          <w:highlight w:val="white"/>
+        </w:rPr>
+      </w:pPr>
+      <w:r>
+        <w:rPr>
+          <w:rFonts w:ascii="Cascadia Mono" w:hAnsi="Cascadia Mono" w:cs="Cascadia Mono"/>
+          <w:color w:val="000000"/>
+          <w:kern w:val="0"/>
+          <w:sz w:val="19"/>
+          <w:szCs w:val="19"/>
+          <w:highlight w:val="white"/>
+        </w:rPr>
+        <w:t>====================================================================</w:t>
+      </w:r>
+    </w:p>
+    <w:p>
+      <w:pPr>
+        <w:autoSpaceDE w:val="0"/>
+        <w:autoSpaceDN w:val="0"/>
+        <w:adjustRightInd w:val="0"/>
+        <w:spacing w:after="0" w:line="240" w:lineRule="auto"/>
+        <w:rPr>
+          <w:rFonts w:ascii="Cascadia Mono" w:hAnsi="Cascadia Mono" w:cs="Cascadia Mono"/>
+          <w:color w:val="000000"/>
+          <w:kern w:val="0"/>
+          <w:sz w:val="19"/>
+          <w:szCs w:val="19"/>
+          <w:highlight w:val="white"/>
+        </w:rPr>
+      </w:pPr>
+      <w:r>
+        <w:rPr>
+          <w:rFonts w:ascii="Cascadia Mono" w:hAnsi="Cascadia Mono" w:cs="Cascadia Mono"/>
+          <w:color w:val="000000"/>
+          <w:kern w:val="0"/>
+          <w:sz w:val="19"/>
+          <w:szCs w:val="19"/>
+          <w:highlight w:val="white"/>
+        </w:rPr>
+        <w:t>Checking silver.erpLocA101</w:t>
+      </w:r>
+    </w:p>
+    <w:p>
+      <w:pPr>
+        <w:autoSpaceDE w:val="0"/>
+        <w:autoSpaceDN w:val="0"/>
+        <w:adjustRightInd w:val="0"/>
+        <w:spacing w:after="0" w:line="240" w:lineRule="auto"/>
+        <w:rPr>
+          <w:rFonts w:ascii="Cascadia Mono" w:hAnsi="Cascadia Mono" w:cs="Cascadia Mono"/>
+          <w:color w:val="000000"/>
+          <w:kern w:val="0"/>
+          <w:sz w:val="19"/>
+          <w:szCs w:val="19"/>
+          <w:highlight w:val="white"/>
+        </w:rPr>
+      </w:pPr>
+      <w:r>
+        <w:rPr>
+          <w:rFonts w:ascii="Cascadia Mono" w:hAnsi="Cascadia Mono" w:cs="Cascadia Mono"/>
+          <w:color w:val="000000"/>
+          <w:kern w:val="0"/>
+          <w:sz w:val="19"/>
+          <w:szCs w:val="19"/>
+          <w:highlight w:val="white"/>
+        </w:rPr>
+        <w:t>====================================================================</w:t>
+      </w:r>
+    </w:p>
+    <w:p>
+      <w:pPr>
+        <w:autoSpaceDE w:val="0"/>
+        <w:autoSpaceDN w:val="0"/>
+        <w:adjustRightInd w:val="0"/>
+        <w:spacing w:after="0" w:line="240" w:lineRule="auto"/>
+        <w:rPr>
+          <w:rFonts w:ascii="Cascadia Mono" w:hAnsi="Cascadia Mono" w:cs="Cascadia Mono"/>
+          <w:color w:val="000000"/>
+          <w:kern w:val="0"/>
+          <w:sz w:val="19"/>
+          <w:szCs w:val="19"/>
+          <w:highlight w:val="white"/>
+        </w:rPr>
+      </w:pPr>
+      <w:r>
+        <w:rPr>
+          <w:rFonts w:ascii="Cascadia Mono" w:hAnsi="Cascadia Mono" w:cs="Cascadia Mono"/>
+          <w:color w:val="000000"/>
+          <w:kern w:val="0"/>
+          <w:sz w:val="19"/>
+          <w:szCs w:val="19"/>
+          <w:highlight w:val="white"/>
+        </w:rPr>
+        <w:t>Data Standardization &amp; Consistency</w:t>
+      </w:r>
+    </w:p>
+    <w:p>
+      <w:pPr>
+        <w:autoSpaceDE w:val="0"/>
+        <w:autoSpaceDN w:val="0"/>
+        <w:adjustRightInd w:val="0"/>
+        <w:spacing w:after="0" w:line="240" w:lineRule="auto"/>
+        <w:rPr>
+          <w:rFonts w:ascii="Cascadia Mono" w:hAnsi="Cascadia Mono" w:cs="Cascadia Mono"/>
+          <w:color w:val="000000"/>
+          <w:kern w:val="0"/>
+          <w:sz w:val="19"/>
+          <w:szCs w:val="19"/>
+          <w:highlight w:val="white"/>
+        </w:rPr>
+      </w:pPr>
+    </w:p>
+    <w:p>
+      <w:pPr>
+        <w:autoSpaceDE w:val="0"/>
+        <w:autoSpaceDN w:val="0"/>
+        <w:adjustRightInd w:val="0"/>
+        <w:spacing w:after="0" w:line="240" w:lineRule="auto"/>
+        <w:rPr>
+          <w:rFonts w:ascii="Cascadia Mono" w:hAnsi="Cascadia Mono" w:cs="Cascadia Mono"/>
+          <w:color w:val="000000"/>
+          <w:kern w:val="0"/>
+          <w:sz w:val="19"/>
+          <w:szCs w:val="19"/>
+          <w:highlight w:val="white"/>
+        </w:rPr>
+      </w:pPr>
+      <w:r>
+        <w:rPr>
+          <w:rFonts w:ascii="Cascadia Mono" w:hAnsi="Cascadia Mono" w:cs="Cascadia Mono"/>
+          <w:color w:val="000000"/>
+          <w:kern w:val="0"/>
+          <w:sz w:val="19"/>
+          <w:szCs w:val="19"/>
+          <w:highlight w:val="white"/>
+        </w:rPr>
+        <w:t>(7 rows affected)</w:t>
+      </w:r>
+    </w:p>
+    <w:p>
+      <w:pPr>
+        <w:autoSpaceDE w:val="0"/>
+        <w:autoSpaceDN w:val="0"/>
+        <w:adjustRightInd w:val="0"/>
+        <w:spacing w:after="0" w:line="240" w:lineRule="auto"/>
+        <w:rPr>
+          <w:rFonts w:ascii="Cascadia Mono" w:hAnsi="Cascadia Mono" w:cs="Cascadia Mono"/>
+          <w:color w:val="000000"/>
+          <w:kern w:val="0"/>
+          <w:sz w:val="19"/>
+          <w:szCs w:val="19"/>
+          <w:highlight w:val="white"/>
+        </w:rPr>
+      </w:pPr>
+      <w:r>
+        <w:rPr>
+          <w:rFonts w:ascii="Cascadia Mono" w:hAnsi="Cascadia Mono" w:cs="Cascadia Mono"/>
+          <w:color w:val="000000"/>
+          <w:kern w:val="0"/>
+          <w:sz w:val="19"/>
+          <w:szCs w:val="19"/>
+          <w:highlight w:val="white"/>
+        </w:rPr>
+        <w:t>====================================================================</w:t>
+      </w:r>
+    </w:p>
+    <w:p>
+      <w:pPr>
+        <w:autoSpaceDE w:val="0"/>
+        <w:autoSpaceDN w:val="0"/>
+        <w:adjustRightInd w:val="0"/>
+        <w:spacing w:after="0" w:line="240" w:lineRule="auto"/>
+        <w:rPr>
+          <w:rFonts w:ascii="Cascadia Mono" w:hAnsi="Cascadia Mono" w:cs="Cascadia Mono"/>
+          <w:color w:val="000000"/>
+          <w:kern w:val="0"/>
+          <w:sz w:val="19"/>
+          <w:szCs w:val="19"/>
+          <w:highlight w:val="white"/>
+        </w:rPr>
+      </w:pPr>
+      <w:r>
+        <w:rPr>
+          <w:rFonts w:ascii="Cascadia Mono" w:hAnsi="Cascadia Mono" w:cs="Cascadia Mono"/>
+          <w:color w:val="000000"/>
+          <w:kern w:val="0"/>
+          <w:sz w:val="19"/>
+          <w:szCs w:val="19"/>
+          <w:highlight w:val="white"/>
+        </w:rPr>
+        <w:t>Checking silver.erpPxCatG1v2</w:t>
+      </w:r>
+    </w:p>
+    <w:p>
+      <w:pPr>
+        <w:autoSpaceDE w:val="0"/>
+        <w:autoSpaceDN w:val="0"/>
+        <w:adjustRightInd w:val="0"/>
+        <w:spacing w:after="0" w:line="240" w:lineRule="auto"/>
+        <w:rPr>
+          <w:rFonts w:ascii="Cascadia Mono" w:hAnsi="Cascadia Mono" w:cs="Cascadia Mono"/>
+          <w:color w:val="000000"/>
+          <w:kern w:val="0"/>
+          <w:sz w:val="19"/>
+          <w:szCs w:val="19"/>
+          <w:highlight w:val="white"/>
+        </w:rPr>
+      </w:pPr>
+      <w:r>
+        <w:rPr>
+          <w:rFonts w:ascii="Cascadia Mono" w:hAnsi="Cascadia Mono" w:cs="Cascadia Mono"/>
+          <w:color w:val="000000"/>
+          <w:kern w:val="0"/>
+          <w:sz w:val="19"/>
+          <w:szCs w:val="19"/>
+          <w:highlight w:val="white"/>
+        </w:rPr>
+        <w:t>====================================================================</w:t>
+      </w:r>
+    </w:p>
+    <w:p>
+      <w:pPr>
+        <w:autoSpaceDE w:val="0"/>
+        <w:autoSpaceDN w:val="0"/>
+        <w:adjustRightInd w:val="0"/>
+        <w:spacing w:after="0" w:line="240" w:lineRule="auto"/>
+        <w:rPr>
+          <w:rFonts w:ascii="Cascadia Mono" w:hAnsi="Cascadia Mono" w:cs="Cascadia Mono"/>
+          <w:color w:val="000000"/>
+          <w:kern w:val="0"/>
+          <w:sz w:val="19"/>
+          <w:szCs w:val="19"/>
+          <w:highlight w:val="white"/>
+        </w:rPr>
+      </w:pPr>
+      <w:r>
+        <w:rPr>
+          <w:rFonts w:ascii="Cascadia Mono" w:hAnsi="Cascadia Mono" w:cs="Cascadia Mono"/>
+          <w:color w:val="000000"/>
+          <w:kern w:val="0"/>
+          <w:sz w:val="19"/>
+          <w:szCs w:val="19"/>
+          <w:highlight w:val="white"/>
+        </w:rPr>
+        <w:t>Check for Unwanted Spaces</w:t>
+      </w:r>
+    </w:p>
+    <w:p>
+      <w:pPr>
+        <w:autoSpaceDE w:val="0"/>
+        <w:autoSpaceDN w:val="0"/>
+        <w:adjustRightInd w:val="0"/>
+        <w:spacing w:after="0" w:line="240" w:lineRule="auto"/>
+        <w:rPr>
+          <w:rFonts w:ascii="Cascadia Mono" w:hAnsi="Cascadia Mono" w:cs="Cascadia Mono"/>
+          <w:color w:val="000000"/>
+          <w:kern w:val="0"/>
+          <w:sz w:val="19"/>
+          <w:szCs w:val="19"/>
+          <w:highlight w:val="white"/>
+        </w:rPr>
+      </w:pPr>
+    </w:p>
+    <w:p>
+      <w:pPr>
+        <w:autoSpaceDE w:val="0"/>
+        <w:autoSpaceDN w:val="0"/>
+        <w:adjustRightInd w:val="0"/>
+        <w:spacing w:after="0" w:line="240" w:lineRule="auto"/>
+        <w:rPr>
+          <w:rFonts w:ascii="Cascadia Mono" w:hAnsi="Cascadia Mono" w:cs="Cascadia Mono"/>
+          <w:color w:val="000000"/>
+          <w:kern w:val="0"/>
+          <w:sz w:val="19"/>
+          <w:szCs w:val="19"/>
+          <w:highlight w:val="white"/>
+        </w:rPr>
+      </w:pPr>
+      <w:r>
+        <w:rPr>
+          <w:rFonts w:ascii="Cascadia Mono" w:hAnsi="Cascadia Mono" w:cs="Cascadia Mono"/>
+          <w:color w:val="000000"/>
+          <w:kern w:val="0"/>
+          <w:sz w:val="19"/>
+          <w:szCs w:val="19"/>
+          <w:highlight w:val="white"/>
+        </w:rPr>
+        <w:t>(0 rows affected)</w:t>
+      </w:r>
+    </w:p>
+    <w:p>
+      <w:pPr>
+        <w:autoSpaceDE w:val="0"/>
+        <w:autoSpaceDN w:val="0"/>
+        <w:adjustRightInd w:val="0"/>
+        <w:spacing w:after="0" w:line="240" w:lineRule="auto"/>
+        <w:rPr>
+          <w:rFonts w:ascii="Cascadia Mono" w:hAnsi="Cascadia Mono" w:cs="Cascadia Mono"/>
+          <w:color w:val="000000"/>
+          <w:kern w:val="0"/>
+          <w:sz w:val="19"/>
+          <w:szCs w:val="19"/>
+          <w:highlight w:val="white"/>
+        </w:rPr>
+      </w:pPr>
+      <w:r>
+        <w:rPr>
+          <w:rFonts w:ascii="Cascadia Mono" w:hAnsi="Cascadia Mono" w:cs="Cascadia Mono"/>
+          <w:color w:val="000000"/>
+          <w:kern w:val="0"/>
+          <w:sz w:val="19"/>
+          <w:szCs w:val="19"/>
+          <w:highlight w:val="white"/>
+        </w:rPr>
+        <w:t>Data Standardization &amp; Consistency</w:t>
+      </w:r>
+    </w:p>
+    <w:p>
+      <w:pPr>
+        <w:autoSpaceDE w:val="0"/>
+        <w:autoSpaceDN w:val="0"/>
+        <w:adjustRightInd w:val="0"/>
+        <w:spacing w:after="0" w:line="240" w:lineRule="auto"/>
+        <w:rPr>
+          <w:rFonts w:ascii="Cascadia Mono" w:hAnsi="Cascadia Mono" w:cs="Cascadia Mono"/>
+          <w:color w:val="000000"/>
+          <w:kern w:val="0"/>
+          <w:sz w:val="19"/>
+          <w:szCs w:val="19"/>
+          <w:highlight w:val="white"/>
+        </w:rPr>
+      </w:pPr>
+    </w:p>
+    <w:p>
+      <w:pPr>
+        <w:autoSpaceDE w:val="0"/>
+        <w:autoSpaceDN w:val="0"/>
+        <w:adjustRightInd w:val="0"/>
+        <w:spacing w:after="0" w:line="240" w:lineRule="auto"/>
+        <w:rPr>
+          <w:rFonts w:ascii="Cascadia Mono" w:hAnsi="Cascadia Mono" w:cs="Cascadia Mono"/>
+          <w:color w:val="000000"/>
+          <w:kern w:val="0"/>
+          <w:sz w:val="19"/>
+          <w:szCs w:val="19"/>
+          <w:highlight w:val="white"/>
+        </w:rPr>
+      </w:pPr>
+      <w:r>
+        <w:rPr>
+          <w:rFonts w:ascii="Cascadia Mono" w:hAnsi="Cascadia Mono" w:cs="Cascadia Mono"/>
+          <w:color w:val="000000"/>
+          <w:kern w:val="0"/>
+          <w:sz w:val="19"/>
+          <w:szCs w:val="19"/>
+          <w:highlight w:val="white"/>
+        </w:rPr>
+        <w:t>(2 rows affected)</w:t>
+      </w:r>
+    </w:p>
+    <w:p>
+      <w:pPr>
+        <w:autoSpaceDE w:val="0"/>
+        <w:autoSpaceDN w:val="0"/>
+        <w:adjustRightInd w:val="0"/>
+        <w:spacing w:after="0" w:line="240" w:lineRule="auto"/>
+        <w:rPr>
+          <w:rFonts w:ascii="Cascadia Mono" w:hAnsi="Cascadia Mono" w:cs="Cascadia Mono"/>
+          <w:color w:val="000000"/>
+          <w:kern w:val="0"/>
+          <w:sz w:val="19"/>
+          <w:szCs w:val="19"/>
+          <w:highlight w:val="white"/>
+        </w:rPr>
+      </w:pPr>
+    </w:p>
+    <w:p>
+      <w:pPr>
+        <w:autoSpaceDE w:val="0"/>
+        <w:autoSpaceDN w:val="0"/>
+        <w:adjustRightInd w:val="0"/>
+        <w:spacing w:after="0" w:line="240" w:lineRule="auto"/>
+        <w:rPr>
+          <w:rFonts w:ascii="Cascadia Mono" w:hAnsi="Cascadia Mono" w:cs="Cascadia Mono"/>
+          <w:color w:val="000000"/>
+          <w:kern w:val="0"/>
+          <w:sz w:val="19"/>
+          <w:szCs w:val="19"/>
+          <w:highlight w:val="white"/>
+        </w:rPr>
+      </w:pPr>
+      <w:r>
+        <w:rPr>
+          <w:rFonts w:ascii="Cascadia Mono" w:hAnsi="Cascadia Mono" w:cs="Cascadia Mono"/>
+          <w:color w:val="000000"/>
+          <w:kern w:val="0"/>
+          <w:sz w:val="19"/>
+          <w:szCs w:val="19"/>
+          <w:highlight w:val="white"/>
+        </w:rPr>
+        <w:t>Completion time: 2026-05-08T18:09:01.6736030+02:00</w:t>
+      </w:r>
+    </w:p>
+    <w:p>
+      <w:pPr>
+        <w:autoSpaceDE w:val="0"/>
+        <w:autoSpaceDN w:val="0"/>
+        <w:adjustRightInd w:val="0"/>
+        <w:spacing w:after="0" w:line="240" w:lineRule="auto"/>
+        <w:rPr>
+          <w:rFonts w:ascii="Cascadia Mono" w:hAnsi="Cascadia Mono" w:cs="Cascadia Mono"/>
+          <w:color w:val="000000"/>
+          <w:kern w:val="0"/>
+          <w:sz w:val="19"/>
+          <w:szCs w:val="19"/>
+          <w:highlight w:val="white"/>
+        </w:rPr>
+      </w:pPr>
+    </w:p>
+    <w:p>
+      <w:pPr>
+        <w:spacing w:line="360" w:lineRule="auto"/>
+        <w:jc w:val="both"/>
+        <w:rPr>
+          <w:rFonts w:ascii="Times New Roman" w:hAnsi="Times New Roman" w:cs="Times New Roman"/>
+          <w:b/>
+          <w:sz w:val="30"/>
+          <w:szCs w:val="30"/>
+          <w:lang w:val="en-GB"/>
+        </w:rPr>
+      </w:pPr>
+      <w:r>
+        <w:rPr>
+          <w:rFonts w:ascii="Times New Roman" w:hAnsi="Times New Roman" w:cs="Times New Roman"/>
+          <w:b/>
+          <w:sz w:val="30"/>
+          <w:szCs w:val="30"/>
+          <w:lang w:val="en-GB"/>
+        </w:rPr>
+        <w:lastRenderedPageBreak/>
+        <w:drawing>
+          <wp:inline distT="0" distB="0" distL="0" distR="0" wp14:anchorId="35B1DC39" wp14:editId="512794ED">
+            <wp:extent cx="5731510" cy="3430905"/>
+            <wp:effectExtent l="0" t="0" r="2540" b="0"/>
+            <wp:docPr id="5" name="Picture 5"/>
+            <wp:cNvGraphicFramePr>
+              <a:graphicFrameLocks xmlns:a="http://schemas.openxmlformats.org/drawingml/2006/main" noChangeAspect="1"/>
+            </wp:cNvGraphicFramePr>
+            <a:graphic xmlns:a="http://schemas.openxmlformats.org/drawingml/2006/main">
+              <a:graphicData uri="http://schemas.openxmlformats.org/drawingml/2006/picture">
+                <pic:pic xmlns:pic="http://schemas.openxmlformats.org/drawingml/2006/picture">
+                  <pic:nvPicPr>
+                    <pic:cNvPr id="1" name=""/>
+                    <pic:cNvPicPr/>
+                  </pic:nvPicPr>
+                  <pic:blipFill>
+                    <a:blip r:embed="rId14"/>
+                    <a:stretch>
+                      <a:fillRect/>
+                    </a:stretch>
+                  </pic:blipFill>
+                  <pic:spPr>
+                    <a:xfrm>
+                      <a:off x="0" y="0"/>
+                      <a:ext cx="5731510" cy="3430905"/>
+                    </a:xfrm>
+                    <a:prstGeom prst="rect">
+                      <a:avLst/>
+                    </a:prstGeom>
+                  </pic:spPr>
+                </pic:pic>
+              </a:graphicData>
+            </a:graphic>
+          </wp:inline>
+        </w:drawing>
+      </w:r>
+    </w:p>
+    <w:p>
+      <w:pPr>
+        <w:spacing w:line="360" w:lineRule="auto"/>
+        <w:jc w:val="both"/>
+        <w:rPr>
+          <w:rFonts w:ascii="Times New Roman" w:hAnsi="Times New Roman" w:cs="Times New Roman"/>
+          <w:b/>
+          <w:sz w:val="30"/>
+          <w:szCs w:val="30"/>
+          <w:lang w:val="en-GB"/>
+        </w:rPr>
+      </w:pPr>
+      <w:r>
+        <w:rPr>
+          <w:rFonts w:ascii="Times New Roman" w:hAnsi="Times New Roman" w:cs="Times New Roman"/>
+          <w:b/>
+          <w:sz w:val="30"/>
+          <w:szCs w:val="30"/>
+          <w:lang w:val="en-GB"/>
+        </w:rPr>
+        <w:drawing>
+          <wp:inline distT="0" distB="0" distL="0" distR="0" wp14:anchorId="1E024F22" wp14:editId="32D89836">
+            <wp:extent cx="5731510" cy="3034030"/>
+            <wp:effectExtent l="0" t="0" r="2540" b="0"/>
+            <wp:docPr id="6" name="Picture 6"/>
+            <wp:cNvGraphicFramePr>
+              <a:graphicFrameLocks xmlns:a="http://schemas.openxmlformats.org/drawingml/2006/main" noChangeAspect="1"/>
+            </wp:cNvGraphicFramePr>
+            <a:graphic xmlns:a="http://schemas.openxmlformats.org/drawingml/2006/main">
+              <a:graphicData uri="http://schemas.openxmlformats.org/drawingml/2006/picture">
+                <pic:pic xmlns:pic="http://schemas.openxmlformats.org/drawingml/2006/picture">
+                  <pic:nvPicPr>
+                    <pic:cNvPr id="1" name=""/>
+                    <pic:cNvPicPr/>
+                  </pic:nvPicPr>
+                  <pic:blipFill>
+                    <a:blip r:embed="rId15"/>
+                    <a:stretch>
+                      <a:fillRect/>
+                    </a:stretch>
+                  </pic:blipFill>
+                  <pic:spPr>
+                    <a:xfrm>
+                      <a:off x="0" y="0"/>
+                      <a:ext cx="5731510" cy="3034030"/>
+                    </a:xfrm>
+                    <a:prstGeom prst="rect">
+                      <a:avLst/>
+                    </a:prstGeom>
+                  </pic:spPr>
+                </pic:pic>
+              </a:graphicData>
+            </a:graphic>
+          </wp:inline>
+        </w:drawing>
+      </w:r>
+    </w:p>
+    <w:p>
+      <w:pPr>
+        <w:spacing w:line="360" w:lineRule="auto"/>
+        <w:jc w:val="both"/>
+        <w:rPr>
+          <w:rFonts w:ascii="Times New Roman" w:hAnsi="Times New Roman" w:cs="Times New Roman"/>
+          <w:b/>
+          <w:sz w:val="30"/>
+          <w:szCs w:val="30"/>
+          <w:lang w:val="en-GB"/>
+        </w:rPr>
+      </w:pPr>
+    </w:p>
+    <w:p>
+      <w:pPr>
+        <w:spacing w:line="360" w:lineRule="auto"/>
+        <w:jc w:val="both"/>
+        <w:rPr>
+          <w:rFonts w:ascii="Times New Roman" w:hAnsi="Times New Roman" w:cs="Times New Roman"/>
+          <w:b/>
+          <w:sz w:val="30"/>
+          <w:szCs w:val="30"/>
+          <w:lang w:val="en-GB"/>
+        </w:rPr>
+      </w:pPr>
+      <w:r>
+        <w:rPr>
+          <w:rFonts w:ascii="Times New Roman" w:hAnsi="Times New Roman" w:cs="Times New Roman"/>
+          <w:b/>
+          <w:sz w:val="30"/>
+          <w:szCs w:val="30"/>
+          <w:lang w:val="en-GB"/>
+        </w:rPr>
+        <w:t>Gold Layer</w:t>
+      </w:r>
+    </w:p>
+    <w:p>
+      <w:pPr>
+        <w:spacing w:line="360" w:lineRule="auto"/>
+        <w:jc w:val="both"/>
+        <w:rPr>
+          <w:rFonts w:ascii="Times New Roman" w:hAnsi="Times New Roman" w:cs="Times New Roman"/>
+          <w:b/>
+          <w:sz w:val="30"/>
+          <w:szCs w:val="30"/>
+          <w:lang w:val="en-GB"/>
+        </w:rPr>
+      </w:pPr>
+      <w:r>
+        <w:rPr>
+          <w:rFonts w:ascii="Times New Roman" w:hAnsi="Times New Roman" w:cs="Times New Roman"/>
+          <w:b/>
+          <w:sz w:val="30"/>
+          <w:szCs w:val="30"/>
+          <w:lang w:val="en-GB"/>
+        </w:rPr>
+        <w:t>Data Flow Diagram</w:t>
+      </w:r>
+    </w:p>
+    <w:p>
+      <w:pPr>
+        <w:spacing w:line="360" w:lineRule="auto"/>
+        <w:jc w:val="both"/>
+        <w:rPr>
+          <w:rFonts w:ascii="Times New Roman" w:hAnsi="Times New Roman" w:cs="Times New Roman"/>
+          <w:b/>
+          <w:sz w:val="30"/>
+          <w:szCs w:val="30"/>
+          <w:lang w:val="en-GB"/>
+        </w:rPr>
+      </w:pPr>
+      <w:bookmarkStart w:id="0" w:name="_GoBack"/>
+      <w:r>
+        <w:rPr>
+          <w:rFonts w:ascii="Times New Roman" w:hAnsi="Times New Roman" w:cs="Times New Roman"/>
+          <w:b/>
+          <w:noProof/>
+          <w:sz w:val="30"/>
+          <w:szCs w:val="30"/>
+          <w:lang w:eastAsia="en-ZW"/>
+        </w:rPr>
+        <w:lastRenderedPageBreak/>
+        <w:drawing>
+          <wp:inline distT="0" distB="0" distL="0" distR="0">
+            <wp:extent cx="5731510" cy="3002280"/>
+            <wp:effectExtent l="0" t="0" r="2540" b="7620"/>
+            <wp:docPr id="8" name="Picture 8"/>
+            <wp:cNvGraphicFramePr>
+              <a:graphicFrameLocks xmlns:a="http://schemas.openxmlformats.org/drawingml/2006/main" noChangeAspect="1"/>
+            </wp:cNvGraphicFramePr>
+            <a:graphic xmlns:a="http://schemas.openxmlformats.org/drawingml/2006/main">
+              <a:graphicData uri="http://schemas.openxmlformats.org/drawingml/2006/picture">
+                <pic:pic xmlns:pic="http://schemas.openxmlformats.org/drawingml/2006/picture">
+                  <pic:nvPicPr>
+                    <pic:cNvPr id="8" name="DataFlowDiagram.drawio.png"/>
+                    <pic:cNvPicPr/>
+                  </pic:nvPicPr>
+                  <pic:blipFill>
+                    <a:blip r:embed="rId16">
+                      <a:extLst>
+                        <a:ext uri="{28A0092B-C50C-407E-A947-70E740481C1C}">
+                          <a14:useLocalDpi xmlns:a14="http://schemas.microsoft.com/office/drawing/2010/main" val="0"/>
+                        </a:ext>
+                      </a:extLst>
+                    </a:blip>
+                    <a:stretch>
+                      <a:fillRect/>
+                    </a:stretch>
+                  </pic:blipFill>
+                  <pic:spPr>
+                    <a:xfrm>
+                      <a:off x="0" y="0"/>
+                      <a:ext cx="5731510" cy="3002280"/>
+                    </a:xfrm>
+                    <a:prstGeom prst="rect">
+                      <a:avLst/>
+                    </a:prstGeom>
+                  </pic:spPr>
+                </pic:pic>
+              </a:graphicData>
+            </a:graphic>
+          </wp:inline>
+        </w:drawing>
+      </w:r>
+      <w:bookmarkEnd w:id="0"/>
     </w:p>
     <w:sectPr>
       <w:pgSz w:w="11906" w:h="16838"/>
@@ -6830,6 +10926,119 @@
     </w:lvl>
   </w:abstractNum>
   <w:abstractNum w:abstractNumId="24" w15:restartNumberingAfterBreak="0">
+    <w:nsid w:val="498B2A21"/>
+    <w:multiLevelType w:val="hybridMultilevel"/>
+    <w:tmpl w:val="1BB8AF5E"/>
+    <w:lvl w:ilvl="0" w:tplc="30090001">
+      <w:start w:val="1"/>
+      <w:numFmt w:val="bullet"/>
+      <w:lvlText w:val=""/>
+      <w:lvlJc w:val="left"/>
+      <w:pPr>
+        <w:ind w:left="720" w:hanging="360"/>
+      </w:pPr>
+      <w:rPr>
+        <w:rFonts w:ascii="Symbol" w:hAnsi="Symbol" w:hint="default"/>
+      </w:rPr>
+    </w:lvl>
+    <w:lvl w:ilvl="1" w:tplc="30090003" w:tentative="1">
+      <w:start w:val="1"/>
+      <w:numFmt w:val="bullet"/>
+      <w:lvlText w:val="o"/>
+      <w:lvlJc w:val="left"/>
+      <w:pPr>
+        <w:ind w:left="1440" w:hanging="360"/>
+      </w:pPr>
+      <w:rPr>
+        <w:rFonts w:ascii="Courier New" w:hAnsi="Courier New" w:cs="Courier New" w:hint="default"/>
+      </w:rPr>
+    </w:lvl>
+    <w:lvl w:ilvl="2" w:tplc="30090005" w:tentative="1">
+      <w:start w:val="1"/>
+      <w:numFmt w:val="bullet"/>
+      <w:lvlText w:val=""/>
+      <w:lvlJc w:val="left"/>
+      <w:pPr>
+        <w:ind w:left="2160" w:hanging="360"/>
+      </w:pPr>
+      <w:rPr>
+        <w:rFonts w:ascii="Wingdings" w:hAnsi="Wingdings" w:hint="default"/>
+      </w:rPr>
+    </w:lvl>
+    <w:lvl w:ilvl="3" w:tplc="30090001" w:tentative="1">
+      <w:start w:val="1"/>
+      <w:numFmt w:val="bullet"/>
+      <w:lvlText w:val=""/>
+      <w:lvlJc w:val="left"/>
+      <w:pPr>
+        <w:ind w:left="2880" w:hanging="360"/>
+      </w:pPr>
+      <w:rPr>
+        <w:rFonts w:ascii="Symbol" w:hAnsi="Symbol" w:hint="default"/>
+      </w:rPr>
+    </w:lvl>
+    <w:lvl w:ilvl="4" w:tplc="30090003" w:tentative="1">
+      <w:start w:val="1"/>
+      <w:numFmt w:val="bullet"/>
+      <w:lvlText w:val="o"/>
+      <w:lvlJc w:val="left"/>
+      <w:pPr>
+        <w:ind w:left="3600" w:hanging="360"/>
+      </w:pPr>
+      <w:rPr>
+        <w:rFonts w:ascii="Courier New" w:hAnsi="Courier New" w:cs="Courier New" w:hint="default"/>
+      </w:rPr>
+    </w:lvl>
+    <w:lvl w:ilvl="5" w:tplc="30090005" w:tentative="1">
+      <w:start w:val="1"/>
+      <w:numFmt w:val="bullet"/>
+      <w:lvlText w:val=""/>
+      <w:lvlJc w:val="left"/>
+      <w:pPr>
+        <w:ind w:left="4320" w:hanging="360"/>
+      </w:pPr>
+      <w:rPr>
+        <w:rFonts w:ascii="Wingdings" w:hAnsi="Wingdings" w:hint="default"/>
+      </w:rPr>
+    </w:lvl>
+    <w:lvl w:ilvl="6" w:tplc="30090001" w:tentative="1">
+      <w:start w:val="1"/>
+      <w:numFmt w:val="bullet"/>
+      <w:lvlText w:val=""/>
+      <w:lvlJc w:val="left"/>
+      <w:pPr>
+        <w:ind w:left="5040" w:hanging="360"/>
+      </w:pPr>
+      <w:rPr>
+        <w:rFonts w:ascii="Symbol" w:hAnsi="Symbol" w:hint="default"/>
+      </w:rPr>
+    </w:lvl>
+    <w:lvl w:ilvl="7" w:tplc="30090003" w:tentative="1">
+      <w:start w:val="1"/>
+      <w:numFmt w:val="bullet"/>
+      <w:lvlText w:val="o"/>
+      <w:lvlJc w:val="left"/>
+      <w:pPr>
+        <w:ind w:left="5760" w:hanging="360"/>
+      </w:pPr>
+      <w:rPr>
+        <w:rFonts w:ascii="Courier New" w:hAnsi="Courier New" w:cs="Courier New" w:hint="default"/>
+      </w:rPr>
+    </w:lvl>
+    <w:lvl w:ilvl="8" w:tplc="30090005" w:tentative="1">
+      <w:start w:val="1"/>
+      <w:numFmt w:val="bullet"/>
+      <w:lvlText w:val=""/>
+      <w:lvlJc w:val="left"/>
+      <w:pPr>
+        <w:ind w:left="6480" w:hanging="360"/>
+      </w:pPr>
+      <w:rPr>
+        <w:rFonts w:ascii="Wingdings" w:hAnsi="Wingdings" w:hint="default"/>
+      </w:rPr>
+    </w:lvl>
+  </w:abstractNum>
+  <w:abstractNum w:abstractNumId="25" w15:restartNumberingAfterBreak="0">
     <w:nsid w:val="4A9B5C5F"/>
     <w:multiLevelType w:val="multilevel"/>
     <w:tmpl w:val="E7987916"/>
@@ -6978,7 +11187,7 @@
       </w:rPr>
     </w:lvl>
   </w:abstractNum>
-  <w:abstractNum w:abstractNumId="25" w15:restartNumberingAfterBreak="0">
+  <w:abstractNum w:abstractNumId="26" w15:restartNumberingAfterBreak="0">
     <w:nsid w:val="4CC01545"/>
     <w:multiLevelType w:val="hybridMultilevel"/>
     <w:tmpl w:val="675A7EB6"/>
@@ -7064,7 +11273,7 @@
       </w:pPr>
     </w:lvl>
   </w:abstractNum>
-  <w:abstractNum w:abstractNumId="26" w15:restartNumberingAfterBreak="0">
+  <w:abstractNum w:abstractNumId="27" w15:restartNumberingAfterBreak="0">
     <w:nsid w:val="52E56B9A"/>
     <w:multiLevelType w:val="hybridMultilevel"/>
     <w:tmpl w:val="DA22D8E2"/>
@@ -7153,7 +11362,7 @@
       </w:pPr>
     </w:lvl>
   </w:abstractNum>
-  <w:abstractNum w:abstractNumId="27" w15:restartNumberingAfterBreak="0">
+  <w:abstractNum w:abstractNumId="28" w15:restartNumberingAfterBreak="0">
     <w:nsid w:val="5A913F5E"/>
     <w:multiLevelType w:val="hybridMultilevel"/>
     <w:tmpl w:val="8D128322"/>
@@ -7266,7 +11475,7 @@
       </w:rPr>
     </w:lvl>
   </w:abstractNum>
-  <w:abstractNum w:abstractNumId="28" w15:restartNumberingAfterBreak="0">
+  <w:abstractNum w:abstractNumId="29" w15:restartNumberingAfterBreak="0">
     <w:nsid w:val="5CD94212"/>
     <w:multiLevelType w:val="hybridMultilevel"/>
     <w:tmpl w:val="D01C78FA"/>
@@ -7355,7 +11564,7 @@
       </w:pPr>
     </w:lvl>
   </w:abstractNum>
-  <w:abstractNum w:abstractNumId="29" w15:restartNumberingAfterBreak="0">
+  <w:abstractNum w:abstractNumId="30" w15:restartNumberingAfterBreak="0">
     <w:nsid w:val="68695C84"/>
     <w:multiLevelType w:val="hybridMultilevel"/>
     <w:tmpl w:val="07964A0A"/>
@@ -7468,7 +11677,7 @@
       </w:rPr>
     </w:lvl>
   </w:abstractNum>
-  <w:abstractNum w:abstractNumId="30" w15:restartNumberingAfterBreak="0">
+  <w:abstractNum w:abstractNumId="31" w15:restartNumberingAfterBreak="0">
     <w:nsid w:val="6944352C"/>
     <w:multiLevelType w:val="multilevel"/>
     <w:tmpl w:val="3436425E"/>
@@ -7581,7 +11790,7 @@
       </w:pPr>
     </w:lvl>
   </w:abstractNum>
-  <w:abstractNum w:abstractNumId="31" w15:restartNumberingAfterBreak="0">
+  <w:abstractNum w:abstractNumId="32" w15:restartNumberingAfterBreak="0">
     <w:nsid w:val="6B130F3E"/>
     <w:multiLevelType w:val="multilevel"/>
     <w:tmpl w:val="F12E30D8"/>
@@ -7730,7 +11939,7 @@
       </w:rPr>
     </w:lvl>
   </w:abstractNum>
-  <w:abstractNum w:abstractNumId="32" w15:restartNumberingAfterBreak="0">
+  <w:abstractNum w:abstractNumId="33" w15:restartNumberingAfterBreak="0">
     <w:nsid w:val="6BBC5163"/>
     <w:multiLevelType w:val="hybridMultilevel"/>
     <w:tmpl w:val="019ABCA8"/>
@@ -7843,7 +12052,7 @@
       </w:rPr>
     </w:lvl>
   </w:abstractNum>
-  <w:abstractNum w:abstractNumId="33" w15:restartNumberingAfterBreak="0">
+  <w:abstractNum w:abstractNumId="34" w15:restartNumberingAfterBreak="0">
     <w:nsid w:val="6CF124F7"/>
     <w:multiLevelType w:val="hybridMultilevel"/>
     <w:tmpl w:val="BE1CB8C0"/>
@@ -7956,7 +12165,7 @@
       </w:rPr>
     </w:lvl>
   </w:abstractNum>
-  <w:abstractNum w:abstractNumId="34" w15:restartNumberingAfterBreak="0">
+  <w:abstractNum w:abstractNumId="35" w15:restartNumberingAfterBreak="0">
     <w:nsid w:val="6DBB5C5B"/>
     <w:multiLevelType w:val="hybridMultilevel"/>
     <w:tmpl w:val="EBFA55B0"/>
@@ -8045,7 +12254,7 @@
       </w:pPr>
     </w:lvl>
   </w:abstractNum>
-  <w:abstractNum w:abstractNumId="35" w15:restartNumberingAfterBreak="0">
+  <w:abstractNum w:abstractNumId="36" w15:restartNumberingAfterBreak="0">
     <w:nsid w:val="7156319E"/>
     <w:multiLevelType w:val="hybridMultilevel"/>
     <w:tmpl w:val="6AFA6CC6"/>
@@ -8158,7 +12367,7 @@
       </w:rPr>
     </w:lvl>
   </w:abstractNum>
-  <w:abstractNum w:abstractNumId="36" w15:restartNumberingAfterBreak="0">
+  <w:abstractNum w:abstractNumId="37" w15:restartNumberingAfterBreak="0">
     <w:nsid w:val="71EE0956"/>
     <w:multiLevelType w:val="multilevel"/>
     <w:tmpl w:val="D5C2EBBE"/>
@@ -8307,7 +12516,7 @@
       </w:rPr>
     </w:lvl>
   </w:abstractNum>
-  <w:abstractNum w:abstractNumId="37" w15:restartNumberingAfterBreak="0">
+  <w:abstractNum w:abstractNumId="38" w15:restartNumberingAfterBreak="0">
     <w:nsid w:val="77972A13"/>
     <w:multiLevelType w:val="multilevel"/>
     <w:tmpl w:val="C47673BA"/>
@@ -8456,7 +12665,7 @@
       </w:rPr>
     </w:lvl>
   </w:abstractNum>
-  <w:abstractNum w:abstractNumId="38" w15:restartNumberingAfterBreak="0">
+  <w:abstractNum w:abstractNumId="39" w15:restartNumberingAfterBreak="0">
     <w:nsid w:val="7E402D84"/>
     <w:multiLevelType w:val="hybridMultilevel"/>
     <w:tmpl w:val="DE62EEB8"/>
@@ -8573,19 +12782,19 @@
     <w:abstractNumId w:val="5"/>
   </w:num>
   <w:num w:numId="2">
-    <w:abstractNumId w:val="34"/>
+    <w:abstractNumId w:val="35"/>
   </w:num>
   <w:num w:numId="3">
     <w:abstractNumId w:val="7"/>
   </w:num>
   <w:num w:numId="4">
-    <w:abstractNumId w:val="25"/>
+    <w:abstractNumId w:val="26"/>
   </w:num>
   <w:num w:numId="5">
     <w:abstractNumId w:val="21"/>
   </w:num>
   <w:num w:numId="6">
-    <w:abstractNumId w:val="26"/>
+    <w:abstractNumId w:val="27"/>
   </w:num>
   <w:num w:numId="7">
     <w:abstractNumId w:val="20"/>
@@ -8600,13 +12809,13 @@
     <w:abstractNumId w:val="8"/>
   </w:num>
   <w:num w:numId="11">
-    <w:abstractNumId w:val="24"/>
+    <w:abstractNumId w:val="25"/>
   </w:num>
   <w:num w:numId="12">
     <w:abstractNumId w:val="2"/>
   </w:num>
   <w:num w:numId="13">
-    <w:abstractNumId w:val="37"/>
+    <w:abstractNumId w:val="38"/>
   </w:num>
   <w:num w:numId="14">
     <w:abstractNumId w:val="16"/>
@@ -8630,28 +12839,28 @@
     <w:abstractNumId w:val="0"/>
   </w:num>
   <w:num w:numId="21">
-    <w:abstractNumId w:val="36"/>
+    <w:abstractNumId w:val="37"/>
   </w:num>
   <w:num w:numId="22">
     <w:abstractNumId w:val="6"/>
   </w:num>
   <w:num w:numId="23">
-    <w:abstractNumId w:val="31"/>
+    <w:abstractNumId w:val="32"/>
   </w:num>
   <w:num w:numId="24">
     <w:abstractNumId w:val="3"/>
   </w:num>
   <w:num w:numId="25">
-    <w:abstractNumId w:val="30"/>
+    <w:abstractNumId w:val="31"/>
   </w:num>
   <w:num w:numId="26">
     <w:abstractNumId w:val="14"/>
   </w:num>
   <w:num w:numId="27">
-    <w:abstractNumId w:val="28"/>
+    <w:abstractNumId w:val="29"/>
   </w:num>
   <w:num w:numId="28">
-    <w:abstractNumId w:val="27"/>
+    <w:abstractNumId w:val="28"/>
   </w:num>
   <w:num w:numId="29">
     <w:abstractNumId w:val="1"/>
@@ -8660,22 +12869,22 @@
     <w:abstractNumId w:val="15"/>
   </w:num>
   <w:num w:numId="31">
-    <w:abstractNumId w:val="32"/>
+    <w:abstractNumId w:val="33"/>
   </w:num>
   <w:num w:numId="32">
-    <w:abstractNumId w:val="29"/>
+    <w:abstractNumId w:val="30"/>
   </w:num>
   <w:num w:numId="33">
-    <w:abstractNumId w:val="35"/>
+    <w:abstractNumId w:val="36"/>
   </w:num>
   <w:num w:numId="34">
     <w:abstractNumId w:val="22"/>
   </w:num>
   <w:num w:numId="35">
-    <w:abstractNumId w:val="33"/>
+    <w:abstractNumId w:val="34"/>
   </w:num>
   <w:num w:numId="36">
-    <w:abstractNumId w:val="38"/>
+    <w:abstractNumId w:val="39"/>
   </w:num>
   <w:num w:numId="37">
     <w:abstractNumId w:val="19"/>
@@ -8685,6 +12894,9 @@
   </w:num>
   <w:num w:numId="39">
     <w:abstractNumId w:val="17"/>
+  </w:num>
+  <w:num w:numId="40">
+    <w:abstractNumId w:val="24"/>
   </w:num>
 </w:numbering>
 </file>
@@ -9647,7 +13859,7 @@
 </file>
 
 <file path=customXml/itemProps1.xml><?xml version="1.0" encoding="utf-8"?>
-<ds:datastoreItem xmlns:ds="http://schemas.openxmlformats.org/officeDocument/2006/customXml" ds:itemID="{2C6A7D22-AAB2-4458-BFA0-BC7FC475A954}">
+<ds:datastoreItem xmlns:ds="http://schemas.openxmlformats.org/officeDocument/2006/customXml" ds:itemID="{4BA2F108-77D2-4C70-B29E-F0E9C05F6087}">
   <ds:schemaRefs>
     <ds:schemaRef ds:uri="http://schemas.openxmlformats.org/officeDocument/2006/bibliography"/>
   </ds:schemaRefs>

</xml_diff>